<commit_message>
nmv 14 10 2026
</commit_message>
<xml_diff>
--- a/TS Jatai Ghanam Project/TS 4.4/TS 4.4 Jatai Tamil Corrections.docx
+++ b/TS Jatai Ghanam Project/TS 4.4/TS 4.4 Jatai Tamil Corrections.docx
@@ -1,7 +1,4486 @@
 
 <file path=word/document.xml><?xml version="1.0" encoding="utf-8"?>
-<w:document xmlns:wpc="http://schemas.microsoft.com/office/word/2010/wordprocessingCanvas" xmlns:cx="http://schemas.microsoft.com/office/drawing/2014/chartex" xmlns:cx1="http://schemas.microsoft.com/office/drawing/2015/9/8/chartex" xmlns:cx2="http://schemas.microsoft.com/office/drawing/2015/10/21/chartex" xmlns:cx3="http://schemas.microsoft.com/office/drawing/2016/5/9/chartex" xmlns:cx4="http://schemas.microsoft.com/office/drawing/2016/5/10/chartex" xmlns:cx5="http://schemas.microsoft.com/office/drawing/2016/5/11/chartex" xmlns:cx6="http://schemas.microsoft.com/office/drawing/2016/5/12/chartex" xmlns:cx7="http://schemas.microsoft.com/office/drawing/2016/5/13/chartex" xmlns:cx8="http://schemas.microsoft.com/office/drawing/2016/5/14/chartex" xmlns:mc="http://schemas.openxmlformats.org/markup-compatibility/2006" xmlns:aink="http://schemas.microsoft.com/office/drawing/2016/ink" xmlns:am3d="http://schemas.microsoft.com/office/drawing/2017/model3d" xmlns:o="urn:schemas-microsoft-com:office:office" xmlns:oel="http://schemas.microsoft.com/office/2019/extlst" xmlns:r="http://schemas.openxmlformats.org/officeDocument/2006/relationships" xmlns:m="http://schemas.openxmlformats.org/officeDocument/2006/math" xmlns:v="urn:schemas-microsoft-com:vml" xmlns:wp14="http://schemas.microsoft.com/office/word/2010/wordprocessingDrawing" xmlns:wp="http://schemas.openxmlformats.org/drawingml/2006/wordprocessingDrawing" xmlns:w10="urn:schemas-microsoft-com:office:word" xmlns:w="http://schemas.openxmlformats.org/wordprocessingml/2006/main" xmlns:w14="http://schemas.microsoft.com/office/word/2010/wordml" xmlns:w15="http://schemas.microsoft.com/office/word/2012/wordml" xmlns:w16cex="http://schemas.microsoft.com/office/word/2018/wordml/cex" xmlns:w16cid="http://schemas.microsoft.com/office/word/2016/wordml/cid" xmlns:w16="http://schemas.microsoft.com/office/word/2018/wordml" xmlns:w16du="http://schemas.microsoft.com/office/word/2023/wordml/word16du" xmlns:w16sdtdh="http://schemas.microsoft.com/office/word/2020/wordml/sdtdatahash" xmlns:w16se="http://schemas.microsoft.com/office/word/2015/wordml/symex" xmlns:wpg="http://schemas.microsoft.com/office/word/2010/wordprocessingGroup" xmlns:wpi="http://schemas.microsoft.com/office/word/2010/wordprocessingInk" xmlns:wne="http://schemas.microsoft.com/office/word/2006/wordml" xmlns:wps="http://schemas.microsoft.com/office/word/2010/wordprocessingShape" mc:Ignorable="w14 w15 w16se w16cid w16 w16cex w16sdtdh w16du wp14">
+<w:document xmlns:wpc="http://schemas.microsoft.com/office/word/2010/wordprocessingCanvas" xmlns:cx="http://schemas.microsoft.com/office/drawing/2014/chartex" xmlns:cx1="http://schemas.microsoft.com/office/drawing/2015/9/8/chartex" xmlns:cx2="http://schemas.microsoft.com/office/drawing/2015/10/21/chartex" xmlns:cx3="http://schemas.microsoft.com/office/drawing/2016/5/9/chartex" xmlns:cx4="http://schemas.microsoft.com/office/drawing/2016/5/10/chartex" xmlns:cx5="http://schemas.microsoft.com/office/drawing/2016/5/11/chartex" xmlns:cx6="http://schemas.microsoft.com/office/drawing/2016/5/12/chartex" xmlns:cx7="http://schemas.microsoft.com/office/drawing/2016/5/13/chartex" xmlns:cx8="http://schemas.microsoft.com/office/drawing/2016/5/14/chartex" xmlns:mc="http://schemas.openxmlformats.org/markup-compatibility/2006" xmlns:aink="http://schemas.microsoft.com/office/drawing/2016/ink" xmlns:am3d="http://schemas.microsoft.com/office/drawing/2017/model3d" xmlns:o="urn:schemas-microsoft-com:office:office" xmlns:oel="http://schemas.microsoft.com/office/2019/extlst" xmlns:r="http://schemas.openxmlformats.org/officeDocument/2006/relationships" xmlns:m="http://schemas.openxmlformats.org/officeDocument/2006/math" xmlns:v="urn:schemas-microsoft-com:vml" xmlns:wp14="http://schemas.microsoft.com/office/word/2010/wordprocessingDrawing" xmlns:wp="http://schemas.openxmlformats.org/drawingml/2006/wordprocessingDrawing" xmlns:w10="urn:schemas-microsoft-com:office:word" xmlns:w="http://schemas.openxmlformats.org/wordprocessingml/2006/main" xmlns:w14="http://schemas.microsoft.com/office/word/2010/wordml" xmlns:w15="http://schemas.microsoft.com/office/word/2012/wordml" xmlns:w16cex="http://schemas.microsoft.com/office/word/2018/wordml/cex" xmlns:w16cid="http://schemas.microsoft.com/office/word/2016/wordml/cid" xmlns:w16="http://schemas.microsoft.com/office/word/2018/wordml" xmlns:w16du="http://schemas.microsoft.com/office/word/2023/wordml/word16du" xmlns:w16sdtdh="http://schemas.microsoft.com/office/word/2020/wordml/sdtdatahash" xmlns:w16sdtfl="http://schemas.microsoft.com/office/word/2024/wordml/sdtformatlock" xmlns:w16se="http://schemas.microsoft.com/office/word/2015/wordml/symex" xmlns:wpg="http://schemas.microsoft.com/office/word/2010/wordprocessingGroup" xmlns:wpi="http://schemas.microsoft.com/office/word/2010/wordprocessingInk" xmlns:wne="http://schemas.microsoft.com/office/word/2006/wordml" xmlns:wps="http://schemas.microsoft.com/office/word/2010/wordprocessingShape" mc:Ignorable="w14 w15 w16se w16cid w16 w16cex w16sdtdh w16sdtfl w16du wp14">
   <w:body>
+    <w:p>
+      <w:pPr>
+        <w:spacing w:before="0" w:line="240" w:lineRule="auto"/>
+        <w:jc w:val="center"/>
+        <w:rPr>
+          <w:b/>
+          <w:bCs/>
+          <w:sz w:val="32"/>
+          <w:szCs w:val="32"/>
+          <w:u w:val="single"/>
+        </w:rPr>
+      </w:pPr>
+      <w:r>
+        <w:rPr>
+          <w:b/>
+          <w:bCs/>
+          <w:sz w:val="32"/>
+          <w:szCs w:val="32"/>
+          <w:u w:val="single"/>
+        </w:rPr>
+        <w:t xml:space="preserve">TS </w:t>
+      </w:r>
+      <w:r>
+        <w:rPr>
+          <w:b/>
+          <w:bCs/>
+          <w:sz w:val="32"/>
+          <w:szCs w:val="32"/>
+          <w:u w:val="single"/>
+        </w:rPr>
+        <w:t xml:space="preserve">Jatai </w:t>
+      </w:r>
+      <w:r>
+        <w:rPr>
+          <w:b/>
+          <w:bCs/>
+          <w:sz w:val="32"/>
+          <w:szCs w:val="32"/>
+          <w:u w:val="single"/>
+        </w:rPr>
+        <w:t xml:space="preserve"> </w:t>
+      </w:r>
+      <w:r>
+        <w:rPr>
+          <w:b/>
+          <w:bCs/>
+          <w:sz w:val="32"/>
+          <w:szCs w:val="32"/>
+          <w:u w:val="single"/>
+        </w:rPr>
+        <w:t xml:space="preserve">– TS </w:t>
+      </w:r>
+      <w:r>
+        <w:rPr>
+          <w:b/>
+          <w:bCs/>
+          <w:sz w:val="32"/>
+          <w:szCs w:val="32"/>
+          <w:u w:val="single"/>
+        </w:rPr>
+        <w:t>4.4</w:t>
+      </w:r>
+      <w:r>
+        <w:rPr>
+          <w:b/>
+          <w:bCs/>
+          <w:sz w:val="32"/>
+          <w:szCs w:val="32"/>
+          <w:u w:val="single"/>
+        </w:rPr>
+        <w:t xml:space="preserve"> </w:t>
+      </w:r>
+      <w:r>
+        <w:rPr>
+          <w:b/>
+          <w:bCs/>
+          <w:sz w:val="32"/>
+          <w:szCs w:val="32"/>
+          <w:u w:val="single"/>
+        </w:rPr>
+        <w:t>Sanskrit</w:t>
+      </w:r>
+      <w:r>
+        <w:rPr>
+          <w:b/>
+          <w:bCs/>
+          <w:sz w:val="32"/>
+          <w:szCs w:val="32"/>
+          <w:u w:val="single"/>
+        </w:rPr>
+        <w:t xml:space="preserve"> Corrections –</w:t>
+      </w:r>
+      <w:r>
+        <w:rPr>
+          <w:b/>
+          <w:bCs/>
+          <w:sz w:val="32"/>
+          <w:szCs w:val="32"/>
+          <w:u w:val="single"/>
+        </w:rPr>
+        <w:t xml:space="preserve"> </w:t>
+      </w:r>
+      <w:r>
+        <w:rPr>
+          <w:b/>
+          <w:bCs/>
+          <w:sz w:val="32"/>
+          <w:szCs w:val="32"/>
+          <w:u w:val="single"/>
+        </w:rPr>
+        <w:t xml:space="preserve">Observed till </w:t>
+      </w:r>
+      <w:r>
+        <w:rPr>
+          <w:b/>
+          <w:bCs/>
+          <w:sz w:val="32"/>
+          <w:szCs w:val="32"/>
+          <w:u w:val="single"/>
+        </w:rPr>
+        <w:t>31st Oct 2026</w:t>
+      </w:r>
+    </w:p>
+    <w:p>
+      <w:pPr>
+        <w:spacing w:before="0" w:line="240" w:lineRule="auto"/>
+        <w:jc w:val="center"/>
+        <w:rPr>
+          <w:b/>
+          <w:bCs/>
+          <w:sz w:val="28"/>
+          <w:szCs w:val="32"/>
+        </w:rPr>
+      </w:pPr>
+      <w:r>
+        <w:rPr>
+          <w:b/>
+          <w:bCs/>
+          <w:sz w:val="28"/>
+          <w:szCs w:val="32"/>
+        </w:rPr>
+        <w:t>(ignore those which are already incorporated in your book’s version and date)</w:t>
+      </w:r>
+    </w:p>
+    <w:tbl>
+      <w:tblPr>
+        <w:tblW w:w="14537" w:type="dxa"/>
+        <w:tblInd w:w="-792" w:type="dxa"/>
+        <w:tblBorders>
+          <w:top w:val="single" w:sz="4" w:space="0" w:color="000000"/>
+          <w:left w:val="single" w:sz="4" w:space="0" w:color="000000"/>
+          <w:bottom w:val="single" w:sz="4" w:space="0" w:color="000000"/>
+          <w:right w:val="single" w:sz="4" w:space="0" w:color="000000"/>
+          <w:insideH w:val="single" w:sz="4" w:space="0" w:color="000000"/>
+          <w:insideV w:val="single" w:sz="4" w:space="0" w:color="000000"/>
+        </w:tblBorders>
+        <w:tblLook w:val="04A0" w:firstRow="1" w:lastRow="0" w:firstColumn="1" w:lastColumn="0" w:noHBand="0" w:noVBand="1"/>
+      </w:tblPr>
+      <w:tblGrid>
+        <w:gridCol w:w="7166"/>
+        <w:gridCol w:w="7371"/>
+      </w:tblGrid>
+      <w:tr>
+        <w:tc>
+          <w:tcPr>
+            <w:tcW w:w="7166" w:type="dxa"/>
+          </w:tcPr>
+          <w:p>
+            <w:pPr>
+              <w:spacing w:before="0" w:line="240" w:lineRule="auto"/>
+              <w:jc w:val="center"/>
+              <w:rPr>
+                <w:b/>
+                <w:sz w:val="32"/>
+                <w:szCs w:val="32"/>
+              </w:rPr>
+            </w:pPr>
+            <w:r>
+              <w:rPr>
+                <w:b/>
+                <w:sz w:val="32"/>
+                <w:szCs w:val="32"/>
+              </w:rPr>
+              <w:t>As Printed</w:t>
+            </w:r>
+          </w:p>
+        </w:tc>
+        <w:tc>
+          <w:tcPr>
+            <w:tcW w:w="7371" w:type="dxa"/>
+          </w:tcPr>
+          <w:p>
+            <w:pPr>
+              <w:spacing w:before="0" w:line="240" w:lineRule="auto"/>
+              <w:ind w:right="-18"/>
+              <w:jc w:val="center"/>
+              <w:rPr>
+                <w:b/>
+                <w:sz w:val="32"/>
+                <w:szCs w:val="32"/>
+              </w:rPr>
+            </w:pPr>
+            <w:r>
+              <w:rPr>
+                <w:b/>
+                <w:sz w:val="32"/>
+                <w:szCs w:val="32"/>
+              </w:rPr>
+              <w:t>To be read as or corrected as</w:t>
+            </w:r>
+            <w:r>
+              <w:rPr>
+                <w:b/>
+                <w:sz w:val="32"/>
+                <w:szCs w:val="32"/>
+              </w:rPr>
+              <w:t xml:space="preserve"> </w:t>
+            </w:r>
+          </w:p>
+        </w:tc>
+      </w:tr>
+      <w:tr>
+        <w:trPr>
+          <w:trHeight w:val="1182"/>
+        </w:trPr>
+        <w:tc>
+          <w:tcPr>
+            <w:tcW w:w="7166" w:type="dxa"/>
+            <w:tcBorders>
+              <w:top w:val="single" w:sz="4" w:space="0" w:color="000000"/>
+              <w:left w:val="single" w:sz="4" w:space="0" w:color="000000"/>
+              <w:bottom w:val="single" w:sz="4" w:space="0" w:color="000000"/>
+              <w:right w:val="single" w:sz="4" w:space="0" w:color="000000"/>
+            </w:tcBorders>
+          </w:tcPr>
+          <w:p>
+            <w:pPr>
+              <w:widowControl w:val="0"/>
+              <w:autoSpaceDE w:val="0"/>
+              <w:autoSpaceDN w:val="0"/>
+              <w:adjustRightInd w:val="0"/>
+              <w:spacing w:before="0" w:line="240" w:lineRule="auto"/>
+              <w:rPr>
+                <w:rFonts w:ascii="BRH Devanagari Extra" w:hAnsi="BRH Devanagari Extra" w:cs="BRH Devanagari Extra"/>
+                <w:color w:val="000000"/>
+                <w:sz w:val="32"/>
+                <w:szCs w:val="32"/>
+              </w:rPr>
+            </w:pPr>
+            <w:r>
+              <w:rPr>
+                <w:rFonts w:ascii="BRH Devanagari Extra" w:hAnsi="BRH Devanagari Extra" w:cs="BRH Devanagari Extra"/>
+                <w:color w:val="000000"/>
+                <w:sz w:val="32"/>
+                <w:szCs w:val="32"/>
+              </w:rPr>
+              <w:t>(</w:t>
+            </w:r>
+            <w:r>
+              <w:rPr>
+                <w:rFonts w:cs="BRH Devanagari Extra"/>
+                <w:color w:val="000000"/>
+                <w:szCs w:val="32"/>
+              </w:rPr>
+              <w:t>16</w:t>
+            </w:r>
+            <w:r>
+              <w:rPr>
+                <w:rFonts w:ascii="BRH Devanagari Extra" w:hAnsi="BRH Devanagari Extra" w:cs="BRH Devanagari Extra"/>
+                <w:color w:val="000000"/>
+                <w:sz w:val="32"/>
+                <w:szCs w:val="32"/>
+              </w:rPr>
+              <w:t>)</w:t>
+            </w:r>
+            <w:r>
+              <w:rPr>
+                <w:rFonts w:cs="BRH Devanagari Extra"/>
+                <w:color w:val="000000"/>
+                <w:szCs w:val="32"/>
+              </w:rPr>
+              <w:t>[P6</w:t>
+            </w:r>
+            <w:r>
+              <w:rPr>
+                <w:rFonts w:ascii="BRH Devanagari Extra" w:hAnsi="BRH Devanagari Extra" w:cs="BRH Devanagari Extra"/>
+                <w:color w:val="000000"/>
+                <w:sz w:val="32"/>
+                <w:szCs w:val="32"/>
+              </w:rPr>
+              <w:t xml:space="preserve">] </w:t>
+            </w:r>
+            <w:r>
+              <w:rPr>
+                <w:rFonts w:cs="BRH Devanagari Extra"/>
+                <w:color w:val="000000"/>
+                <w:szCs w:val="32"/>
+              </w:rPr>
+              <w:t>4</w:t>
+            </w:r>
+            <w:r>
+              <w:rPr>
+                <w:rFonts w:ascii="BRH Devanagari Extra" w:hAnsi="BRH Devanagari Extra" w:cs="BRH Devanagari Extra"/>
+                <w:color w:val="000000"/>
+                <w:sz w:val="32"/>
+                <w:szCs w:val="32"/>
+              </w:rPr>
+              <w:t>.</w:t>
+            </w:r>
+            <w:r>
+              <w:rPr>
+                <w:rFonts w:cs="BRH Devanagari Extra"/>
+                <w:color w:val="000000"/>
+                <w:szCs w:val="32"/>
+              </w:rPr>
+              <w:t>4</w:t>
+            </w:r>
+            <w:r>
+              <w:rPr>
+                <w:rFonts w:ascii="BRH Devanagari Extra" w:hAnsi="BRH Devanagari Extra" w:cs="BRH Devanagari Extra"/>
+                <w:color w:val="000000"/>
+                <w:sz w:val="32"/>
+                <w:szCs w:val="32"/>
+              </w:rPr>
+              <w:t>.</w:t>
+            </w:r>
+            <w:r>
+              <w:rPr>
+                <w:rFonts w:cs="BRH Devanagari Extra"/>
+                <w:color w:val="000000"/>
+                <w:szCs w:val="32"/>
+              </w:rPr>
+              <w:t>2</w:t>
+            </w:r>
+            <w:r>
+              <w:rPr>
+                <w:rFonts w:ascii="BRH Devanagari Extra" w:hAnsi="BRH Devanagari Extra" w:cs="BRH Devanagari Extra"/>
+                <w:color w:val="000000"/>
+                <w:sz w:val="32"/>
+                <w:szCs w:val="32"/>
+              </w:rPr>
+              <w:t>.</w:t>
+            </w:r>
+            <w:r>
+              <w:rPr>
+                <w:rFonts w:cs="BRH Devanagari Extra"/>
+                <w:color w:val="000000"/>
+                <w:szCs w:val="32"/>
+              </w:rPr>
+              <w:t>3</w:t>
+            </w:r>
+            <w:r>
+              <w:rPr>
+                <w:rFonts w:ascii="BRH Devanagari Extra" w:hAnsi="BRH Devanagari Extra" w:cs="BRH Devanagari Extra"/>
+                <w:color w:val="000000"/>
+                <w:sz w:val="32"/>
+                <w:szCs w:val="32"/>
+              </w:rPr>
+              <w:t>(</w:t>
+            </w:r>
+            <w:r>
+              <w:rPr>
+                <w:rFonts w:cs="BRH Devanagari Extra"/>
+                <w:color w:val="000000"/>
+                <w:szCs w:val="32"/>
+              </w:rPr>
+              <w:t>11</w:t>
+            </w:r>
+            <w:r>
+              <w:rPr>
+                <w:rFonts w:ascii="BRH Devanagari Extra" w:hAnsi="BRH Devanagari Extra" w:cs="BRH Devanagari Extra"/>
+                <w:color w:val="000000"/>
+                <w:sz w:val="32"/>
+                <w:szCs w:val="32"/>
+              </w:rPr>
+              <w:t>)-  AurÉþjÉrÉliÉÏ |</w:t>
+            </w:r>
+          </w:p>
+          <w:p>
+            <w:pPr>
+              <w:widowControl w:val="0"/>
+              <w:autoSpaceDE w:val="0"/>
+              <w:autoSpaceDN w:val="0"/>
+              <w:adjustRightInd w:val="0"/>
+              <w:spacing w:before="0" w:line="240" w:lineRule="auto"/>
+              <w:rPr>
+                <w:rFonts w:cs="BRH Malayalam Extra"/>
+                <w:color w:val="FF0000"/>
+                <w:szCs w:val="40"/>
+              </w:rPr>
+            </w:pPr>
+            <w:r>
+              <w:rPr>
+                <w:rFonts w:ascii="BRH Devanagari Extra" w:hAnsi="BRH Devanagari Extra" w:cs="BRH Devanagari Extra"/>
+                <w:color w:val="000000"/>
+                <w:sz w:val="32"/>
+                <w:szCs w:val="32"/>
+              </w:rPr>
+              <w:t>AurÉþjÉrÉliÉÏ</w:t>
+            </w:r>
+            <w:r>
+              <w:rPr>
+                <w:rFonts w:ascii="BRH Malayalam Extra" w:hAnsi="BRH Malayalam Extra" w:cs="BRH Devanagari Extra"/>
+                <w:color w:val="000000"/>
+                <w:szCs w:val="32"/>
+              </w:rPr>
+              <w:t>–</w:t>
+            </w:r>
+            <w:r>
+              <w:rPr>
+                <w:rFonts w:ascii="BRH Devanagari Extra" w:hAnsi="BRH Devanagari Extra" w:cs="BRH Devanagari Extra"/>
+                <w:color w:val="000000"/>
+                <w:sz w:val="32"/>
+                <w:szCs w:val="32"/>
+              </w:rPr>
+              <w:t xml:space="preserve"> C</w:t>
+            </w:r>
+            <w:r>
+              <w:rPr>
+                <w:rFonts w:ascii="BRH Devanagari Extra" w:hAnsi="BRH Devanagari Extra" w:cs="BRH Devanagari Extra"/>
+                <w:color w:val="000000"/>
+                <w:sz w:val="32"/>
+                <w:szCs w:val="32"/>
+                <w:highlight w:val="yellow"/>
+              </w:rPr>
+              <w:t>ÌiÉrÉ</w:t>
+            </w:r>
+            <w:r>
+              <w:rPr>
+                <w:rFonts w:ascii="BRH Devanagari Extra" w:hAnsi="BRH Devanagari Extra" w:cs="BRH Devanagari Extra"/>
+                <w:color w:val="000000"/>
+                <w:sz w:val="32"/>
+                <w:szCs w:val="32"/>
+              </w:rPr>
+              <w:t xml:space="preserve">urÉþjÉrÉliÉÏ | </w:t>
+            </w:r>
+          </w:p>
+        </w:tc>
+        <w:tc>
+          <w:tcPr>
+            <w:tcW w:w="7371" w:type="dxa"/>
+            <w:tcBorders>
+              <w:top w:val="single" w:sz="4" w:space="0" w:color="000000"/>
+              <w:left w:val="single" w:sz="4" w:space="0" w:color="000000"/>
+              <w:bottom w:val="single" w:sz="4" w:space="0" w:color="000000"/>
+              <w:right w:val="single" w:sz="4" w:space="0" w:color="000000"/>
+            </w:tcBorders>
+          </w:tcPr>
+          <w:p>
+            <w:pPr>
+              <w:widowControl w:val="0"/>
+              <w:autoSpaceDE w:val="0"/>
+              <w:autoSpaceDN w:val="0"/>
+              <w:adjustRightInd w:val="0"/>
+              <w:spacing w:before="0" w:line="240" w:lineRule="auto"/>
+              <w:rPr>
+                <w:rFonts w:ascii="BRH Devanagari Extra" w:hAnsi="BRH Devanagari Extra" w:cs="BRH Devanagari Extra"/>
+                <w:color w:val="000000"/>
+                <w:sz w:val="32"/>
+                <w:szCs w:val="32"/>
+              </w:rPr>
+            </w:pPr>
+            <w:r>
+              <w:rPr>
+                <w:rFonts w:ascii="BRH Devanagari Extra" w:hAnsi="BRH Devanagari Extra" w:cs="BRH Devanagari Extra"/>
+                <w:color w:val="000000"/>
+                <w:sz w:val="32"/>
+                <w:szCs w:val="32"/>
+              </w:rPr>
+              <w:t>(</w:t>
+            </w:r>
+            <w:r>
+              <w:rPr>
+                <w:rFonts w:cs="BRH Devanagari Extra"/>
+                <w:color w:val="000000"/>
+                <w:szCs w:val="32"/>
+              </w:rPr>
+              <w:t>16</w:t>
+            </w:r>
+            <w:r>
+              <w:rPr>
+                <w:rFonts w:ascii="BRH Devanagari Extra" w:hAnsi="BRH Devanagari Extra" w:cs="BRH Devanagari Extra"/>
+                <w:color w:val="000000"/>
+                <w:sz w:val="32"/>
+                <w:szCs w:val="32"/>
+              </w:rPr>
+              <w:t>)</w:t>
+            </w:r>
+            <w:r>
+              <w:rPr>
+                <w:rFonts w:cs="BRH Devanagari Extra"/>
+                <w:color w:val="000000"/>
+                <w:szCs w:val="32"/>
+              </w:rPr>
+              <w:t>[P6</w:t>
+            </w:r>
+            <w:r>
+              <w:rPr>
+                <w:rFonts w:ascii="BRH Devanagari Extra" w:hAnsi="BRH Devanagari Extra" w:cs="BRH Devanagari Extra"/>
+                <w:color w:val="000000"/>
+                <w:sz w:val="32"/>
+                <w:szCs w:val="32"/>
+              </w:rPr>
+              <w:t xml:space="preserve">] </w:t>
+            </w:r>
+            <w:r>
+              <w:rPr>
+                <w:rFonts w:cs="BRH Devanagari Extra"/>
+                <w:color w:val="000000"/>
+                <w:szCs w:val="32"/>
+              </w:rPr>
+              <w:t>4</w:t>
+            </w:r>
+            <w:r>
+              <w:rPr>
+                <w:rFonts w:ascii="BRH Devanagari Extra" w:hAnsi="BRH Devanagari Extra" w:cs="BRH Devanagari Extra"/>
+                <w:color w:val="000000"/>
+                <w:sz w:val="32"/>
+                <w:szCs w:val="32"/>
+              </w:rPr>
+              <w:t>.</w:t>
+            </w:r>
+            <w:r>
+              <w:rPr>
+                <w:rFonts w:cs="BRH Devanagari Extra"/>
+                <w:color w:val="000000"/>
+                <w:szCs w:val="32"/>
+              </w:rPr>
+              <w:t>4</w:t>
+            </w:r>
+            <w:r>
+              <w:rPr>
+                <w:rFonts w:ascii="BRH Devanagari Extra" w:hAnsi="BRH Devanagari Extra" w:cs="BRH Devanagari Extra"/>
+                <w:color w:val="000000"/>
+                <w:sz w:val="32"/>
+                <w:szCs w:val="32"/>
+              </w:rPr>
+              <w:t>.</w:t>
+            </w:r>
+            <w:r>
+              <w:rPr>
+                <w:rFonts w:cs="BRH Devanagari Extra"/>
+                <w:color w:val="000000"/>
+                <w:szCs w:val="32"/>
+              </w:rPr>
+              <w:t>2</w:t>
+            </w:r>
+            <w:r>
+              <w:rPr>
+                <w:rFonts w:ascii="BRH Devanagari Extra" w:hAnsi="BRH Devanagari Extra" w:cs="BRH Devanagari Extra"/>
+                <w:color w:val="000000"/>
+                <w:sz w:val="32"/>
+                <w:szCs w:val="32"/>
+              </w:rPr>
+              <w:t>.</w:t>
+            </w:r>
+            <w:r>
+              <w:rPr>
+                <w:rFonts w:cs="BRH Devanagari Extra"/>
+                <w:color w:val="000000"/>
+                <w:szCs w:val="32"/>
+              </w:rPr>
+              <w:t>3</w:t>
+            </w:r>
+            <w:r>
+              <w:rPr>
+                <w:rFonts w:ascii="BRH Devanagari Extra" w:hAnsi="BRH Devanagari Extra" w:cs="BRH Devanagari Extra"/>
+                <w:color w:val="000000"/>
+                <w:sz w:val="32"/>
+                <w:szCs w:val="32"/>
+              </w:rPr>
+              <w:t>(</w:t>
+            </w:r>
+            <w:r>
+              <w:rPr>
+                <w:rFonts w:cs="BRH Devanagari Extra"/>
+                <w:color w:val="000000"/>
+                <w:szCs w:val="32"/>
+              </w:rPr>
+              <w:t>11</w:t>
+            </w:r>
+            <w:r>
+              <w:rPr>
+                <w:rFonts w:ascii="BRH Devanagari Extra" w:hAnsi="BRH Devanagari Extra" w:cs="BRH Devanagari Extra"/>
+                <w:color w:val="000000"/>
+                <w:sz w:val="32"/>
+                <w:szCs w:val="32"/>
+              </w:rPr>
+              <w:t>)-  AurÉþjÉrÉliÉÏ |</w:t>
+            </w:r>
+          </w:p>
+          <w:p>
+            <w:pPr>
+              <w:widowControl w:val="0"/>
+              <w:autoSpaceDE w:val="0"/>
+              <w:autoSpaceDN w:val="0"/>
+              <w:adjustRightInd w:val="0"/>
+              <w:spacing w:before="0" w:line="240" w:lineRule="auto"/>
+              <w:rPr>
+                <w:rFonts w:cs="BRH Malayalam Extra"/>
+                <w:color w:val="FF0000"/>
+                <w:szCs w:val="40"/>
+              </w:rPr>
+            </w:pPr>
+            <w:r>
+              <w:rPr>
+                <w:rFonts w:ascii="BRH Devanagari Extra" w:hAnsi="BRH Devanagari Extra" w:cs="BRH Devanagari Extra"/>
+                <w:color w:val="000000"/>
+                <w:sz w:val="32"/>
+                <w:szCs w:val="32"/>
+              </w:rPr>
+              <w:t>AurÉþjÉrÉliÉÏ</w:t>
+            </w:r>
+            <w:r>
+              <w:rPr>
+                <w:rFonts w:ascii="BRH Malayalam Extra" w:hAnsi="BRH Malayalam Extra" w:cs="BRH Devanagari Extra"/>
+                <w:color w:val="000000"/>
+                <w:szCs w:val="32"/>
+              </w:rPr>
+              <w:t>–</w:t>
+            </w:r>
+            <w:r>
+              <w:rPr>
+                <w:rFonts w:ascii="BRH Devanagari Extra" w:hAnsi="BRH Devanagari Extra" w:cs="BRH Devanagari Extra"/>
+                <w:color w:val="000000"/>
+                <w:sz w:val="32"/>
+                <w:szCs w:val="32"/>
+              </w:rPr>
+              <w:t xml:space="preserve"> C</w:t>
+            </w:r>
+            <w:r>
+              <w:rPr>
+                <w:rFonts w:ascii="BRH Devanagari Extra" w:hAnsi="BRH Devanagari Extra" w:cs="BRH Devanagari Extra"/>
+                <w:color w:val="000000"/>
+                <w:sz w:val="32"/>
+                <w:szCs w:val="32"/>
+                <w:highlight w:val="green"/>
+              </w:rPr>
+              <w:t>irÉ</w:t>
+            </w:r>
+            <w:r>
+              <w:rPr>
+                <w:rFonts w:ascii="BRH Devanagari Extra" w:hAnsi="BRH Devanagari Extra" w:cs="BRH Devanagari Extra"/>
+                <w:color w:val="000000"/>
+                <w:sz w:val="32"/>
+                <w:szCs w:val="32"/>
+              </w:rPr>
+              <w:t xml:space="preserve">urÉþjÉrÉliÉÏ | </w:t>
+            </w:r>
+          </w:p>
+        </w:tc>
+      </w:tr>
+      <w:tr>
+        <w:trPr>
+          <w:trHeight w:val="2262"/>
+        </w:trPr>
+        <w:tc>
+          <w:tcPr>
+            <w:tcW w:w="7166" w:type="dxa"/>
+            <w:tcBorders>
+              <w:top w:val="single" w:sz="4" w:space="0" w:color="000000"/>
+              <w:left w:val="single" w:sz="4" w:space="0" w:color="000000"/>
+              <w:bottom w:val="single" w:sz="4" w:space="0" w:color="000000"/>
+              <w:right w:val="single" w:sz="4" w:space="0" w:color="000000"/>
+            </w:tcBorders>
+          </w:tcPr>
+          <w:p>
+            <w:pPr>
+              <w:widowControl w:val="0"/>
+              <w:autoSpaceDE w:val="0"/>
+              <w:autoSpaceDN w:val="0"/>
+              <w:adjustRightInd w:val="0"/>
+              <w:spacing w:before="0" w:line="240" w:lineRule="auto"/>
+              <w:rPr>
+                <w:rFonts w:ascii="BRH Devanagari Extra" w:hAnsi="BRH Devanagari Extra" w:cs="BRH Devanagari Extra"/>
+                <w:color w:val="000000"/>
+                <w:sz w:val="32"/>
+                <w:szCs w:val="32"/>
+              </w:rPr>
+            </w:pPr>
+            <w:r>
+              <w:rPr>
+                <w:rFonts w:ascii="BRH Devanagari Extra" w:hAnsi="BRH Devanagari Extra" w:cs="BRH Devanagari Extra"/>
+                <w:color w:val="000000"/>
+                <w:sz w:val="32"/>
+                <w:szCs w:val="32"/>
+              </w:rPr>
+              <w:t>(</w:t>
+            </w:r>
+            <w:r>
+              <w:rPr>
+                <w:rFonts w:cs="BRH Devanagari Extra"/>
+                <w:color w:val="000000"/>
+                <w:szCs w:val="32"/>
+              </w:rPr>
+              <w:t>2</w:t>
+            </w:r>
+            <w:r>
+              <w:rPr>
+                <w:rFonts w:ascii="BRH Devanagari Extra" w:hAnsi="BRH Devanagari Extra" w:cs="BRH Devanagari Extra"/>
+                <w:color w:val="000000"/>
+                <w:sz w:val="32"/>
+                <w:szCs w:val="32"/>
+              </w:rPr>
+              <w:t>)</w:t>
+            </w:r>
+            <w:r>
+              <w:rPr>
+                <w:rFonts w:cs="BRH Devanagari Extra"/>
+                <w:color w:val="000000"/>
+                <w:szCs w:val="32"/>
+              </w:rPr>
+              <w:t>[P11</w:t>
+            </w:r>
+            <w:r>
+              <w:rPr>
+                <w:rFonts w:ascii="BRH Devanagari Extra" w:hAnsi="BRH Devanagari Extra" w:cs="BRH Devanagari Extra"/>
+                <w:color w:val="000000"/>
+                <w:sz w:val="32"/>
+                <w:szCs w:val="32"/>
+              </w:rPr>
+              <w:t xml:space="preserve">] </w:t>
+            </w:r>
+            <w:r>
+              <w:rPr>
+                <w:rFonts w:cs="BRH Devanagari Extra"/>
+                <w:color w:val="000000"/>
+                <w:szCs w:val="32"/>
+              </w:rPr>
+              <w:t>4</w:t>
+            </w:r>
+            <w:r>
+              <w:rPr>
+                <w:rFonts w:ascii="BRH Devanagari Extra" w:hAnsi="BRH Devanagari Extra" w:cs="BRH Devanagari Extra"/>
+                <w:color w:val="000000"/>
+                <w:sz w:val="32"/>
+                <w:szCs w:val="32"/>
+              </w:rPr>
+              <w:t>.</w:t>
+            </w:r>
+            <w:r>
+              <w:rPr>
+                <w:rFonts w:cs="BRH Devanagari Extra"/>
+                <w:color w:val="000000"/>
+                <w:szCs w:val="32"/>
+              </w:rPr>
+              <w:t>4</w:t>
+            </w:r>
+            <w:r>
+              <w:rPr>
+                <w:rFonts w:ascii="BRH Devanagari Extra" w:hAnsi="BRH Devanagari Extra" w:cs="BRH Devanagari Extra"/>
+                <w:color w:val="000000"/>
+                <w:sz w:val="32"/>
+                <w:szCs w:val="32"/>
+              </w:rPr>
+              <w:t>.</w:t>
+            </w:r>
+            <w:r>
+              <w:rPr>
+                <w:rFonts w:cs="BRH Devanagari Extra"/>
+                <w:color w:val="000000"/>
+                <w:szCs w:val="32"/>
+              </w:rPr>
+              <w:t>4</w:t>
+            </w:r>
+            <w:r>
+              <w:rPr>
+                <w:rFonts w:ascii="BRH Devanagari Extra" w:hAnsi="BRH Devanagari Extra" w:cs="BRH Devanagari Extra"/>
+                <w:color w:val="000000"/>
+                <w:sz w:val="32"/>
+                <w:szCs w:val="32"/>
+              </w:rPr>
+              <w:t>.</w:t>
+            </w:r>
+            <w:r>
+              <w:rPr>
+                <w:rFonts w:cs="BRH Devanagari Extra"/>
+                <w:color w:val="000000"/>
+                <w:szCs w:val="32"/>
+              </w:rPr>
+              <w:t>2</w:t>
+            </w:r>
+            <w:r>
+              <w:rPr>
+                <w:rFonts w:ascii="BRH Devanagari Extra" w:hAnsi="BRH Devanagari Extra" w:cs="BRH Devanagari Extra"/>
+                <w:color w:val="000000"/>
+                <w:sz w:val="32"/>
+                <w:szCs w:val="32"/>
+              </w:rPr>
+              <w:t>(</w:t>
+            </w:r>
+            <w:r>
+              <w:rPr>
+                <w:rFonts w:cs="BRH Devanagari Extra"/>
+                <w:color w:val="000000"/>
+                <w:szCs w:val="32"/>
+              </w:rPr>
+              <w:t>2</w:t>
+            </w:r>
+            <w:r>
+              <w:rPr>
+                <w:rFonts w:ascii="BRH Devanagari Extra" w:hAnsi="BRH Devanagari Extra" w:cs="BRH Devanagari Extra"/>
+                <w:color w:val="000000"/>
+                <w:sz w:val="32"/>
+                <w:szCs w:val="32"/>
+              </w:rPr>
+              <w:t>)-  kÉå</w:t>
+            </w:r>
+            <w:r>
+              <w:rPr>
+                <w:rFonts w:ascii="BRH Malayalam Extra" w:hAnsi="BRH Malayalam Extra" w:cs="BRH Devanagari Extra"/>
+                <w:color w:val="000000"/>
+                <w:szCs w:val="32"/>
+              </w:rPr>
+              <w:t>–</w:t>
+            </w:r>
+            <w:r>
+              <w:rPr>
+                <w:rFonts w:ascii="BRH Devanagari Extra" w:hAnsi="BRH Devanagari Extra" w:cs="BRH Devanagari Extra"/>
+                <w:color w:val="000000"/>
+                <w:sz w:val="32"/>
+                <w:szCs w:val="32"/>
+              </w:rPr>
+              <w:t>lÉÑqÉç | C</w:t>
+            </w:r>
+            <w:r>
+              <w:rPr>
+                <w:rFonts w:ascii="BRH Malayalam Extra" w:hAnsi="BRH Malayalam Extra" w:cs="BRH Devanagari Extra"/>
+                <w:color w:val="000000"/>
+                <w:szCs w:val="32"/>
+                <w:highlight w:val="yellow"/>
+              </w:rPr>
+              <w:t>–</w:t>
+            </w:r>
+            <w:r>
+              <w:rPr>
+                <w:rFonts w:ascii="BRH Devanagari Extra" w:hAnsi="BRH Devanagari Extra" w:cs="BRH Devanagari Extra"/>
+                <w:color w:val="000000"/>
+                <w:sz w:val="32"/>
+                <w:szCs w:val="32"/>
+                <w:highlight w:val="yellow"/>
+              </w:rPr>
+              <w:t>uÉ</w:t>
+            </w:r>
+            <w:r>
+              <w:rPr>
+                <w:rFonts w:ascii="BRH Devanagari Extra" w:hAnsi="BRH Devanagari Extra" w:cs="BRH Devanagari Extra"/>
+                <w:color w:val="000000"/>
+                <w:sz w:val="32"/>
+                <w:szCs w:val="32"/>
+              </w:rPr>
+              <w:t xml:space="preserve"> |</w:t>
+            </w:r>
+          </w:p>
+          <w:p>
+            <w:pPr>
+              <w:widowControl w:val="0"/>
+              <w:autoSpaceDE w:val="0"/>
+              <w:autoSpaceDN w:val="0"/>
+              <w:adjustRightInd w:val="0"/>
+              <w:spacing w:before="0" w:line="240" w:lineRule="auto"/>
+              <w:rPr>
+                <w:rFonts w:ascii="BRH Devanagari Extra" w:hAnsi="BRH Devanagari Extra" w:cs="BRH Devanagari Extra"/>
+                <w:color w:val="000000"/>
+                <w:sz w:val="32"/>
+                <w:szCs w:val="32"/>
+              </w:rPr>
+            </w:pPr>
+            <w:r>
+              <w:rPr>
+                <w:rFonts w:ascii="BRH Devanagari Extra" w:hAnsi="BRH Devanagari Extra" w:cs="BRH Devanagari Extra"/>
+                <w:color w:val="000000"/>
+                <w:sz w:val="32"/>
+                <w:szCs w:val="32"/>
+              </w:rPr>
+              <w:t>kÉå</w:t>
+            </w:r>
+            <w:r>
+              <w:rPr>
+                <w:rFonts w:ascii="BRH Malayalam Extra" w:hAnsi="BRH Malayalam Extra" w:cs="BRH Devanagari Extra"/>
+                <w:color w:val="000000"/>
+                <w:szCs w:val="32"/>
+              </w:rPr>
+              <w:t>–</w:t>
+            </w:r>
+            <w:r>
+              <w:rPr>
+                <w:rFonts w:ascii="BRH Devanagari Extra" w:hAnsi="BRH Devanagari Extra" w:cs="BRH Devanagari Extra"/>
+                <w:color w:val="000000"/>
+                <w:sz w:val="32"/>
+                <w:szCs w:val="32"/>
+              </w:rPr>
+              <w:t>lÉÑ ÍqÉ</w:t>
+            </w:r>
+            <w:r>
+              <w:rPr>
+                <w:rFonts w:ascii="BRH Malayalam Extra" w:hAnsi="BRH Malayalam Extra" w:cs="BRH Devanagari Extra"/>
+                <w:color w:val="000000"/>
+                <w:szCs w:val="32"/>
+              </w:rPr>
+              <w:t>–</w:t>
+            </w:r>
+            <w:r>
+              <w:rPr>
+                <w:rFonts w:ascii="BRH Devanagari Extra" w:hAnsi="BRH Devanagari Extra" w:cs="BRH Devanagari Extra"/>
+                <w:color w:val="000000"/>
+                <w:sz w:val="32"/>
+                <w:szCs w:val="32"/>
+              </w:rPr>
+              <w:t>uÉå</w:t>
+            </w:r>
+            <w:r>
+              <w:rPr>
+                <w:rFonts w:ascii="BRH Devanagari Extra" w:hAnsi="BRH Devanagari Extra" w:cs="BRH Devanagari Extra"/>
+                <w:color w:val="000000"/>
+                <w:sz w:val="32"/>
+                <w:szCs w:val="32"/>
+                <w:highlight w:val="yellow"/>
+              </w:rPr>
+              <w:t>uÉ</w:t>
+            </w:r>
+            <w:r>
+              <w:rPr>
+                <w:rFonts w:ascii="BRH Devanagari Extra" w:hAnsi="BRH Devanagari Extra" w:cs="BRH Devanagari Extra"/>
+                <w:color w:val="000000"/>
+                <w:sz w:val="32"/>
+                <w:szCs w:val="32"/>
+              </w:rPr>
+              <w:t xml:space="preserve"> kÉå</w:t>
+            </w:r>
+            <w:r>
+              <w:rPr>
+                <w:rFonts w:ascii="BRH Malayalam Extra" w:hAnsi="BRH Malayalam Extra" w:cs="BRH Devanagari Extra"/>
+                <w:color w:val="000000"/>
+                <w:szCs w:val="32"/>
+              </w:rPr>
+              <w:t>–</w:t>
+            </w:r>
+            <w:r>
+              <w:rPr>
+                <w:rFonts w:ascii="BRH Devanagari Extra" w:hAnsi="BRH Devanagari Extra" w:cs="BRH Devanagari Extra"/>
+                <w:color w:val="000000"/>
+                <w:sz w:val="32"/>
+                <w:szCs w:val="32"/>
+              </w:rPr>
+              <w:t>lÉÑqÉç kÉå</w:t>
+            </w:r>
+            <w:r>
+              <w:rPr>
+                <w:rFonts w:ascii="BRH Malayalam Extra" w:hAnsi="BRH Malayalam Extra" w:cs="BRH Devanagari Extra"/>
+                <w:color w:val="000000"/>
+                <w:szCs w:val="32"/>
+              </w:rPr>
+              <w:t>–</w:t>
+            </w:r>
+            <w:r>
+              <w:rPr>
+                <w:rFonts w:ascii="BRH Devanagari Extra" w:hAnsi="BRH Devanagari Extra" w:cs="BRH Devanagari Extra"/>
+                <w:color w:val="000000"/>
+                <w:sz w:val="32"/>
+                <w:szCs w:val="32"/>
+              </w:rPr>
+              <w:t xml:space="preserve">lÉÑ </w:t>
+            </w:r>
+            <w:r>
+              <w:rPr>
+                <w:rFonts w:ascii="BRH Devanagari Extra" w:hAnsi="BRH Devanagari Extra" w:cs="BRH Devanagari Extra"/>
+                <w:color w:val="000000"/>
+                <w:sz w:val="32"/>
+                <w:szCs w:val="32"/>
+                <w:highlight w:val="yellow"/>
+              </w:rPr>
+              <w:t>ÍqÉ</w:t>
+            </w:r>
+            <w:r>
+              <w:rPr>
+                <w:rFonts w:ascii="BRH Malayalam Extra" w:hAnsi="BRH Malayalam Extra" w:cs="BRH Devanagari Extra"/>
+                <w:color w:val="000000"/>
+                <w:szCs w:val="32"/>
+              </w:rPr>
+              <w:t>–</w:t>
+            </w:r>
+            <w:r>
+              <w:rPr>
+                <w:rFonts w:ascii="BRH Devanagari Extra" w:hAnsi="BRH Devanagari Extra" w:cs="BRH Devanagari Extra"/>
+                <w:color w:val="000000"/>
+                <w:sz w:val="32"/>
+                <w:szCs w:val="32"/>
+              </w:rPr>
+              <w:t xml:space="preserve">uÉ | </w:t>
+            </w:r>
+          </w:p>
+          <w:p>
+            <w:pPr>
+              <w:widowControl w:val="0"/>
+              <w:autoSpaceDE w:val="0"/>
+              <w:autoSpaceDN w:val="0"/>
+              <w:adjustRightInd w:val="0"/>
+              <w:spacing w:before="0" w:line="240" w:lineRule="auto"/>
+              <w:rPr>
+                <w:rFonts w:ascii="BRH Devanagari Extra" w:hAnsi="BRH Devanagari Extra" w:cs="BRH Devanagari Extra"/>
+                <w:color w:val="000000"/>
+                <w:sz w:val="32"/>
+                <w:szCs w:val="32"/>
+              </w:rPr>
+            </w:pPr>
+            <w:r>
+              <w:rPr>
+                <w:rFonts w:ascii="BRH Devanagari Extra" w:hAnsi="BRH Devanagari Extra" w:cs="BRH Devanagari Extra"/>
+                <w:color w:val="000000"/>
+                <w:sz w:val="32"/>
+                <w:szCs w:val="32"/>
+              </w:rPr>
+              <w:t>(</w:t>
+            </w:r>
+            <w:r>
+              <w:rPr>
+                <w:rFonts w:cs="BRH Devanagari Extra"/>
+                <w:color w:val="000000"/>
+                <w:szCs w:val="32"/>
+              </w:rPr>
+              <w:t>3</w:t>
+            </w:r>
+            <w:r>
+              <w:rPr>
+                <w:rFonts w:ascii="BRH Devanagari Extra" w:hAnsi="BRH Devanagari Extra" w:cs="BRH Devanagari Extra"/>
+                <w:color w:val="000000"/>
+                <w:sz w:val="32"/>
+                <w:szCs w:val="32"/>
+              </w:rPr>
+              <w:t>)</w:t>
+            </w:r>
+            <w:r>
+              <w:rPr>
+                <w:rFonts w:cs="BRH Devanagari Extra"/>
+                <w:color w:val="000000"/>
+                <w:szCs w:val="32"/>
+              </w:rPr>
+              <w:t>[P11</w:t>
+            </w:r>
+            <w:r>
+              <w:rPr>
+                <w:rFonts w:ascii="BRH Devanagari Extra" w:hAnsi="BRH Devanagari Extra" w:cs="BRH Devanagari Extra"/>
+                <w:color w:val="000000"/>
+                <w:sz w:val="32"/>
+                <w:szCs w:val="32"/>
+              </w:rPr>
+              <w:t xml:space="preserve">] </w:t>
+            </w:r>
+            <w:r>
+              <w:rPr>
+                <w:rFonts w:cs="BRH Devanagari Extra"/>
+                <w:color w:val="000000"/>
+                <w:szCs w:val="32"/>
+              </w:rPr>
+              <w:t>4</w:t>
+            </w:r>
+            <w:r>
+              <w:rPr>
+                <w:rFonts w:ascii="BRH Devanagari Extra" w:hAnsi="BRH Devanagari Extra" w:cs="BRH Devanagari Extra"/>
+                <w:color w:val="000000"/>
+                <w:sz w:val="32"/>
+                <w:szCs w:val="32"/>
+              </w:rPr>
+              <w:t>.</w:t>
+            </w:r>
+            <w:r>
+              <w:rPr>
+                <w:rFonts w:cs="BRH Devanagari Extra"/>
+                <w:color w:val="000000"/>
+                <w:szCs w:val="32"/>
+              </w:rPr>
+              <w:t>4</w:t>
+            </w:r>
+            <w:r>
+              <w:rPr>
+                <w:rFonts w:ascii="BRH Devanagari Extra" w:hAnsi="BRH Devanagari Extra" w:cs="BRH Devanagari Extra"/>
+                <w:color w:val="000000"/>
+                <w:sz w:val="32"/>
+                <w:szCs w:val="32"/>
+              </w:rPr>
+              <w:t>.</w:t>
+            </w:r>
+            <w:r>
+              <w:rPr>
+                <w:rFonts w:cs="BRH Devanagari Extra"/>
+                <w:color w:val="000000"/>
+                <w:szCs w:val="32"/>
+              </w:rPr>
+              <w:t>4</w:t>
+            </w:r>
+            <w:r>
+              <w:rPr>
+                <w:rFonts w:ascii="BRH Devanagari Extra" w:hAnsi="BRH Devanagari Extra" w:cs="BRH Devanagari Extra"/>
+                <w:color w:val="000000"/>
+                <w:sz w:val="32"/>
+                <w:szCs w:val="32"/>
+              </w:rPr>
+              <w:t>.</w:t>
+            </w:r>
+            <w:r>
+              <w:rPr>
+                <w:rFonts w:cs="BRH Devanagari Extra"/>
+                <w:color w:val="000000"/>
+                <w:szCs w:val="32"/>
+              </w:rPr>
+              <w:t>2</w:t>
+            </w:r>
+            <w:r>
+              <w:rPr>
+                <w:rFonts w:ascii="BRH Devanagari Extra" w:hAnsi="BRH Devanagari Extra" w:cs="BRH Devanagari Extra"/>
+                <w:color w:val="000000"/>
+                <w:sz w:val="32"/>
+                <w:szCs w:val="32"/>
+              </w:rPr>
+              <w:t>(</w:t>
+            </w:r>
+            <w:r>
+              <w:rPr>
+                <w:rFonts w:cs="BRH Devanagari Extra"/>
+                <w:color w:val="000000"/>
+                <w:szCs w:val="32"/>
+              </w:rPr>
+              <w:t>3</w:t>
+            </w:r>
+            <w:r>
+              <w:rPr>
+                <w:rFonts w:ascii="BRH Devanagari Extra" w:hAnsi="BRH Devanagari Extra" w:cs="BRH Devanagari Extra"/>
+                <w:color w:val="000000"/>
+                <w:sz w:val="32"/>
+                <w:szCs w:val="32"/>
+              </w:rPr>
+              <w:t>)-  C</w:t>
+            </w:r>
+            <w:r>
+              <w:rPr>
+                <w:rFonts w:ascii="BRH Malayalam Extra" w:hAnsi="BRH Malayalam Extra" w:cs="BRH Devanagari Extra"/>
+                <w:color w:val="000000"/>
+                <w:szCs w:val="32"/>
+                <w:highlight w:val="yellow"/>
+              </w:rPr>
+              <w:t>–</w:t>
+            </w:r>
+            <w:r>
+              <w:rPr>
+                <w:rFonts w:ascii="BRH Devanagari Extra" w:hAnsi="BRH Devanagari Extra" w:cs="BRH Devanagari Extra"/>
+                <w:color w:val="000000"/>
+                <w:sz w:val="32"/>
+                <w:szCs w:val="32"/>
+                <w:highlight w:val="yellow"/>
+              </w:rPr>
+              <w:t>uÉ</w:t>
+            </w:r>
+            <w:r>
+              <w:rPr>
+                <w:rFonts w:ascii="BRH Devanagari Extra" w:hAnsi="BRH Devanagari Extra" w:cs="BRH Devanagari Extra"/>
+                <w:color w:val="000000"/>
+                <w:sz w:val="32"/>
+                <w:szCs w:val="32"/>
+              </w:rPr>
+              <w:t xml:space="preserve"> | AÉ</w:t>
+            </w:r>
+            <w:r>
+              <w:rPr>
+                <w:rFonts w:ascii="BRH Malayalam Extra" w:hAnsi="BRH Malayalam Extra" w:cs="BRH Devanagari Extra"/>
+                <w:color w:val="000000"/>
+                <w:szCs w:val="32"/>
+              </w:rPr>
+              <w:t>–</w:t>
+            </w:r>
+            <w:r>
+              <w:rPr>
+                <w:rFonts w:ascii="BRH Devanagari Extra" w:hAnsi="BRH Devanagari Extra" w:cs="BRH Devanagari Extra"/>
+                <w:color w:val="000000"/>
+                <w:sz w:val="32"/>
+                <w:szCs w:val="32"/>
+              </w:rPr>
+              <w:t>rÉ</w:t>
+            </w:r>
+            <w:r>
+              <w:rPr>
+                <w:rFonts w:ascii="BRH Malayalam Extra" w:hAnsi="BRH Malayalam Extra" w:cs="BRH Devanagari Extra"/>
+                <w:color w:val="000000"/>
+                <w:szCs w:val="32"/>
+              </w:rPr>
+              <w:t>–</w:t>
+            </w:r>
+            <w:r>
+              <w:rPr>
+                <w:rFonts w:ascii="BRH Devanagari Extra" w:hAnsi="BRH Devanagari Extra" w:cs="BRH Devanagari Extra"/>
+                <w:color w:val="000000"/>
+                <w:sz w:val="32"/>
+                <w:szCs w:val="32"/>
+              </w:rPr>
+              <w:t>iÉÏqÉç |</w:t>
+            </w:r>
+          </w:p>
+          <w:p>
+            <w:pPr>
+              <w:widowControl w:val="0"/>
+              <w:autoSpaceDE w:val="0"/>
+              <w:autoSpaceDN w:val="0"/>
+              <w:adjustRightInd w:val="0"/>
+              <w:spacing w:before="0" w:line="240" w:lineRule="auto"/>
+              <w:rPr>
+                <w:rFonts w:ascii="BRH Devanagari Extra" w:hAnsi="BRH Devanagari Extra" w:cs="BRH Devanagari Extra"/>
+                <w:color w:val="000000"/>
+                <w:sz w:val="32"/>
+                <w:szCs w:val="32"/>
+              </w:rPr>
+            </w:pPr>
+            <w:r>
+              <w:rPr>
+                <w:rFonts w:ascii="BRH Devanagari Extra" w:hAnsi="BRH Devanagari Extra" w:cs="BRH Devanagari Extra"/>
+                <w:color w:val="000000"/>
+                <w:sz w:val="32"/>
+                <w:szCs w:val="32"/>
+              </w:rPr>
+              <w:t>C</w:t>
+            </w:r>
+            <w:r>
+              <w:rPr>
+                <w:rFonts w:ascii="BRH Malayalam Extra" w:hAnsi="BRH Malayalam Extra" w:cs="BRH Devanagari Extra"/>
+                <w:color w:val="000000"/>
+                <w:szCs w:val="32"/>
+                <w:highlight w:val="yellow"/>
+              </w:rPr>
+              <w:t>–</w:t>
+            </w:r>
+            <w:r>
+              <w:rPr>
+                <w:rFonts w:ascii="BRH Devanagari Extra" w:hAnsi="BRH Devanagari Extra" w:cs="BRH Devanagari Extra"/>
+                <w:color w:val="000000"/>
+                <w:sz w:val="32"/>
+                <w:szCs w:val="32"/>
+                <w:highlight w:val="yellow"/>
+              </w:rPr>
+              <w:t>uÉ</w:t>
+            </w:r>
+            <w:r>
+              <w:rPr>
+                <w:rFonts w:ascii="BRH Devanagari Extra" w:hAnsi="BRH Devanagari Extra" w:cs="BRH Devanagari Extra"/>
+                <w:color w:val="000000"/>
+                <w:sz w:val="32"/>
+                <w:szCs w:val="32"/>
+              </w:rPr>
+              <w:t>ÉrÉ</w:t>
+            </w:r>
+            <w:r>
+              <w:rPr>
+                <w:rFonts w:ascii="BRH Malayalam Extra" w:hAnsi="BRH Malayalam Extra" w:cs="BRH Devanagari Extra"/>
+                <w:color w:val="000000"/>
+                <w:szCs w:val="32"/>
+              </w:rPr>
+              <w:t>–</w:t>
+            </w:r>
+            <w:r>
+              <w:rPr>
+                <w:rFonts w:ascii="BRH Devanagari Extra" w:hAnsi="BRH Devanagari Extra" w:cs="BRH Devanagari Extra"/>
+                <w:color w:val="000000"/>
+                <w:sz w:val="32"/>
+                <w:szCs w:val="32"/>
+              </w:rPr>
+              <w:t>iÉÏ qÉÉþrÉ</w:t>
+            </w:r>
+            <w:r>
+              <w:rPr>
+                <w:rFonts w:ascii="BRH Malayalam Extra" w:hAnsi="BRH Malayalam Extra" w:cs="BRH Devanagari Extra"/>
+                <w:color w:val="000000"/>
+                <w:szCs w:val="32"/>
+              </w:rPr>
+              <w:t>–</w:t>
+            </w:r>
+            <w:r>
+              <w:rPr>
+                <w:rFonts w:ascii="BRH Devanagari Extra" w:hAnsi="BRH Devanagari Extra" w:cs="BRH Devanagari Extra"/>
+                <w:color w:val="000000"/>
+                <w:sz w:val="32"/>
+                <w:szCs w:val="32"/>
+              </w:rPr>
+              <w:t xml:space="preserve">iÉÏ </w:t>
+            </w:r>
+            <w:r>
+              <w:rPr>
+                <w:rFonts w:ascii="BRH Devanagari Extra" w:hAnsi="BRH Devanagari Extra" w:cs="BRH Devanagari Extra"/>
+                <w:color w:val="000000"/>
+                <w:sz w:val="32"/>
+                <w:szCs w:val="32"/>
+                <w:highlight w:val="yellow"/>
+              </w:rPr>
+              <w:t>ÍqÉ</w:t>
+            </w:r>
+            <w:r>
+              <w:rPr>
+                <w:rFonts w:ascii="BRH Malayalam Extra" w:hAnsi="BRH Malayalam Extra" w:cs="BRH Devanagari Extra"/>
+                <w:color w:val="000000"/>
+                <w:szCs w:val="32"/>
+              </w:rPr>
+              <w:t>–</w:t>
+            </w:r>
+            <w:r>
+              <w:rPr>
+                <w:rFonts w:ascii="BRH Devanagari Extra" w:hAnsi="BRH Devanagari Extra" w:cs="BRH Devanagari Extra"/>
+                <w:color w:val="000000"/>
+                <w:sz w:val="32"/>
+                <w:szCs w:val="32"/>
+              </w:rPr>
+              <w:t>uÉåuÉÉ rÉ</w:t>
+            </w:r>
+            <w:r>
+              <w:rPr>
+                <w:rFonts w:ascii="BRH Malayalam Extra" w:hAnsi="BRH Malayalam Extra" w:cs="BRH Devanagari Extra"/>
+                <w:color w:val="000000"/>
+                <w:szCs w:val="32"/>
+              </w:rPr>
+              <w:t>–</w:t>
+            </w:r>
+            <w:r>
+              <w:rPr>
+                <w:rFonts w:ascii="BRH Devanagari Extra" w:hAnsi="BRH Devanagari Extra" w:cs="BRH Devanagari Extra"/>
+                <w:color w:val="000000"/>
+                <w:sz w:val="32"/>
+                <w:szCs w:val="32"/>
+              </w:rPr>
+              <w:t xml:space="preserve">iÉÏqÉç | </w:t>
+            </w:r>
+          </w:p>
+          <w:p>
+            <w:pPr>
+              <w:widowControl w:val="0"/>
+              <w:autoSpaceDE w:val="0"/>
+              <w:autoSpaceDN w:val="0"/>
+              <w:adjustRightInd w:val="0"/>
+              <w:spacing w:before="0" w:line="240" w:lineRule="auto"/>
+              <w:rPr>
+                <w:rFonts w:cs="BRH Malayalam Extra"/>
+                <w:color w:val="FF0000"/>
+                <w:szCs w:val="40"/>
+              </w:rPr>
+            </w:pPr>
+          </w:p>
+        </w:tc>
+        <w:tc>
+          <w:tcPr>
+            <w:tcW w:w="7371" w:type="dxa"/>
+            <w:tcBorders>
+              <w:top w:val="single" w:sz="4" w:space="0" w:color="000000"/>
+              <w:left w:val="single" w:sz="4" w:space="0" w:color="000000"/>
+              <w:bottom w:val="single" w:sz="4" w:space="0" w:color="000000"/>
+              <w:right w:val="single" w:sz="4" w:space="0" w:color="000000"/>
+            </w:tcBorders>
+          </w:tcPr>
+          <w:p>
+            <w:pPr>
+              <w:widowControl w:val="0"/>
+              <w:autoSpaceDE w:val="0"/>
+              <w:autoSpaceDN w:val="0"/>
+              <w:adjustRightInd w:val="0"/>
+              <w:spacing w:before="0" w:line="240" w:lineRule="auto"/>
+              <w:rPr>
+                <w:rFonts w:ascii="BRH Devanagari Extra" w:hAnsi="BRH Devanagari Extra" w:cs="BRH Devanagari Extra"/>
+                <w:color w:val="000000"/>
+                <w:sz w:val="32"/>
+                <w:szCs w:val="32"/>
+              </w:rPr>
+            </w:pPr>
+            <w:r>
+              <w:rPr>
+                <w:rFonts w:ascii="BRH Devanagari Extra" w:hAnsi="BRH Devanagari Extra" w:cs="BRH Devanagari Extra"/>
+                <w:color w:val="000000"/>
+                <w:sz w:val="32"/>
+                <w:szCs w:val="32"/>
+              </w:rPr>
+              <w:t>(</w:t>
+            </w:r>
+            <w:r>
+              <w:rPr>
+                <w:rFonts w:cs="BRH Devanagari Extra"/>
+                <w:color w:val="000000"/>
+                <w:szCs w:val="32"/>
+              </w:rPr>
+              <w:t>2</w:t>
+            </w:r>
+            <w:r>
+              <w:rPr>
+                <w:rFonts w:ascii="BRH Devanagari Extra" w:hAnsi="BRH Devanagari Extra" w:cs="BRH Devanagari Extra"/>
+                <w:color w:val="000000"/>
+                <w:sz w:val="32"/>
+                <w:szCs w:val="32"/>
+              </w:rPr>
+              <w:t>)</w:t>
+            </w:r>
+            <w:r>
+              <w:rPr>
+                <w:rFonts w:cs="BRH Devanagari Extra"/>
+                <w:color w:val="000000"/>
+                <w:szCs w:val="32"/>
+              </w:rPr>
+              <w:t>[P11</w:t>
+            </w:r>
+            <w:r>
+              <w:rPr>
+                <w:rFonts w:ascii="BRH Devanagari Extra" w:hAnsi="BRH Devanagari Extra" w:cs="BRH Devanagari Extra"/>
+                <w:color w:val="000000"/>
+                <w:sz w:val="32"/>
+                <w:szCs w:val="32"/>
+              </w:rPr>
+              <w:t xml:space="preserve">] </w:t>
+            </w:r>
+            <w:r>
+              <w:rPr>
+                <w:rFonts w:cs="BRH Devanagari Extra"/>
+                <w:color w:val="000000"/>
+                <w:szCs w:val="32"/>
+              </w:rPr>
+              <w:t>4</w:t>
+            </w:r>
+            <w:r>
+              <w:rPr>
+                <w:rFonts w:ascii="BRH Devanagari Extra" w:hAnsi="BRH Devanagari Extra" w:cs="BRH Devanagari Extra"/>
+                <w:color w:val="000000"/>
+                <w:sz w:val="32"/>
+                <w:szCs w:val="32"/>
+              </w:rPr>
+              <w:t>.</w:t>
+            </w:r>
+            <w:r>
+              <w:rPr>
+                <w:rFonts w:cs="BRH Devanagari Extra"/>
+                <w:color w:val="000000"/>
+                <w:szCs w:val="32"/>
+              </w:rPr>
+              <w:t>4</w:t>
+            </w:r>
+            <w:r>
+              <w:rPr>
+                <w:rFonts w:ascii="BRH Devanagari Extra" w:hAnsi="BRH Devanagari Extra" w:cs="BRH Devanagari Extra"/>
+                <w:color w:val="000000"/>
+                <w:sz w:val="32"/>
+                <w:szCs w:val="32"/>
+              </w:rPr>
+              <w:t>.</w:t>
+            </w:r>
+            <w:r>
+              <w:rPr>
+                <w:rFonts w:cs="BRH Devanagari Extra"/>
+                <w:color w:val="000000"/>
+                <w:szCs w:val="32"/>
+              </w:rPr>
+              <w:t>4</w:t>
+            </w:r>
+            <w:r>
+              <w:rPr>
+                <w:rFonts w:ascii="BRH Devanagari Extra" w:hAnsi="BRH Devanagari Extra" w:cs="BRH Devanagari Extra"/>
+                <w:color w:val="000000"/>
+                <w:sz w:val="32"/>
+                <w:szCs w:val="32"/>
+              </w:rPr>
+              <w:t>.</w:t>
+            </w:r>
+            <w:r>
+              <w:rPr>
+                <w:rFonts w:cs="BRH Devanagari Extra"/>
+                <w:color w:val="000000"/>
+                <w:szCs w:val="32"/>
+              </w:rPr>
+              <w:t>2</w:t>
+            </w:r>
+            <w:r>
+              <w:rPr>
+                <w:rFonts w:ascii="BRH Devanagari Extra" w:hAnsi="BRH Devanagari Extra" w:cs="BRH Devanagari Extra"/>
+                <w:color w:val="000000"/>
+                <w:sz w:val="32"/>
+                <w:szCs w:val="32"/>
+              </w:rPr>
+              <w:t>(</w:t>
+            </w:r>
+            <w:r>
+              <w:rPr>
+                <w:rFonts w:cs="BRH Devanagari Extra"/>
+                <w:color w:val="000000"/>
+                <w:szCs w:val="32"/>
+              </w:rPr>
+              <w:t>2</w:t>
+            </w:r>
+            <w:r>
+              <w:rPr>
+                <w:rFonts w:ascii="BRH Devanagari Extra" w:hAnsi="BRH Devanagari Extra" w:cs="BRH Devanagari Extra"/>
+                <w:color w:val="000000"/>
+                <w:sz w:val="32"/>
+                <w:szCs w:val="32"/>
+              </w:rPr>
+              <w:t>)-  kÉå</w:t>
+            </w:r>
+            <w:r>
+              <w:rPr>
+                <w:rFonts w:ascii="BRH Malayalam Extra" w:hAnsi="BRH Malayalam Extra" w:cs="BRH Devanagari Extra"/>
+                <w:color w:val="000000"/>
+                <w:szCs w:val="32"/>
+              </w:rPr>
+              <w:t>–</w:t>
+            </w:r>
+            <w:r>
+              <w:rPr>
+                <w:rFonts w:ascii="BRH Devanagari Extra" w:hAnsi="BRH Devanagari Extra" w:cs="BRH Devanagari Extra"/>
+                <w:color w:val="000000"/>
+                <w:sz w:val="32"/>
+                <w:szCs w:val="32"/>
+              </w:rPr>
+              <w:t>lÉÑqÉç | C</w:t>
+            </w:r>
+            <w:r>
+              <w:rPr>
+                <w:rFonts w:ascii="BRH Malayalam Extra" w:hAnsi="BRH Malayalam Extra" w:cs="BRH Devanagari Extra"/>
+                <w:color w:val="000000"/>
+                <w:szCs w:val="32"/>
+                <w:highlight w:val="green"/>
+              </w:rPr>
+              <w:t>–</w:t>
+            </w:r>
+            <w:r>
+              <w:rPr>
+                <w:rFonts w:ascii="BRH Devanagari Extra" w:hAnsi="BRH Devanagari Extra" w:cs="BRH Devanagari Extra"/>
+                <w:color w:val="000000"/>
+                <w:sz w:val="32"/>
+                <w:szCs w:val="32"/>
+                <w:highlight w:val="green"/>
+              </w:rPr>
+              <w:t>uÉ</w:t>
+            </w:r>
+            <w:r>
+              <w:rPr>
+                <w:rFonts w:ascii="BRH Malayalam Extra" w:hAnsi="BRH Malayalam Extra" w:cs="BRH Devanagari Extra"/>
+                <w:color w:val="000000"/>
+                <w:szCs w:val="32"/>
+                <w:highlight w:val="green"/>
+              </w:rPr>
+              <w:t>–</w:t>
+            </w:r>
+            <w:r>
+              <w:rPr>
+                <w:rFonts w:ascii="BRH Devanagari Extra" w:hAnsi="BRH Devanagari Extra" w:cs="BRH Devanagari Extra"/>
+                <w:color w:val="000000"/>
+                <w:sz w:val="32"/>
+                <w:szCs w:val="32"/>
+              </w:rPr>
+              <w:t xml:space="preserve"> |</w:t>
+            </w:r>
+          </w:p>
+          <w:p>
+            <w:pPr>
+              <w:widowControl w:val="0"/>
+              <w:autoSpaceDE w:val="0"/>
+              <w:autoSpaceDN w:val="0"/>
+              <w:adjustRightInd w:val="0"/>
+              <w:spacing w:before="0" w:line="240" w:lineRule="auto"/>
+              <w:rPr>
+                <w:rFonts w:ascii="BRH Devanagari Extra" w:hAnsi="BRH Devanagari Extra" w:cs="BRH Devanagari Extra"/>
+                <w:color w:val="000000"/>
+                <w:sz w:val="32"/>
+                <w:szCs w:val="32"/>
+              </w:rPr>
+            </w:pPr>
+            <w:r>
+              <w:rPr>
+                <w:rFonts w:ascii="BRH Devanagari Extra" w:hAnsi="BRH Devanagari Extra" w:cs="BRH Devanagari Extra"/>
+                <w:color w:val="000000"/>
+                <w:sz w:val="32"/>
+                <w:szCs w:val="32"/>
+              </w:rPr>
+              <w:t>kÉå</w:t>
+            </w:r>
+            <w:r>
+              <w:rPr>
+                <w:rFonts w:ascii="BRH Malayalam Extra" w:hAnsi="BRH Malayalam Extra" w:cs="BRH Devanagari Extra"/>
+                <w:color w:val="000000"/>
+                <w:szCs w:val="32"/>
+              </w:rPr>
+              <w:t>–</w:t>
+            </w:r>
+            <w:r>
+              <w:rPr>
+                <w:rFonts w:ascii="BRH Devanagari Extra" w:hAnsi="BRH Devanagari Extra" w:cs="BRH Devanagari Extra"/>
+                <w:color w:val="000000"/>
+                <w:sz w:val="32"/>
+                <w:szCs w:val="32"/>
+              </w:rPr>
+              <w:t>lÉÑ ÍqÉ</w:t>
+            </w:r>
+            <w:r>
+              <w:rPr>
+                <w:rFonts w:ascii="BRH Malayalam Extra" w:hAnsi="BRH Malayalam Extra" w:cs="BRH Devanagari Extra"/>
+                <w:color w:val="000000"/>
+                <w:szCs w:val="32"/>
+              </w:rPr>
+              <w:t>–</w:t>
+            </w:r>
+            <w:r>
+              <w:rPr>
+                <w:rFonts w:ascii="BRH Devanagari Extra" w:hAnsi="BRH Devanagari Extra" w:cs="BRH Devanagari Extra"/>
+                <w:color w:val="000000"/>
+                <w:sz w:val="32"/>
+                <w:szCs w:val="32"/>
+              </w:rPr>
+              <w:t>uÉ</w:t>
+            </w:r>
+            <w:r>
+              <w:rPr>
+                <w:rFonts w:ascii="BRH Devanagari Extra" w:hAnsi="BRH Devanagari Extra" w:cs="BRH Devanagari Extra"/>
+                <w:color w:val="000000"/>
+                <w:sz w:val="32"/>
+                <w:szCs w:val="32"/>
+                <w:highlight w:val="green"/>
+              </w:rPr>
+              <w:t>åuÉ</w:t>
+            </w:r>
+            <w:r>
+              <w:rPr>
+                <w:rFonts w:ascii="BRH Devanagari Extra" w:hAnsi="BRH Devanagari Extra" w:cs="BRH Devanagari Extra"/>
+                <w:color w:val="000000"/>
+                <w:sz w:val="32"/>
+                <w:szCs w:val="32"/>
+              </w:rPr>
+              <w:t>þ kÉå</w:t>
+            </w:r>
+            <w:r>
+              <w:rPr>
+                <w:rFonts w:ascii="BRH Malayalam Extra" w:hAnsi="BRH Malayalam Extra" w:cs="BRH Devanagari Extra"/>
+                <w:color w:val="000000"/>
+                <w:szCs w:val="32"/>
+              </w:rPr>
+              <w:t>–</w:t>
+            </w:r>
+            <w:r>
+              <w:rPr>
+                <w:rFonts w:ascii="BRH Devanagari Extra" w:hAnsi="BRH Devanagari Extra" w:cs="BRH Devanagari Extra"/>
+                <w:color w:val="000000"/>
+                <w:sz w:val="32"/>
+                <w:szCs w:val="32"/>
+              </w:rPr>
+              <w:t>lÉÑqÉç kÉå</w:t>
+            </w:r>
+            <w:r>
+              <w:rPr>
+                <w:rFonts w:ascii="BRH Malayalam Extra" w:hAnsi="BRH Malayalam Extra" w:cs="BRH Devanagari Extra"/>
+                <w:color w:val="000000"/>
+                <w:szCs w:val="32"/>
+              </w:rPr>
+              <w:t>–</w:t>
+            </w:r>
+            <w:r>
+              <w:rPr>
+                <w:rFonts w:ascii="BRH Devanagari Extra" w:hAnsi="BRH Devanagari Extra" w:cs="BRH Devanagari Extra"/>
+                <w:color w:val="000000"/>
+                <w:sz w:val="32"/>
+                <w:szCs w:val="32"/>
+              </w:rPr>
+              <w:t xml:space="preserve">lÉÑ </w:t>
+            </w:r>
+            <w:r>
+              <w:rPr>
+                <w:rFonts w:ascii="BRH Devanagari Extra" w:hAnsi="BRH Devanagari Extra" w:cs="BRH Devanagari Extra"/>
+                <w:color w:val="000000"/>
+                <w:sz w:val="32"/>
+                <w:szCs w:val="32"/>
+                <w:highlight w:val="green"/>
+              </w:rPr>
+              <w:t>ÍqÉ</w:t>
+            </w:r>
+            <w:r>
+              <w:rPr>
+                <w:rFonts w:ascii="BRH Devanagari Extra" w:hAnsi="BRH Devanagari Extra" w:cs="BRH Devanagari Extra"/>
+                <w:color w:val="000000"/>
+                <w:sz w:val="32"/>
+                <w:szCs w:val="32"/>
+              </w:rPr>
+              <w:t xml:space="preserve">þuÉ | </w:t>
+            </w:r>
+          </w:p>
+          <w:p>
+            <w:pPr>
+              <w:widowControl w:val="0"/>
+              <w:autoSpaceDE w:val="0"/>
+              <w:autoSpaceDN w:val="0"/>
+              <w:adjustRightInd w:val="0"/>
+              <w:spacing w:before="0" w:line="240" w:lineRule="auto"/>
+              <w:rPr>
+                <w:rFonts w:ascii="BRH Devanagari Extra" w:hAnsi="BRH Devanagari Extra" w:cs="BRH Devanagari Extra"/>
+                <w:color w:val="000000"/>
+                <w:sz w:val="32"/>
+                <w:szCs w:val="32"/>
+              </w:rPr>
+            </w:pPr>
+            <w:r>
+              <w:rPr>
+                <w:rFonts w:ascii="BRH Devanagari Extra" w:hAnsi="BRH Devanagari Extra" w:cs="BRH Devanagari Extra"/>
+                <w:color w:val="000000"/>
+                <w:sz w:val="32"/>
+                <w:szCs w:val="32"/>
+              </w:rPr>
+              <w:t>(</w:t>
+            </w:r>
+            <w:r>
+              <w:rPr>
+                <w:rFonts w:cs="BRH Devanagari Extra"/>
+                <w:color w:val="000000"/>
+                <w:szCs w:val="32"/>
+              </w:rPr>
+              <w:t>3</w:t>
+            </w:r>
+            <w:r>
+              <w:rPr>
+                <w:rFonts w:ascii="BRH Devanagari Extra" w:hAnsi="BRH Devanagari Extra" w:cs="BRH Devanagari Extra"/>
+                <w:color w:val="000000"/>
+                <w:sz w:val="32"/>
+                <w:szCs w:val="32"/>
+              </w:rPr>
+              <w:t>)</w:t>
+            </w:r>
+            <w:r>
+              <w:rPr>
+                <w:rFonts w:cs="BRH Devanagari Extra"/>
+                <w:color w:val="000000"/>
+                <w:szCs w:val="32"/>
+              </w:rPr>
+              <w:t>[P11</w:t>
+            </w:r>
+            <w:r>
+              <w:rPr>
+                <w:rFonts w:ascii="BRH Devanagari Extra" w:hAnsi="BRH Devanagari Extra" w:cs="BRH Devanagari Extra"/>
+                <w:color w:val="000000"/>
+                <w:sz w:val="32"/>
+                <w:szCs w:val="32"/>
+              </w:rPr>
+              <w:t xml:space="preserve">] </w:t>
+            </w:r>
+            <w:r>
+              <w:rPr>
+                <w:rFonts w:cs="BRH Devanagari Extra"/>
+                <w:color w:val="000000"/>
+                <w:szCs w:val="32"/>
+              </w:rPr>
+              <w:t>4</w:t>
+            </w:r>
+            <w:r>
+              <w:rPr>
+                <w:rFonts w:ascii="BRH Devanagari Extra" w:hAnsi="BRH Devanagari Extra" w:cs="BRH Devanagari Extra"/>
+                <w:color w:val="000000"/>
+                <w:sz w:val="32"/>
+                <w:szCs w:val="32"/>
+              </w:rPr>
+              <w:t>.</w:t>
+            </w:r>
+            <w:r>
+              <w:rPr>
+                <w:rFonts w:cs="BRH Devanagari Extra"/>
+                <w:color w:val="000000"/>
+                <w:szCs w:val="32"/>
+              </w:rPr>
+              <w:t>4</w:t>
+            </w:r>
+            <w:r>
+              <w:rPr>
+                <w:rFonts w:ascii="BRH Devanagari Extra" w:hAnsi="BRH Devanagari Extra" w:cs="BRH Devanagari Extra"/>
+                <w:color w:val="000000"/>
+                <w:sz w:val="32"/>
+                <w:szCs w:val="32"/>
+              </w:rPr>
+              <w:t>.</w:t>
+            </w:r>
+            <w:r>
+              <w:rPr>
+                <w:rFonts w:cs="BRH Devanagari Extra"/>
+                <w:color w:val="000000"/>
+                <w:szCs w:val="32"/>
+              </w:rPr>
+              <w:t>4</w:t>
+            </w:r>
+            <w:r>
+              <w:rPr>
+                <w:rFonts w:ascii="BRH Devanagari Extra" w:hAnsi="BRH Devanagari Extra" w:cs="BRH Devanagari Extra"/>
+                <w:color w:val="000000"/>
+                <w:sz w:val="32"/>
+                <w:szCs w:val="32"/>
+              </w:rPr>
+              <w:t>.</w:t>
+            </w:r>
+            <w:r>
+              <w:rPr>
+                <w:rFonts w:cs="BRH Devanagari Extra"/>
+                <w:color w:val="000000"/>
+                <w:szCs w:val="32"/>
+              </w:rPr>
+              <w:t>2</w:t>
+            </w:r>
+            <w:r>
+              <w:rPr>
+                <w:rFonts w:ascii="BRH Devanagari Extra" w:hAnsi="BRH Devanagari Extra" w:cs="BRH Devanagari Extra"/>
+                <w:color w:val="000000"/>
+                <w:sz w:val="32"/>
+                <w:szCs w:val="32"/>
+              </w:rPr>
+              <w:t>(</w:t>
+            </w:r>
+            <w:r>
+              <w:rPr>
+                <w:rFonts w:cs="BRH Devanagari Extra"/>
+                <w:color w:val="000000"/>
+                <w:szCs w:val="32"/>
+              </w:rPr>
+              <w:t>3</w:t>
+            </w:r>
+            <w:r>
+              <w:rPr>
+                <w:rFonts w:ascii="BRH Devanagari Extra" w:hAnsi="BRH Devanagari Extra" w:cs="BRH Devanagari Extra"/>
+                <w:color w:val="000000"/>
+                <w:sz w:val="32"/>
+                <w:szCs w:val="32"/>
+              </w:rPr>
+              <w:t>)-  C</w:t>
+            </w:r>
+            <w:r>
+              <w:rPr>
+                <w:rFonts w:ascii="BRH Malayalam Extra" w:hAnsi="BRH Malayalam Extra" w:cs="BRH Devanagari Extra"/>
+                <w:color w:val="000000"/>
+                <w:szCs w:val="32"/>
+                <w:highlight w:val="yellow"/>
+              </w:rPr>
+              <w:t>–</w:t>
+            </w:r>
+            <w:r>
+              <w:rPr>
+                <w:rFonts w:ascii="BRH Devanagari Extra" w:hAnsi="BRH Devanagari Extra" w:cs="BRH Devanagari Extra"/>
+                <w:color w:val="000000"/>
+                <w:sz w:val="32"/>
+                <w:szCs w:val="32"/>
+                <w:highlight w:val="green"/>
+              </w:rPr>
+              <w:t>uÉ</w:t>
+            </w:r>
+            <w:r>
+              <w:rPr>
+                <w:rFonts w:ascii="BRH Malayalam Extra" w:hAnsi="BRH Malayalam Extra" w:cs="BRH Devanagari Extra"/>
+                <w:color w:val="000000"/>
+                <w:szCs w:val="32"/>
+                <w:highlight w:val="green"/>
+              </w:rPr>
+              <w:t>–</w:t>
+            </w:r>
+            <w:r>
+              <w:rPr>
+                <w:rFonts w:ascii="BRH Devanagari Extra" w:hAnsi="BRH Devanagari Extra" w:cs="BRH Devanagari Extra"/>
+                <w:color w:val="000000"/>
+                <w:sz w:val="32"/>
+                <w:szCs w:val="32"/>
+              </w:rPr>
+              <w:t xml:space="preserve"> | AÉ</w:t>
+            </w:r>
+            <w:r>
+              <w:rPr>
+                <w:rFonts w:ascii="BRH Malayalam Extra" w:hAnsi="BRH Malayalam Extra" w:cs="BRH Devanagari Extra"/>
+                <w:color w:val="000000"/>
+                <w:szCs w:val="32"/>
+              </w:rPr>
+              <w:t>–</w:t>
+            </w:r>
+            <w:r>
+              <w:rPr>
+                <w:rFonts w:ascii="BRH Devanagari Extra" w:hAnsi="BRH Devanagari Extra" w:cs="BRH Devanagari Extra"/>
+                <w:color w:val="000000"/>
+                <w:sz w:val="32"/>
+                <w:szCs w:val="32"/>
+              </w:rPr>
+              <w:t>rÉ</w:t>
+            </w:r>
+            <w:r>
+              <w:rPr>
+                <w:rFonts w:ascii="BRH Malayalam Extra" w:hAnsi="BRH Malayalam Extra" w:cs="BRH Devanagari Extra"/>
+                <w:color w:val="000000"/>
+                <w:szCs w:val="32"/>
+              </w:rPr>
+              <w:t>–</w:t>
+            </w:r>
+            <w:r>
+              <w:rPr>
+                <w:rFonts w:ascii="BRH Devanagari Extra" w:hAnsi="BRH Devanagari Extra" w:cs="BRH Devanagari Extra"/>
+                <w:color w:val="000000"/>
+                <w:sz w:val="32"/>
+                <w:szCs w:val="32"/>
+              </w:rPr>
+              <w:t>iÉÏqÉç |</w:t>
+            </w:r>
+          </w:p>
+          <w:p>
+            <w:pPr>
+              <w:widowControl w:val="0"/>
+              <w:autoSpaceDE w:val="0"/>
+              <w:autoSpaceDN w:val="0"/>
+              <w:adjustRightInd w:val="0"/>
+              <w:spacing w:before="0" w:line="240" w:lineRule="auto"/>
+              <w:rPr>
+                <w:rFonts w:ascii="BRH Devanagari Extra" w:hAnsi="BRH Devanagari Extra" w:cs="BRH Devanagari Extra"/>
+                <w:color w:val="000000"/>
+                <w:sz w:val="32"/>
+                <w:szCs w:val="32"/>
+              </w:rPr>
+            </w:pPr>
+            <w:r>
+              <w:rPr>
+                <w:rFonts w:ascii="BRH Devanagari Extra" w:hAnsi="BRH Devanagari Extra" w:cs="BRH Devanagari Extra"/>
+                <w:color w:val="000000"/>
+                <w:sz w:val="32"/>
+                <w:szCs w:val="32"/>
+              </w:rPr>
+              <w:t>C</w:t>
+            </w:r>
+            <w:r>
+              <w:rPr>
+                <w:rFonts w:ascii="BRH Malayalam Extra" w:hAnsi="BRH Malayalam Extra" w:cs="BRH Devanagari Extra"/>
+                <w:color w:val="000000"/>
+                <w:szCs w:val="32"/>
+                <w:highlight w:val="yellow"/>
+              </w:rPr>
+              <w:t>–</w:t>
+            </w:r>
+            <w:r>
+              <w:rPr>
+                <w:rFonts w:ascii="BRH Devanagari Extra" w:hAnsi="BRH Devanagari Extra" w:cs="BRH Devanagari Extra"/>
+                <w:color w:val="000000"/>
+                <w:sz w:val="32"/>
+                <w:szCs w:val="32"/>
+                <w:highlight w:val="green"/>
+              </w:rPr>
+              <w:t>uÉÉ</w:t>
+            </w:r>
+            <w:r>
+              <w:rPr>
+                <w:rFonts w:ascii="BRH Malayalam Extra" w:hAnsi="BRH Malayalam Extra" w:cs="BRH Devanagari Extra"/>
+                <w:color w:val="000000"/>
+                <w:szCs w:val="32"/>
+              </w:rPr>
+              <w:t>–</w:t>
+            </w:r>
+            <w:r>
+              <w:rPr>
+                <w:rFonts w:ascii="BRH Devanagari Extra" w:hAnsi="BRH Devanagari Extra" w:cs="BRH Devanagari Extra"/>
+                <w:color w:val="000000"/>
+                <w:sz w:val="32"/>
+                <w:szCs w:val="32"/>
+              </w:rPr>
+              <w:t>rÉ</w:t>
+            </w:r>
+            <w:r>
+              <w:rPr>
+                <w:rFonts w:ascii="BRH Malayalam Extra" w:hAnsi="BRH Malayalam Extra" w:cs="BRH Devanagari Extra"/>
+                <w:color w:val="000000"/>
+                <w:szCs w:val="32"/>
+              </w:rPr>
+              <w:t>–</w:t>
+            </w:r>
+            <w:r>
+              <w:rPr>
+                <w:rFonts w:ascii="BRH Devanagari Extra" w:hAnsi="BRH Devanagari Extra" w:cs="BRH Devanagari Extra"/>
+                <w:color w:val="000000"/>
+                <w:sz w:val="32"/>
+                <w:szCs w:val="32"/>
+              </w:rPr>
+              <w:t>iÉÏ qÉÉþrÉ</w:t>
+            </w:r>
+            <w:r>
+              <w:rPr>
+                <w:rFonts w:ascii="BRH Malayalam Extra" w:hAnsi="BRH Malayalam Extra" w:cs="BRH Devanagari Extra"/>
+                <w:color w:val="000000"/>
+                <w:szCs w:val="32"/>
+              </w:rPr>
+              <w:t>–</w:t>
+            </w:r>
+            <w:r>
+              <w:rPr>
+                <w:rFonts w:ascii="BRH Devanagari Extra" w:hAnsi="BRH Devanagari Extra" w:cs="BRH Devanagari Extra"/>
+                <w:color w:val="000000"/>
+                <w:sz w:val="32"/>
+                <w:szCs w:val="32"/>
+              </w:rPr>
+              <w:t xml:space="preserve">iÉÏ </w:t>
+            </w:r>
+            <w:r>
+              <w:rPr>
+                <w:rFonts w:ascii="BRH Devanagari Extra" w:hAnsi="BRH Devanagari Extra" w:cs="BRH Devanagari Extra"/>
+                <w:color w:val="000000"/>
+                <w:sz w:val="32"/>
+                <w:szCs w:val="32"/>
+                <w:highlight w:val="green"/>
+              </w:rPr>
+              <w:t>ÍqÉ</w:t>
+            </w:r>
+            <w:r>
+              <w:rPr>
+                <w:rFonts w:ascii="BRH Devanagari Extra" w:hAnsi="BRH Devanagari Extra" w:cs="BRH Devanagari Extra"/>
+                <w:color w:val="000000"/>
+                <w:sz w:val="32"/>
+                <w:szCs w:val="32"/>
+              </w:rPr>
+              <w:t>þuÉåuÉÉ rÉ</w:t>
+            </w:r>
+            <w:r>
+              <w:rPr>
+                <w:rFonts w:ascii="BRH Malayalam Extra" w:hAnsi="BRH Malayalam Extra" w:cs="BRH Devanagari Extra"/>
+                <w:color w:val="000000"/>
+                <w:szCs w:val="32"/>
+              </w:rPr>
+              <w:t>–</w:t>
+            </w:r>
+            <w:r>
+              <w:rPr>
+                <w:rFonts w:ascii="BRH Devanagari Extra" w:hAnsi="BRH Devanagari Extra" w:cs="BRH Devanagari Extra"/>
+                <w:color w:val="000000"/>
+                <w:sz w:val="32"/>
+                <w:szCs w:val="32"/>
+              </w:rPr>
+              <w:t xml:space="preserve">iÉÏqÉç | </w:t>
+            </w:r>
+          </w:p>
+          <w:p>
+            <w:pPr>
+              <w:widowControl w:val="0"/>
+              <w:autoSpaceDE w:val="0"/>
+              <w:autoSpaceDN w:val="0"/>
+              <w:adjustRightInd w:val="0"/>
+              <w:spacing w:before="0" w:line="240" w:lineRule="auto"/>
+              <w:rPr>
+                <w:rFonts w:cs="BRH Malayalam Extra"/>
+                <w:color w:val="FF0000"/>
+                <w:szCs w:val="40"/>
+              </w:rPr>
+            </w:pPr>
+          </w:p>
+        </w:tc>
+      </w:tr>
+      <w:tr>
+        <w:trPr>
+          <w:trHeight w:val="899"/>
+        </w:trPr>
+        <w:tc>
+          <w:tcPr>
+            <w:tcW w:w="7166" w:type="dxa"/>
+            <w:tcBorders>
+              <w:top w:val="single" w:sz="4" w:space="0" w:color="000000"/>
+              <w:left w:val="single" w:sz="4" w:space="0" w:color="000000"/>
+              <w:bottom w:val="single" w:sz="4" w:space="0" w:color="000000"/>
+              <w:right w:val="single" w:sz="4" w:space="0" w:color="000000"/>
+            </w:tcBorders>
+          </w:tcPr>
+          <w:p>
+            <w:pPr>
+              <w:widowControl w:val="0"/>
+              <w:autoSpaceDE w:val="0"/>
+              <w:autoSpaceDN w:val="0"/>
+              <w:adjustRightInd w:val="0"/>
+              <w:spacing w:before="0" w:line="240" w:lineRule="auto"/>
+              <w:rPr>
+                <w:rFonts w:ascii="BRH Devanagari Extra" w:hAnsi="BRH Devanagari Extra" w:cs="BRH Devanagari Extra"/>
+                <w:color w:val="000000"/>
+                <w:sz w:val="32"/>
+                <w:szCs w:val="32"/>
+              </w:rPr>
+            </w:pPr>
+            <w:r>
+              <w:rPr>
+                <w:rFonts w:ascii="BRH Devanagari Extra" w:hAnsi="BRH Devanagari Extra" w:cs="BRH Devanagari Extra"/>
+                <w:color w:val="000000"/>
+                <w:sz w:val="32"/>
+                <w:szCs w:val="32"/>
+              </w:rPr>
+              <w:t>(</w:t>
+            </w:r>
+            <w:r>
+              <w:rPr>
+                <w:rFonts w:cs="BRH Devanagari Extra"/>
+                <w:color w:val="000000"/>
+                <w:szCs w:val="32"/>
+              </w:rPr>
+              <w:t>34</w:t>
+            </w:r>
+            <w:r>
+              <w:rPr>
+                <w:rFonts w:ascii="BRH Devanagari Extra" w:hAnsi="BRH Devanagari Extra" w:cs="BRH Devanagari Extra"/>
+                <w:color w:val="000000"/>
+                <w:sz w:val="32"/>
+                <w:szCs w:val="32"/>
+              </w:rPr>
+              <w:t>)</w:t>
+            </w:r>
+            <w:r>
+              <w:rPr>
+                <w:rFonts w:cs="BRH Devanagari Extra"/>
+                <w:color w:val="000000"/>
+                <w:szCs w:val="32"/>
+              </w:rPr>
+              <w:t>[P15</w:t>
+            </w:r>
+            <w:r>
+              <w:rPr>
+                <w:rFonts w:ascii="BRH Devanagari Extra" w:hAnsi="BRH Devanagari Extra" w:cs="BRH Devanagari Extra"/>
+                <w:color w:val="000000"/>
+                <w:sz w:val="32"/>
+                <w:szCs w:val="32"/>
+              </w:rPr>
+              <w:t xml:space="preserve">] </w:t>
+            </w:r>
+            <w:r>
+              <w:rPr>
+                <w:rFonts w:cs="BRH Devanagari Extra"/>
+                <w:color w:val="000000"/>
+                <w:szCs w:val="32"/>
+              </w:rPr>
+              <w:t>4</w:t>
+            </w:r>
+            <w:r>
+              <w:rPr>
+                <w:rFonts w:ascii="BRH Devanagari Extra" w:hAnsi="BRH Devanagari Extra" w:cs="BRH Devanagari Extra"/>
+                <w:color w:val="000000"/>
+                <w:sz w:val="32"/>
+                <w:szCs w:val="32"/>
+              </w:rPr>
+              <w:t>.</w:t>
+            </w:r>
+            <w:r>
+              <w:rPr>
+                <w:rFonts w:cs="BRH Devanagari Extra"/>
+                <w:color w:val="000000"/>
+                <w:szCs w:val="32"/>
+              </w:rPr>
+              <w:t>4</w:t>
+            </w:r>
+            <w:r>
+              <w:rPr>
+                <w:rFonts w:ascii="BRH Devanagari Extra" w:hAnsi="BRH Devanagari Extra" w:cs="BRH Devanagari Extra"/>
+                <w:color w:val="000000"/>
+                <w:sz w:val="32"/>
+                <w:szCs w:val="32"/>
+              </w:rPr>
+              <w:t>.</w:t>
+            </w:r>
+            <w:r>
+              <w:rPr>
+                <w:rFonts w:cs="BRH Devanagari Extra"/>
+                <w:color w:val="000000"/>
+                <w:szCs w:val="32"/>
+              </w:rPr>
+              <w:t>4</w:t>
+            </w:r>
+            <w:r>
+              <w:rPr>
+                <w:rFonts w:ascii="BRH Devanagari Extra" w:hAnsi="BRH Devanagari Extra" w:cs="BRH Devanagari Extra"/>
+                <w:color w:val="000000"/>
+                <w:sz w:val="32"/>
+                <w:szCs w:val="32"/>
+              </w:rPr>
+              <w:t>.</w:t>
+            </w:r>
+            <w:r>
+              <w:rPr>
+                <w:rFonts w:cs="BRH Devanagari Extra"/>
+                <w:color w:val="000000"/>
+                <w:szCs w:val="32"/>
+              </w:rPr>
+              <w:t>6</w:t>
+            </w:r>
+            <w:r>
+              <w:rPr>
+                <w:rFonts w:ascii="BRH Devanagari Extra" w:hAnsi="BRH Devanagari Extra" w:cs="BRH Devanagari Extra"/>
+                <w:color w:val="000000"/>
+                <w:sz w:val="32"/>
+                <w:szCs w:val="32"/>
+              </w:rPr>
+              <w:t>(</w:t>
+            </w:r>
+            <w:r>
+              <w:rPr>
+                <w:rFonts w:cs="BRH Devanagari Extra"/>
+                <w:color w:val="000000"/>
+                <w:szCs w:val="32"/>
+              </w:rPr>
+              <w:t>31</w:t>
+            </w:r>
+            <w:r>
+              <w:rPr>
+                <w:rFonts w:ascii="BRH Devanagari Extra" w:hAnsi="BRH Devanagari Extra" w:cs="BRH Devanagari Extra"/>
+                <w:color w:val="000000"/>
+                <w:sz w:val="32"/>
+                <w:szCs w:val="32"/>
+              </w:rPr>
+              <w:t>)-  xÉ</w:t>
+            </w:r>
+            <w:r>
+              <w:rPr>
+                <w:rFonts w:ascii="BRH Devanagari Extra" w:hAnsi="BRH Devanagari Extra" w:cs="BRH Devanagari Extra"/>
+                <w:color w:val="000000"/>
+                <w:sz w:val="32"/>
+                <w:szCs w:val="32"/>
+                <w:highlight w:val="yellow"/>
+              </w:rPr>
+              <w:t>Ñ¶É</w:t>
+            </w:r>
+            <w:r>
+              <w:rPr>
+                <w:rFonts w:ascii="BRH Malayalam Extra" w:hAnsi="BRH Malayalam Extra" w:cs="BRH Devanagari Extra"/>
+                <w:color w:val="000000"/>
+                <w:szCs w:val="32"/>
+                <w:highlight w:val="yellow"/>
+              </w:rPr>
+              <w:t>–</w:t>
+            </w:r>
+            <w:r>
+              <w:rPr>
+                <w:rFonts w:ascii="BRH Devanagari Extra" w:hAnsi="BRH Devanagari Extra" w:cs="BRH Devanagari Extra"/>
+                <w:color w:val="000000"/>
+                <w:sz w:val="32"/>
+                <w:szCs w:val="32"/>
+                <w:highlight w:val="yellow"/>
+              </w:rPr>
+              <w:t>lSì</w:t>
+            </w:r>
+            <w:r>
+              <w:rPr>
+                <w:rFonts w:ascii="BRH Malayalam Extra" w:hAnsi="BRH Malayalam Extra" w:cs="BRH Devanagari Extra"/>
+                <w:color w:val="000000"/>
+                <w:szCs w:val="32"/>
+                <w:highlight w:val="yellow"/>
+              </w:rPr>
+              <w:t>–</w:t>
+            </w:r>
+            <w:r>
+              <w:rPr>
+                <w:rFonts w:ascii="BRH Devanagari Extra" w:hAnsi="BRH Devanagari Extra" w:cs="BRH Devanagari Extra"/>
+                <w:color w:val="000000"/>
+                <w:sz w:val="32"/>
+                <w:szCs w:val="32"/>
+              </w:rPr>
+              <w:t xml:space="preserve"> | SxqÉþ |</w:t>
+            </w:r>
+          </w:p>
+          <w:p>
+            <w:pPr>
+              <w:widowControl w:val="0"/>
+              <w:autoSpaceDE w:val="0"/>
+              <w:autoSpaceDN w:val="0"/>
+              <w:adjustRightInd w:val="0"/>
+              <w:spacing w:before="0" w:line="240" w:lineRule="auto"/>
+              <w:rPr>
+                <w:rFonts w:ascii="BRH Devanagari Extra" w:hAnsi="BRH Devanagari Extra" w:cs="BRH Devanagari Extra"/>
+                <w:color w:val="000000"/>
+                <w:sz w:val="32"/>
+                <w:szCs w:val="32"/>
+              </w:rPr>
+            </w:pPr>
+            <w:r>
+              <w:rPr>
+                <w:rFonts w:ascii="BRH Devanagari Extra" w:hAnsi="BRH Devanagari Extra" w:cs="BRH Devanagari Extra"/>
+                <w:color w:val="000000"/>
+                <w:sz w:val="32"/>
+                <w:szCs w:val="32"/>
+              </w:rPr>
+              <w:t>xÉÑ¶ÉþlSì</w:t>
+            </w:r>
+            <w:r>
+              <w:rPr>
+                <w:rFonts w:ascii="BRH Malayalam Extra" w:hAnsi="BRH Malayalam Extra" w:cs="BRH Devanagari Extra"/>
+                <w:color w:val="000000"/>
+                <w:szCs w:val="32"/>
+              </w:rPr>
+              <w:t>–</w:t>
+            </w:r>
+            <w:r>
+              <w:rPr>
+                <w:rFonts w:ascii="BRH Devanagari Extra" w:hAnsi="BRH Devanagari Extra" w:cs="BRH Devanagari Extra"/>
+                <w:color w:val="000000"/>
+                <w:sz w:val="32"/>
+                <w:szCs w:val="32"/>
+              </w:rPr>
+              <w:t xml:space="preserve"> SxqÉ</w:t>
+            </w:r>
+            <w:r>
+              <w:rPr>
+                <w:rFonts w:ascii="BRH Malayalam Extra" w:hAnsi="BRH Malayalam Extra" w:cs="BRH Devanagari Extra"/>
+                <w:color w:val="000000"/>
+                <w:szCs w:val="32"/>
+              </w:rPr>
+              <w:t>–</w:t>
+            </w:r>
+            <w:r>
+              <w:rPr>
+                <w:rFonts w:ascii="BRH Devanagari Extra" w:hAnsi="BRH Devanagari Extra" w:cs="BRH Devanagari Extra"/>
+                <w:color w:val="000000"/>
+                <w:sz w:val="32"/>
+                <w:szCs w:val="32"/>
+              </w:rPr>
+              <w:t xml:space="preserve"> SxqÉ</w:t>
+            </w:r>
+            <w:r>
+              <w:rPr>
+                <w:rFonts w:ascii="BRH Malayalam Extra" w:hAnsi="BRH Malayalam Extra" w:cs="BRH Devanagari Extra"/>
+                <w:color w:val="000000"/>
+                <w:szCs w:val="32"/>
+              </w:rPr>
+              <w:t>–</w:t>
+            </w:r>
+            <w:r>
+              <w:rPr>
+                <w:rFonts w:ascii="BRH Devanagari Extra" w:hAnsi="BRH Devanagari Extra" w:cs="BRH Devanagari Extra"/>
+                <w:color w:val="000000"/>
+                <w:sz w:val="32"/>
+                <w:szCs w:val="32"/>
+              </w:rPr>
+              <w:t xml:space="preserve"> xÉÑ¶ÉþlSì</w:t>
+            </w:r>
+            <w:r>
+              <w:rPr>
+                <w:rFonts w:ascii="BRH Malayalam Extra" w:hAnsi="BRH Malayalam Extra" w:cs="BRH Devanagari Extra"/>
+                <w:color w:val="000000"/>
+                <w:szCs w:val="32"/>
+              </w:rPr>
+              <w:t>–</w:t>
+            </w:r>
+            <w:r>
+              <w:rPr>
+                <w:rFonts w:ascii="BRH Devanagari Extra" w:hAnsi="BRH Devanagari Extra" w:cs="BRH Devanagari Extra"/>
+                <w:color w:val="000000"/>
+                <w:sz w:val="32"/>
+                <w:szCs w:val="32"/>
+              </w:rPr>
+              <w:t xml:space="preserve"> xÉÑ¶ÉþlSì</w:t>
+            </w:r>
+            <w:r>
+              <w:rPr>
+                <w:rFonts w:ascii="BRH Malayalam Extra" w:hAnsi="BRH Malayalam Extra" w:cs="BRH Devanagari Extra"/>
+                <w:color w:val="000000"/>
+                <w:szCs w:val="32"/>
+              </w:rPr>
+              <w:t>–</w:t>
+            </w:r>
+            <w:r>
+              <w:rPr>
+                <w:rFonts w:ascii="BRH Devanagari Extra" w:hAnsi="BRH Devanagari Extra" w:cs="BRH Devanagari Extra"/>
+                <w:color w:val="000000"/>
+                <w:sz w:val="32"/>
+                <w:szCs w:val="32"/>
+              </w:rPr>
+              <w:t xml:space="preserve"> SxqÉþ | </w:t>
+            </w:r>
+          </w:p>
+          <w:p>
+            <w:pPr>
+              <w:widowControl w:val="0"/>
+              <w:autoSpaceDE w:val="0"/>
+              <w:autoSpaceDN w:val="0"/>
+              <w:adjustRightInd w:val="0"/>
+              <w:spacing w:before="0" w:line="240" w:lineRule="auto"/>
+              <w:rPr>
+                <w:rFonts w:ascii="BRH Devanagari Extra" w:hAnsi="BRH Devanagari Extra" w:cs="BRH Devanagari Extra"/>
+                <w:color w:val="000000"/>
+                <w:sz w:val="32"/>
+                <w:szCs w:val="32"/>
+              </w:rPr>
+            </w:pPr>
+            <w:r>
+              <w:rPr>
+                <w:rFonts w:ascii="BRH Devanagari Extra" w:hAnsi="BRH Devanagari Extra" w:cs="BRH Devanagari Extra"/>
+                <w:color w:val="000000"/>
+                <w:sz w:val="32"/>
+                <w:szCs w:val="32"/>
+              </w:rPr>
+              <w:t>(</w:t>
+            </w:r>
+            <w:r>
+              <w:rPr>
+                <w:rFonts w:cs="BRH Devanagari Extra"/>
+                <w:color w:val="000000"/>
+                <w:szCs w:val="32"/>
+              </w:rPr>
+              <w:t>35</w:t>
+            </w:r>
+            <w:r>
+              <w:rPr>
+                <w:rFonts w:ascii="BRH Devanagari Extra" w:hAnsi="BRH Devanagari Extra" w:cs="BRH Devanagari Extra"/>
+                <w:color w:val="000000"/>
+                <w:sz w:val="32"/>
+                <w:szCs w:val="32"/>
+              </w:rPr>
+              <w:t>)</w:t>
+            </w:r>
+            <w:r>
+              <w:rPr>
+                <w:rFonts w:cs="BRH Devanagari Extra"/>
+                <w:color w:val="000000"/>
+                <w:szCs w:val="32"/>
+              </w:rPr>
+              <w:t>[P15</w:t>
+            </w:r>
+            <w:r>
+              <w:rPr>
+                <w:rFonts w:ascii="BRH Devanagari Extra" w:hAnsi="BRH Devanagari Extra" w:cs="BRH Devanagari Extra"/>
+                <w:color w:val="000000"/>
+                <w:sz w:val="32"/>
+                <w:szCs w:val="32"/>
+              </w:rPr>
+              <w:t xml:space="preserve">] </w:t>
+            </w:r>
+            <w:r>
+              <w:rPr>
+                <w:rFonts w:cs="BRH Devanagari Extra"/>
+                <w:color w:val="000000"/>
+                <w:szCs w:val="32"/>
+              </w:rPr>
+              <w:t>4</w:t>
+            </w:r>
+            <w:r>
+              <w:rPr>
+                <w:rFonts w:ascii="BRH Devanagari Extra" w:hAnsi="BRH Devanagari Extra" w:cs="BRH Devanagari Extra"/>
+                <w:color w:val="000000"/>
+                <w:sz w:val="32"/>
+                <w:szCs w:val="32"/>
+              </w:rPr>
+              <w:t>.</w:t>
+            </w:r>
+            <w:r>
+              <w:rPr>
+                <w:rFonts w:cs="BRH Devanagari Extra"/>
+                <w:color w:val="000000"/>
+                <w:szCs w:val="32"/>
+              </w:rPr>
+              <w:t>4</w:t>
+            </w:r>
+            <w:r>
+              <w:rPr>
+                <w:rFonts w:ascii="BRH Devanagari Extra" w:hAnsi="BRH Devanagari Extra" w:cs="BRH Devanagari Extra"/>
+                <w:color w:val="000000"/>
+                <w:sz w:val="32"/>
+                <w:szCs w:val="32"/>
+              </w:rPr>
+              <w:t>.</w:t>
+            </w:r>
+            <w:r>
+              <w:rPr>
+                <w:rFonts w:cs="BRH Devanagari Extra"/>
+                <w:color w:val="000000"/>
+                <w:szCs w:val="32"/>
+              </w:rPr>
+              <w:t>4</w:t>
+            </w:r>
+            <w:r>
+              <w:rPr>
+                <w:rFonts w:ascii="BRH Devanagari Extra" w:hAnsi="BRH Devanagari Extra" w:cs="BRH Devanagari Extra"/>
+                <w:color w:val="000000"/>
+                <w:sz w:val="32"/>
+                <w:szCs w:val="32"/>
+              </w:rPr>
+              <w:t>.</w:t>
+            </w:r>
+            <w:r>
+              <w:rPr>
+                <w:rFonts w:cs="BRH Devanagari Extra"/>
+                <w:color w:val="000000"/>
+                <w:szCs w:val="32"/>
+              </w:rPr>
+              <w:t>6</w:t>
+            </w:r>
+            <w:r>
+              <w:rPr>
+                <w:rFonts w:ascii="BRH Devanagari Extra" w:hAnsi="BRH Devanagari Extra" w:cs="BRH Devanagari Extra"/>
+                <w:color w:val="000000"/>
+                <w:sz w:val="32"/>
+                <w:szCs w:val="32"/>
+              </w:rPr>
+              <w:t>(</w:t>
+            </w:r>
+            <w:r>
+              <w:rPr>
+                <w:rFonts w:cs="BRH Devanagari Extra"/>
+                <w:color w:val="000000"/>
+                <w:szCs w:val="32"/>
+              </w:rPr>
+              <w:t>31</w:t>
+            </w:r>
+            <w:r>
+              <w:rPr>
+                <w:rFonts w:ascii="BRH Devanagari Extra" w:hAnsi="BRH Devanagari Extra" w:cs="BRH Devanagari Extra"/>
+                <w:color w:val="000000"/>
+                <w:sz w:val="32"/>
+                <w:szCs w:val="32"/>
+              </w:rPr>
+              <w:t>)-  xÉÑ</w:t>
+            </w:r>
+            <w:r>
+              <w:rPr>
+                <w:rFonts w:ascii="BRH Devanagari Extra" w:hAnsi="BRH Devanagari Extra" w:cs="BRH Devanagari Extra"/>
+                <w:color w:val="000000"/>
+                <w:sz w:val="32"/>
+                <w:szCs w:val="32"/>
+                <w:highlight w:val="yellow"/>
+              </w:rPr>
+              <w:t>¶É</w:t>
+            </w:r>
+            <w:r>
+              <w:rPr>
+                <w:rFonts w:ascii="BRH Malayalam Extra" w:hAnsi="BRH Malayalam Extra" w:cs="BRH Devanagari Extra"/>
+                <w:color w:val="000000"/>
+                <w:szCs w:val="32"/>
+              </w:rPr>
+              <w:t>–</w:t>
+            </w:r>
+            <w:r>
+              <w:rPr>
+                <w:rFonts w:ascii="BRH Devanagari Extra" w:hAnsi="BRH Devanagari Extra" w:cs="BRH Devanagari Extra"/>
+                <w:color w:val="000000"/>
+                <w:sz w:val="32"/>
+                <w:szCs w:val="32"/>
+                <w:highlight w:val="yellow"/>
+              </w:rPr>
+              <w:t>lS</w:t>
+            </w:r>
+            <w:r>
+              <w:rPr>
+                <w:rFonts w:ascii="BRH Devanagari Extra" w:hAnsi="BRH Devanagari Extra" w:cs="BRH Devanagari Extra"/>
+                <w:color w:val="000000"/>
+                <w:sz w:val="32"/>
+                <w:szCs w:val="32"/>
+              </w:rPr>
+              <w:t>ì</w:t>
+            </w:r>
+            <w:r>
+              <w:rPr>
+                <w:rFonts w:ascii="BRH Malayalam Extra" w:hAnsi="BRH Malayalam Extra" w:cs="BRH Devanagari Extra"/>
+                <w:color w:val="000000"/>
+                <w:szCs w:val="32"/>
+              </w:rPr>
+              <w:t>–</w:t>
+            </w:r>
+            <w:r>
+              <w:rPr>
+                <w:rFonts w:ascii="BRH Devanagari Extra" w:hAnsi="BRH Devanagari Extra" w:cs="BRH Devanagari Extra"/>
+                <w:color w:val="000000"/>
+                <w:sz w:val="32"/>
+                <w:szCs w:val="32"/>
+              </w:rPr>
+              <w:t xml:space="preserve"> |</w:t>
+            </w:r>
+          </w:p>
+          <w:p>
+            <w:pPr>
+              <w:widowControl w:val="0"/>
+              <w:autoSpaceDE w:val="0"/>
+              <w:autoSpaceDN w:val="0"/>
+              <w:adjustRightInd w:val="0"/>
+              <w:spacing w:before="0" w:line="240" w:lineRule="auto"/>
+              <w:rPr>
+                <w:rFonts w:cs="BRH Malayalam Extra"/>
+                <w:color w:val="FF0000"/>
+                <w:szCs w:val="40"/>
+              </w:rPr>
+            </w:pPr>
+            <w:r>
+              <w:rPr>
+                <w:rFonts w:ascii="BRH Devanagari Extra" w:hAnsi="BRH Devanagari Extra" w:cs="BRH Devanagari Extra"/>
+                <w:color w:val="000000"/>
+                <w:sz w:val="32"/>
+                <w:szCs w:val="32"/>
+              </w:rPr>
+              <w:t>xÉÑ¶É</w:t>
+            </w:r>
+            <w:r>
+              <w:rPr>
+                <w:rFonts w:ascii="BRH Malayalam Extra" w:hAnsi="BRH Malayalam Extra" w:cs="BRH Devanagari Extra"/>
+                <w:color w:val="000000"/>
+                <w:szCs w:val="32"/>
+              </w:rPr>
+              <w:t>–</w:t>
+            </w:r>
+            <w:r>
+              <w:rPr>
+                <w:rFonts w:ascii="BRH Devanagari Extra" w:hAnsi="BRH Devanagari Extra" w:cs="BRH Devanagari Extra"/>
+                <w:color w:val="000000"/>
+                <w:sz w:val="32"/>
+                <w:szCs w:val="32"/>
+              </w:rPr>
+              <w:t>lSìåÌiÉ</w:t>
+            </w:r>
+            <w:r>
+              <w:rPr>
+                <w:rFonts w:ascii="BRH Malayalam Extra" w:hAnsi="BRH Malayalam Extra" w:cs="BRH Devanagari Extra"/>
+                <w:color w:val="000000"/>
+                <w:szCs w:val="32"/>
+              </w:rPr>
+              <w:t>–</w:t>
+            </w:r>
+            <w:r>
+              <w:rPr>
+                <w:rFonts w:ascii="BRH Devanagari Extra" w:hAnsi="BRH Devanagari Extra" w:cs="BRH Devanagari Extra"/>
+                <w:color w:val="000000"/>
+                <w:sz w:val="32"/>
+                <w:szCs w:val="32"/>
+              </w:rPr>
+              <w:t xml:space="preserve"> xÉÑ - cÉ</w:t>
+            </w:r>
+            <w:r>
+              <w:rPr>
+                <w:rFonts w:ascii="BRH Malayalam Extra" w:hAnsi="BRH Malayalam Extra" w:cs="BRH Devanagari Extra"/>
+                <w:color w:val="000000"/>
+                <w:szCs w:val="32"/>
+              </w:rPr>
+              <w:t>–</w:t>
+            </w:r>
+            <w:r>
+              <w:rPr>
+                <w:rFonts w:ascii="BRH Devanagari Extra" w:hAnsi="BRH Devanagari Extra" w:cs="BRH Devanagari Extra"/>
+                <w:color w:val="000000"/>
+                <w:sz w:val="32"/>
+                <w:szCs w:val="32"/>
+              </w:rPr>
+              <w:t>lSì</w:t>
+            </w:r>
+            <w:r>
+              <w:rPr>
+                <w:rFonts w:ascii="BRH Malayalam Extra" w:hAnsi="BRH Malayalam Extra" w:cs="BRH Devanagari Extra"/>
+                <w:color w:val="000000"/>
+                <w:szCs w:val="32"/>
+              </w:rPr>
+              <w:t>–</w:t>
+            </w:r>
+            <w:r>
+              <w:rPr>
+                <w:rFonts w:ascii="BRH Devanagari Extra" w:hAnsi="BRH Devanagari Extra" w:cs="BRH Devanagari Extra"/>
+                <w:color w:val="000000"/>
+                <w:sz w:val="32"/>
+                <w:szCs w:val="32"/>
+              </w:rPr>
+              <w:t xml:space="preserve"> | </w:t>
+            </w:r>
+          </w:p>
+        </w:tc>
+        <w:tc>
+          <w:tcPr>
+            <w:tcW w:w="7371" w:type="dxa"/>
+            <w:tcBorders>
+              <w:top w:val="single" w:sz="4" w:space="0" w:color="000000"/>
+              <w:left w:val="single" w:sz="4" w:space="0" w:color="000000"/>
+              <w:bottom w:val="single" w:sz="4" w:space="0" w:color="000000"/>
+              <w:right w:val="single" w:sz="4" w:space="0" w:color="000000"/>
+            </w:tcBorders>
+          </w:tcPr>
+          <w:p>
+            <w:pPr>
+              <w:widowControl w:val="0"/>
+              <w:autoSpaceDE w:val="0"/>
+              <w:autoSpaceDN w:val="0"/>
+              <w:adjustRightInd w:val="0"/>
+              <w:spacing w:before="0" w:line="240" w:lineRule="auto"/>
+              <w:rPr>
+                <w:rFonts w:ascii="BRH Devanagari Extra" w:hAnsi="BRH Devanagari Extra" w:cs="BRH Devanagari Extra"/>
+                <w:color w:val="000000"/>
+                <w:sz w:val="32"/>
+                <w:szCs w:val="32"/>
+              </w:rPr>
+            </w:pPr>
+            <w:r>
+              <w:rPr>
+                <w:rFonts w:ascii="BRH Devanagari Extra" w:hAnsi="BRH Devanagari Extra" w:cs="BRH Devanagari Extra"/>
+                <w:color w:val="000000"/>
+                <w:sz w:val="32"/>
+                <w:szCs w:val="32"/>
+              </w:rPr>
+              <w:t>(</w:t>
+            </w:r>
+            <w:r>
+              <w:rPr>
+                <w:rFonts w:cs="BRH Devanagari Extra"/>
+                <w:color w:val="000000"/>
+                <w:szCs w:val="32"/>
+              </w:rPr>
+              <w:t>34</w:t>
+            </w:r>
+            <w:r>
+              <w:rPr>
+                <w:rFonts w:ascii="BRH Devanagari Extra" w:hAnsi="BRH Devanagari Extra" w:cs="BRH Devanagari Extra"/>
+                <w:color w:val="000000"/>
+                <w:sz w:val="32"/>
+                <w:szCs w:val="32"/>
+              </w:rPr>
+              <w:t>)</w:t>
+            </w:r>
+            <w:r>
+              <w:rPr>
+                <w:rFonts w:cs="BRH Devanagari Extra"/>
+                <w:color w:val="000000"/>
+                <w:szCs w:val="32"/>
+              </w:rPr>
+              <w:t>[P15</w:t>
+            </w:r>
+            <w:r>
+              <w:rPr>
+                <w:rFonts w:ascii="BRH Devanagari Extra" w:hAnsi="BRH Devanagari Extra" w:cs="BRH Devanagari Extra"/>
+                <w:color w:val="000000"/>
+                <w:sz w:val="32"/>
+                <w:szCs w:val="32"/>
+              </w:rPr>
+              <w:t xml:space="preserve">] </w:t>
+            </w:r>
+            <w:r>
+              <w:rPr>
+                <w:rFonts w:cs="BRH Devanagari Extra"/>
+                <w:color w:val="000000"/>
+                <w:szCs w:val="32"/>
+              </w:rPr>
+              <w:t>4</w:t>
+            </w:r>
+            <w:r>
+              <w:rPr>
+                <w:rFonts w:ascii="BRH Devanagari Extra" w:hAnsi="BRH Devanagari Extra" w:cs="BRH Devanagari Extra"/>
+                <w:color w:val="000000"/>
+                <w:sz w:val="32"/>
+                <w:szCs w:val="32"/>
+              </w:rPr>
+              <w:t>.</w:t>
+            </w:r>
+            <w:r>
+              <w:rPr>
+                <w:rFonts w:cs="BRH Devanagari Extra"/>
+                <w:color w:val="000000"/>
+                <w:szCs w:val="32"/>
+              </w:rPr>
+              <w:t>4</w:t>
+            </w:r>
+            <w:r>
+              <w:rPr>
+                <w:rFonts w:ascii="BRH Devanagari Extra" w:hAnsi="BRH Devanagari Extra" w:cs="BRH Devanagari Extra"/>
+                <w:color w:val="000000"/>
+                <w:sz w:val="32"/>
+                <w:szCs w:val="32"/>
+              </w:rPr>
+              <w:t>.</w:t>
+            </w:r>
+            <w:r>
+              <w:rPr>
+                <w:rFonts w:cs="BRH Devanagari Extra"/>
+                <w:color w:val="000000"/>
+                <w:szCs w:val="32"/>
+              </w:rPr>
+              <w:t>4</w:t>
+            </w:r>
+            <w:r>
+              <w:rPr>
+                <w:rFonts w:ascii="BRH Devanagari Extra" w:hAnsi="BRH Devanagari Extra" w:cs="BRH Devanagari Extra"/>
+                <w:color w:val="000000"/>
+                <w:sz w:val="32"/>
+                <w:szCs w:val="32"/>
+              </w:rPr>
+              <w:t>.</w:t>
+            </w:r>
+            <w:r>
+              <w:rPr>
+                <w:rFonts w:cs="BRH Devanagari Extra"/>
+                <w:color w:val="000000"/>
+                <w:szCs w:val="32"/>
+              </w:rPr>
+              <w:t>6</w:t>
+            </w:r>
+            <w:r>
+              <w:rPr>
+                <w:rFonts w:ascii="BRH Devanagari Extra" w:hAnsi="BRH Devanagari Extra" w:cs="BRH Devanagari Extra"/>
+                <w:color w:val="000000"/>
+                <w:sz w:val="32"/>
+                <w:szCs w:val="32"/>
+              </w:rPr>
+              <w:t>(</w:t>
+            </w:r>
+            <w:r>
+              <w:rPr>
+                <w:rFonts w:cs="BRH Devanagari Extra"/>
+                <w:color w:val="000000"/>
+                <w:szCs w:val="32"/>
+              </w:rPr>
+              <w:t>31</w:t>
+            </w:r>
+            <w:r>
+              <w:rPr>
+                <w:rFonts w:ascii="BRH Devanagari Extra" w:hAnsi="BRH Devanagari Extra" w:cs="BRH Devanagari Extra"/>
+                <w:color w:val="000000"/>
+                <w:sz w:val="32"/>
+                <w:szCs w:val="32"/>
+              </w:rPr>
+              <w:t>)-  xÉÑ</w:t>
+            </w:r>
+            <w:r>
+              <w:rPr>
+                <w:rFonts w:ascii="BRH Devanagari Extra" w:hAnsi="BRH Devanagari Extra" w:cs="BRH Devanagari Extra"/>
+                <w:color w:val="000000"/>
+                <w:sz w:val="32"/>
+                <w:szCs w:val="32"/>
+                <w:highlight w:val="green"/>
+              </w:rPr>
+              <w:t>¶É</w:t>
+            </w:r>
+            <w:r>
+              <w:rPr>
+                <w:rFonts w:ascii="BRH Devanagari Extra" w:hAnsi="BRH Devanagari Extra" w:cs="BRH Devanagari Extra"/>
+                <w:color w:val="000000"/>
+                <w:sz w:val="32"/>
+                <w:szCs w:val="32"/>
+              </w:rPr>
+              <w:t>þlSì | SxqÉþ |</w:t>
+            </w:r>
+          </w:p>
+          <w:p>
+            <w:pPr>
+              <w:widowControl w:val="0"/>
+              <w:autoSpaceDE w:val="0"/>
+              <w:autoSpaceDN w:val="0"/>
+              <w:adjustRightInd w:val="0"/>
+              <w:spacing w:before="0" w:line="240" w:lineRule="auto"/>
+              <w:rPr>
+                <w:rFonts w:ascii="BRH Devanagari Extra" w:hAnsi="BRH Devanagari Extra" w:cs="BRH Devanagari Extra"/>
+                <w:color w:val="000000"/>
+                <w:sz w:val="32"/>
+                <w:szCs w:val="32"/>
+              </w:rPr>
+            </w:pPr>
+            <w:r>
+              <w:rPr>
+                <w:rFonts w:ascii="BRH Devanagari Extra" w:hAnsi="BRH Devanagari Extra" w:cs="BRH Devanagari Extra"/>
+                <w:color w:val="000000"/>
+                <w:sz w:val="32"/>
+                <w:szCs w:val="32"/>
+              </w:rPr>
+              <w:t>xÉÑ¶ÉþlSì</w:t>
+            </w:r>
+            <w:r>
+              <w:rPr>
+                <w:rFonts w:ascii="BRH Malayalam Extra" w:hAnsi="BRH Malayalam Extra" w:cs="BRH Devanagari Extra"/>
+                <w:color w:val="000000"/>
+                <w:szCs w:val="32"/>
+              </w:rPr>
+              <w:t>–</w:t>
+            </w:r>
+            <w:r>
+              <w:rPr>
+                <w:rFonts w:ascii="BRH Devanagari Extra" w:hAnsi="BRH Devanagari Extra" w:cs="BRH Devanagari Extra"/>
+                <w:color w:val="000000"/>
+                <w:sz w:val="32"/>
+                <w:szCs w:val="32"/>
+              </w:rPr>
+              <w:t xml:space="preserve"> SxqÉ</w:t>
+            </w:r>
+            <w:r>
+              <w:rPr>
+                <w:rFonts w:ascii="BRH Malayalam Extra" w:hAnsi="BRH Malayalam Extra" w:cs="BRH Devanagari Extra"/>
+                <w:color w:val="000000"/>
+                <w:szCs w:val="32"/>
+              </w:rPr>
+              <w:t>–</w:t>
+            </w:r>
+            <w:r>
+              <w:rPr>
+                <w:rFonts w:ascii="BRH Devanagari Extra" w:hAnsi="BRH Devanagari Extra" w:cs="BRH Devanagari Extra"/>
+                <w:color w:val="000000"/>
+                <w:sz w:val="32"/>
+                <w:szCs w:val="32"/>
+              </w:rPr>
+              <w:t xml:space="preserve"> SxqÉ</w:t>
+            </w:r>
+            <w:r>
+              <w:rPr>
+                <w:rFonts w:ascii="BRH Malayalam Extra" w:hAnsi="BRH Malayalam Extra" w:cs="BRH Devanagari Extra"/>
+                <w:color w:val="000000"/>
+                <w:szCs w:val="32"/>
+              </w:rPr>
+              <w:t>–</w:t>
+            </w:r>
+            <w:r>
+              <w:rPr>
+                <w:rFonts w:ascii="BRH Devanagari Extra" w:hAnsi="BRH Devanagari Extra" w:cs="BRH Devanagari Extra"/>
+                <w:color w:val="000000"/>
+                <w:sz w:val="32"/>
+                <w:szCs w:val="32"/>
+              </w:rPr>
+              <w:t xml:space="preserve"> xÉÑ¶ÉþlSì</w:t>
+            </w:r>
+            <w:r>
+              <w:rPr>
+                <w:rFonts w:ascii="BRH Malayalam Extra" w:hAnsi="BRH Malayalam Extra" w:cs="BRH Devanagari Extra"/>
+                <w:color w:val="000000"/>
+                <w:szCs w:val="32"/>
+              </w:rPr>
+              <w:t>–</w:t>
+            </w:r>
+            <w:r>
+              <w:rPr>
+                <w:rFonts w:ascii="BRH Devanagari Extra" w:hAnsi="BRH Devanagari Extra" w:cs="BRH Devanagari Extra"/>
+                <w:color w:val="000000"/>
+                <w:sz w:val="32"/>
+                <w:szCs w:val="32"/>
+              </w:rPr>
+              <w:t xml:space="preserve"> xÉÑ¶ÉþlSì</w:t>
+            </w:r>
+            <w:r>
+              <w:rPr>
+                <w:rFonts w:ascii="BRH Malayalam Extra" w:hAnsi="BRH Malayalam Extra" w:cs="BRH Devanagari Extra"/>
+                <w:color w:val="000000"/>
+                <w:szCs w:val="32"/>
+              </w:rPr>
+              <w:t>–</w:t>
+            </w:r>
+            <w:r>
+              <w:rPr>
+                <w:rFonts w:ascii="BRH Devanagari Extra" w:hAnsi="BRH Devanagari Extra" w:cs="BRH Devanagari Extra"/>
+                <w:color w:val="000000"/>
+                <w:sz w:val="32"/>
+                <w:szCs w:val="32"/>
+              </w:rPr>
+              <w:t xml:space="preserve"> SxqÉþ | </w:t>
+            </w:r>
+          </w:p>
+          <w:p>
+            <w:pPr>
+              <w:widowControl w:val="0"/>
+              <w:autoSpaceDE w:val="0"/>
+              <w:autoSpaceDN w:val="0"/>
+              <w:adjustRightInd w:val="0"/>
+              <w:spacing w:before="0" w:line="240" w:lineRule="auto"/>
+              <w:rPr>
+                <w:rFonts w:ascii="BRH Devanagari Extra" w:hAnsi="BRH Devanagari Extra" w:cs="BRH Devanagari Extra"/>
+                <w:color w:val="000000"/>
+                <w:sz w:val="32"/>
+                <w:szCs w:val="32"/>
+              </w:rPr>
+            </w:pPr>
+            <w:r>
+              <w:rPr>
+                <w:rFonts w:ascii="BRH Devanagari Extra" w:hAnsi="BRH Devanagari Extra" w:cs="BRH Devanagari Extra"/>
+                <w:color w:val="000000"/>
+                <w:sz w:val="32"/>
+                <w:szCs w:val="32"/>
+              </w:rPr>
+              <w:t>(</w:t>
+            </w:r>
+            <w:r>
+              <w:rPr>
+                <w:rFonts w:cs="BRH Devanagari Extra"/>
+                <w:color w:val="000000"/>
+                <w:szCs w:val="32"/>
+              </w:rPr>
+              <w:t>35</w:t>
+            </w:r>
+            <w:r>
+              <w:rPr>
+                <w:rFonts w:ascii="BRH Devanagari Extra" w:hAnsi="BRH Devanagari Extra" w:cs="BRH Devanagari Extra"/>
+                <w:color w:val="000000"/>
+                <w:sz w:val="32"/>
+                <w:szCs w:val="32"/>
+              </w:rPr>
+              <w:t>)</w:t>
+            </w:r>
+            <w:r>
+              <w:rPr>
+                <w:rFonts w:cs="BRH Devanagari Extra"/>
+                <w:color w:val="000000"/>
+                <w:szCs w:val="32"/>
+              </w:rPr>
+              <w:t>[P15</w:t>
+            </w:r>
+            <w:r>
+              <w:rPr>
+                <w:rFonts w:ascii="BRH Devanagari Extra" w:hAnsi="BRH Devanagari Extra" w:cs="BRH Devanagari Extra"/>
+                <w:color w:val="000000"/>
+                <w:sz w:val="32"/>
+                <w:szCs w:val="32"/>
+              </w:rPr>
+              <w:t xml:space="preserve">] </w:t>
+            </w:r>
+            <w:r>
+              <w:rPr>
+                <w:rFonts w:cs="BRH Devanagari Extra"/>
+                <w:color w:val="000000"/>
+                <w:szCs w:val="32"/>
+              </w:rPr>
+              <w:t>4</w:t>
+            </w:r>
+            <w:r>
+              <w:rPr>
+                <w:rFonts w:ascii="BRH Devanagari Extra" w:hAnsi="BRH Devanagari Extra" w:cs="BRH Devanagari Extra"/>
+                <w:color w:val="000000"/>
+                <w:sz w:val="32"/>
+                <w:szCs w:val="32"/>
+              </w:rPr>
+              <w:t>.</w:t>
+            </w:r>
+            <w:r>
+              <w:rPr>
+                <w:rFonts w:cs="BRH Devanagari Extra"/>
+                <w:color w:val="000000"/>
+                <w:szCs w:val="32"/>
+              </w:rPr>
+              <w:t>4</w:t>
+            </w:r>
+            <w:r>
+              <w:rPr>
+                <w:rFonts w:ascii="BRH Devanagari Extra" w:hAnsi="BRH Devanagari Extra" w:cs="BRH Devanagari Extra"/>
+                <w:color w:val="000000"/>
+                <w:sz w:val="32"/>
+                <w:szCs w:val="32"/>
+              </w:rPr>
+              <w:t>.</w:t>
+            </w:r>
+            <w:r>
+              <w:rPr>
+                <w:rFonts w:cs="BRH Devanagari Extra"/>
+                <w:color w:val="000000"/>
+                <w:szCs w:val="32"/>
+              </w:rPr>
+              <w:t>4</w:t>
+            </w:r>
+            <w:r>
+              <w:rPr>
+                <w:rFonts w:ascii="BRH Devanagari Extra" w:hAnsi="BRH Devanagari Extra" w:cs="BRH Devanagari Extra"/>
+                <w:color w:val="000000"/>
+                <w:sz w:val="32"/>
+                <w:szCs w:val="32"/>
+              </w:rPr>
+              <w:t>.</w:t>
+            </w:r>
+            <w:r>
+              <w:rPr>
+                <w:rFonts w:cs="BRH Devanagari Extra"/>
+                <w:color w:val="000000"/>
+                <w:szCs w:val="32"/>
+              </w:rPr>
+              <w:t>6</w:t>
+            </w:r>
+            <w:r>
+              <w:rPr>
+                <w:rFonts w:ascii="BRH Devanagari Extra" w:hAnsi="BRH Devanagari Extra" w:cs="BRH Devanagari Extra"/>
+                <w:color w:val="000000"/>
+                <w:sz w:val="32"/>
+                <w:szCs w:val="32"/>
+              </w:rPr>
+              <w:t>(</w:t>
+            </w:r>
+            <w:r>
+              <w:rPr>
+                <w:rFonts w:cs="BRH Devanagari Extra"/>
+                <w:color w:val="000000"/>
+                <w:szCs w:val="32"/>
+              </w:rPr>
+              <w:t>31</w:t>
+            </w:r>
+            <w:r>
+              <w:rPr>
+                <w:rFonts w:ascii="BRH Devanagari Extra" w:hAnsi="BRH Devanagari Extra" w:cs="BRH Devanagari Extra"/>
+                <w:color w:val="000000"/>
+                <w:sz w:val="32"/>
+                <w:szCs w:val="32"/>
+              </w:rPr>
+              <w:t>)-  xÉÑ</w:t>
+            </w:r>
+            <w:r>
+              <w:rPr>
+                <w:rFonts w:ascii="BRH Devanagari Extra" w:hAnsi="BRH Devanagari Extra" w:cs="BRH Devanagari Extra"/>
+                <w:color w:val="000000"/>
+                <w:sz w:val="32"/>
+                <w:szCs w:val="32"/>
+                <w:highlight w:val="green"/>
+              </w:rPr>
+              <w:t>¶É</w:t>
+            </w:r>
+            <w:r>
+              <w:rPr>
+                <w:rFonts w:ascii="BRH Devanagari Extra" w:hAnsi="BRH Devanagari Extra" w:cs="BRH Devanagari Extra"/>
+                <w:color w:val="000000"/>
+                <w:sz w:val="32"/>
+                <w:szCs w:val="32"/>
+              </w:rPr>
+              <w:t>þlSì |</w:t>
+            </w:r>
+          </w:p>
+          <w:p>
+            <w:pPr>
+              <w:widowControl w:val="0"/>
+              <w:autoSpaceDE w:val="0"/>
+              <w:autoSpaceDN w:val="0"/>
+              <w:adjustRightInd w:val="0"/>
+              <w:spacing w:before="0" w:line="240" w:lineRule="auto"/>
+              <w:rPr>
+                <w:rFonts w:cs="BRH Malayalam Extra"/>
+                <w:color w:val="FF0000"/>
+                <w:szCs w:val="40"/>
+              </w:rPr>
+            </w:pPr>
+            <w:r>
+              <w:rPr>
+                <w:rFonts w:ascii="BRH Devanagari Extra" w:hAnsi="BRH Devanagari Extra" w:cs="BRH Devanagari Extra"/>
+                <w:color w:val="000000"/>
+                <w:sz w:val="32"/>
+                <w:szCs w:val="32"/>
+              </w:rPr>
+              <w:t>xÉÑ¶É</w:t>
+            </w:r>
+            <w:r>
+              <w:rPr>
+                <w:rFonts w:ascii="BRH Malayalam Extra" w:hAnsi="BRH Malayalam Extra" w:cs="BRH Devanagari Extra"/>
+                <w:color w:val="000000"/>
+                <w:szCs w:val="32"/>
+              </w:rPr>
+              <w:t>–</w:t>
+            </w:r>
+            <w:r>
+              <w:rPr>
+                <w:rFonts w:ascii="BRH Devanagari Extra" w:hAnsi="BRH Devanagari Extra" w:cs="BRH Devanagari Extra"/>
+                <w:color w:val="000000"/>
+                <w:sz w:val="32"/>
+                <w:szCs w:val="32"/>
+              </w:rPr>
+              <w:t>lSìåÌiÉ</w:t>
+            </w:r>
+            <w:r>
+              <w:rPr>
+                <w:rFonts w:ascii="BRH Malayalam Extra" w:hAnsi="BRH Malayalam Extra" w:cs="BRH Devanagari Extra"/>
+                <w:color w:val="000000"/>
+                <w:szCs w:val="32"/>
+              </w:rPr>
+              <w:t>–</w:t>
+            </w:r>
+            <w:r>
+              <w:rPr>
+                <w:rFonts w:ascii="BRH Devanagari Extra" w:hAnsi="BRH Devanagari Extra" w:cs="BRH Devanagari Extra"/>
+                <w:color w:val="000000"/>
+                <w:sz w:val="32"/>
+                <w:szCs w:val="32"/>
+              </w:rPr>
+              <w:t xml:space="preserve"> xÉÑ - cÉ</w:t>
+            </w:r>
+            <w:r>
+              <w:rPr>
+                <w:rFonts w:ascii="BRH Malayalam Extra" w:hAnsi="BRH Malayalam Extra" w:cs="BRH Devanagari Extra"/>
+                <w:color w:val="000000"/>
+                <w:szCs w:val="32"/>
+              </w:rPr>
+              <w:t>–</w:t>
+            </w:r>
+            <w:r>
+              <w:rPr>
+                <w:rFonts w:ascii="BRH Devanagari Extra" w:hAnsi="BRH Devanagari Extra" w:cs="BRH Devanagari Extra"/>
+                <w:color w:val="000000"/>
+                <w:sz w:val="32"/>
+                <w:szCs w:val="32"/>
+              </w:rPr>
+              <w:t>lSì</w:t>
+            </w:r>
+            <w:r>
+              <w:rPr>
+                <w:rFonts w:ascii="BRH Malayalam Extra" w:hAnsi="BRH Malayalam Extra" w:cs="BRH Devanagari Extra"/>
+                <w:color w:val="000000"/>
+                <w:szCs w:val="32"/>
+              </w:rPr>
+              <w:t>–</w:t>
+            </w:r>
+            <w:r>
+              <w:rPr>
+                <w:rFonts w:ascii="BRH Devanagari Extra" w:hAnsi="BRH Devanagari Extra" w:cs="BRH Devanagari Extra"/>
+                <w:color w:val="000000"/>
+                <w:sz w:val="32"/>
+                <w:szCs w:val="32"/>
+              </w:rPr>
+              <w:t xml:space="preserve"> | </w:t>
+            </w:r>
+          </w:p>
+        </w:tc>
+      </w:tr>
+      <w:tr>
+        <w:trPr>
+          <w:trHeight w:val="899"/>
+        </w:trPr>
+        <w:tc>
+          <w:tcPr>
+            <w:tcW w:w="7166" w:type="dxa"/>
+            <w:tcBorders>
+              <w:top w:val="single" w:sz="4" w:space="0" w:color="000000"/>
+              <w:left w:val="single" w:sz="4" w:space="0" w:color="000000"/>
+              <w:bottom w:val="single" w:sz="4" w:space="0" w:color="000000"/>
+              <w:right w:val="single" w:sz="4" w:space="0" w:color="000000"/>
+            </w:tcBorders>
+          </w:tcPr>
+          <w:p>
+            <w:pPr>
+              <w:widowControl w:val="0"/>
+              <w:autoSpaceDE w:val="0"/>
+              <w:autoSpaceDN w:val="0"/>
+              <w:adjustRightInd w:val="0"/>
+              <w:spacing w:before="0" w:line="240" w:lineRule="auto"/>
+              <w:rPr>
+                <w:rFonts w:ascii="BRH Devanagari Extra" w:hAnsi="BRH Devanagari Extra" w:cs="BRH Devanagari Extra"/>
+                <w:color w:val="000000"/>
+                <w:sz w:val="32"/>
+                <w:szCs w:val="32"/>
+                <w:lang w:val="it-IT"/>
+              </w:rPr>
+            </w:pPr>
+            <w:r>
+              <w:rPr>
+                <w:rFonts w:ascii="BRH Devanagari Extra" w:hAnsi="BRH Devanagari Extra" w:cs="BRH Devanagari Extra"/>
+                <w:color w:val="000000"/>
+                <w:sz w:val="32"/>
+                <w:szCs w:val="32"/>
+                <w:lang w:val="it-IT"/>
+              </w:rPr>
+              <w:t>(</w:t>
+            </w:r>
+            <w:r>
+              <w:rPr>
+                <w:rFonts w:cs="BRH Devanagari Extra"/>
+                <w:color w:val="000000"/>
+                <w:szCs w:val="32"/>
+                <w:lang w:val="it-IT"/>
+              </w:rPr>
+              <w:t>50</w:t>
+            </w:r>
+            <w:r>
+              <w:rPr>
+                <w:rFonts w:ascii="BRH Devanagari Extra" w:hAnsi="BRH Devanagari Extra" w:cs="BRH Devanagari Extra"/>
+                <w:color w:val="000000"/>
+                <w:sz w:val="32"/>
+                <w:szCs w:val="32"/>
+                <w:lang w:val="it-IT"/>
+              </w:rPr>
+              <w:t>)</w:t>
+            </w:r>
+            <w:r>
+              <w:rPr>
+                <w:rFonts w:cs="BRH Devanagari Extra"/>
+                <w:color w:val="000000"/>
+                <w:szCs w:val="32"/>
+                <w:lang w:val="it-IT"/>
+              </w:rPr>
+              <w:t>[P16</w:t>
+            </w:r>
+            <w:r>
+              <w:rPr>
+                <w:rFonts w:ascii="BRH Devanagari Extra" w:hAnsi="BRH Devanagari Extra" w:cs="BRH Devanagari Extra"/>
+                <w:color w:val="000000"/>
+                <w:sz w:val="32"/>
+                <w:szCs w:val="32"/>
+                <w:lang w:val="it-IT"/>
+              </w:rPr>
+              <w:t xml:space="preserve">] </w:t>
+            </w:r>
+            <w:r>
+              <w:rPr>
+                <w:rFonts w:cs="BRH Devanagari Extra"/>
+                <w:color w:val="000000"/>
+                <w:szCs w:val="32"/>
+                <w:lang w:val="it-IT"/>
+              </w:rPr>
+              <w:t>4</w:t>
+            </w:r>
+            <w:r>
+              <w:rPr>
+                <w:rFonts w:ascii="BRH Devanagari Extra" w:hAnsi="BRH Devanagari Extra" w:cs="BRH Devanagari Extra"/>
+                <w:color w:val="000000"/>
+                <w:sz w:val="32"/>
+                <w:szCs w:val="32"/>
+                <w:lang w:val="it-IT"/>
+              </w:rPr>
+              <w:t>.</w:t>
+            </w:r>
+            <w:r>
+              <w:rPr>
+                <w:rFonts w:cs="BRH Devanagari Extra"/>
+                <w:color w:val="000000"/>
+                <w:szCs w:val="32"/>
+                <w:lang w:val="it-IT"/>
+              </w:rPr>
+              <w:t>4</w:t>
+            </w:r>
+            <w:r>
+              <w:rPr>
+                <w:rFonts w:ascii="BRH Devanagari Extra" w:hAnsi="BRH Devanagari Extra" w:cs="BRH Devanagari Extra"/>
+                <w:color w:val="000000"/>
+                <w:sz w:val="32"/>
+                <w:szCs w:val="32"/>
+                <w:lang w:val="it-IT"/>
+              </w:rPr>
+              <w:t>.</w:t>
+            </w:r>
+            <w:r>
+              <w:rPr>
+                <w:rFonts w:cs="BRH Devanagari Extra"/>
+                <w:color w:val="000000"/>
+                <w:szCs w:val="32"/>
+                <w:lang w:val="it-IT"/>
+              </w:rPr>
+              <w:t>4</w:t>
+            </w:r>
+            <w:r>
+              <w:rPr>
+                <w:rFonts w:ascii="BRH Devanagari Extra" w:hAnsi="BRH Devanagari Extra" w:cs="BRH Devanagari Extra"/>
+                <w:color w:val="000000"/>
+                <w:sz w:val="32"/>
+                <w:szCs w:val="32"/>
+                <w:lang w:val="it-IT"/>
+              </w:rPr>
+              <w:t>.</w:t>
+            </w:r>
+            <w:r>
+              <w:rPr>
+                <w:rFonts w:cs="BRH Devanagari Extra"/>
+                <w:color w:val="000000"/>
+                <w:szCs w:val="32"/>
+                <w:lang w:val="it-IT"/>
+              </w:rPr>
+              <w:t>7</w:t>
+            </w:r>
+            <w:r>
+              <w:rPr>
+                <w:rFonts w:ascii="BRH Devanagari Extra" w:hAnsi="BRH Devanagari Extra" w:cs="BRH Devanagari Extra"/>
+                <w:color w:val="000000"/>
+                <w:sz w:val="32"/>
+                <w:szCs w:val="32"/>
+                <w:lang w:val="it-IT"/>
+              </w:rPr>
+              <w:t>(</w:t>
+            </w:r>
+            <w:r>
+              <w:rPr>
+                <w:rFonts w:cs="BRH Devanagari Extra"/>
+                <w:color w:val="000000"/>
+                <w:szCs w:val="32"/>
+                <w:lang w:val="it-IT"/>
+              </w:rPr>
+              <w:t>49</w:t>
+            </w:r>
+            <w:r>
+              <w:rPr>
+                <w:rFonts w:ascii="BRH Devanagari Extra" w:hAnsi="BRH Devanagari Extra" w:cs="BRH Devanagari Extra"/>
+                <w:color w:val="000000"/>
+                <w:sz w:val="32"/>
+                <w:szCs w:val="32"/>
+                <w:lang w:val="it-IT"/>
+              </w:rPr>
+              <w:t>)-  lÉ</w:t>
+            </w:r>
+            <w:r>
+              <w:rPr>
+                <w:rFonts w:ascii="BRH Malayalam Extra" w:hAnsi="BRH Malayalam Extra" w:cs="BRH Devanagari Extra"/>
+                <w:color w:val="000000"/>
+                <w:szCs w:val="32"/>
+                <w:lang w:val="it-IT"/>
+              </w:rPr>
+              <w:t>–</w:t>
+            </w:r>
+            <w:r>
+              <w:rPr>
+                <w:rFonts w:ascii="BRH Devanagari Extra" w:hAnsi="BRH Devanagari Extra" w:cs="BRH Devanagari Extra"/>
+                <w:color w:val="000000"/>
+                <w:sz w:val="32"/>
+                <w:szCs w:val="32"/>
+                <w:lang w:val="it-IT"/>
+              </w:rPr>
+              <w:t>È | A</w:t>
+            </w:r>
+            <w:r>
+              <w:rPr>
+                <w:rFonts w:ascii="BRH Malayalam Extra" w:hAnsi="BRH Malayalam Extra" w:cs="BRH Devanagari Extra"/>
+                <w:color w:val="000000"/>
+                <w:szCs w:val="32"/>
+                <w:lang w:val="it-IT"/>
+              </w:rPr>
+              <w:t>–</w:t>
+            </w:r>
+            <w:r>
+              <w:rPr>
+                <w:rFonts w:ascii="BRH Devanagari Extra" w:hAnsi="BRH Devanagari Extra" w:cs="BRH Devanagari Extra"/>
+                <w:color w:val="000000"/>
+                <w:sz w:val="32"/>
+                <w:szCs w:val="32"/>
+                <w:lang w:val="it-IT"/>
+              </w:rPr>
+              <w:t>uÉÉïXèû |</w:t>
+            </w:r>
+          </w:p>
+          <w:p>
+            <w:pPr>
+              <w:widowControl w:val="0"/>
+              <w:autoSpaceDE w:val="0"/>
+              <w:autoSpaceDN w:val="0"/>
+              <w:adjustRightInd w:val="0"/>
+              <w:spacing w:before="0" w:line="240" w:lineRule="auto"/>
+              <w:rPr>
+                <w:rFonts w:ascii="BRH Devanagari Extra" w:hAnsi="BRH Devanagari Extra" w:cs="BRH Devanagari Extra"/>
+                <w:color w:val="000000"/>
+                <w:sz w:val="32"/>
+                <w:szCs w:val="32"/>
+                <w:lang w:val="it-IT"/>
+              </w:rPr>
+            </w:pPr>
+            <w:r>
+              <w:rPr>
+                <w:rFonts w:ascii="BRH Devanagari Extra" w:hAnsi="BRH Devanagari Extra" w:cs="BRH Devanagari Extra"/>
+                <w:color w:val="000000"/>
+                <w:sz w:val="32"/>
+                <w:szCs w:val="32"/>
+                <w:lang w:val="it-IT"/>
+              </w:rPr>
+              <w:t>lÉÉå</w:t>
+            </w:r>
+            <w:r>
+              <w:rPr>
+                <w:rFonts w:ascii="BRH Malayalam Extra" w:hAnsi="BRH Malayalam Extra" w:cs="BRH Devanagari Extra"/>
+                <w:color w:val="000000"/>
+                <w:szCs w:val="32"/>
+                <w:lang w:val="it-IT"/>
+              </w:rPr>
+              <w:t>–</w:t>
+            </w:r>
+            <w:r>
+              <w:rPr>
+                <w:rFonts w:ascii="BRH Devanagari Extra" w:hAnsi="BRH Devanagari Extra" w:cs="BRH Devanagari Extra"/>
+                <w:color w:val="000000"/>
+                <w:sz w:val="32"/>
+                <w:szCs w:val="32"/>
+                <w:lang w:val="it-IT"/>
+              </w:rPr>
+              <w:t xml:space="preserve"> A</w:t>
+            </w:r>
+            <w:r>
+              <w:rPr>
+                <w:rFonts w:ascii="BRH Malayalam Extra" w:hAnsi="BRH Malayalam Extra" w:cs="BRH Devanagari Extra"/>
+                <w:color w:val="000000"/>
+                <w:szCs w:val="32"/>
+                <w:lang w:val="it-IT"/>
+              </w:rPr>
+              <w:t>–</w:t>
+            </w:r>
+            <w:r>
+              <w:rPr>
+                <w:rFonts w:ascii="BRH Devanagari Extra" w:hAnsi="BRH Devanagari Extra" w:cs="BRH Devanagari Extra"/>
+                <w:color w:val="000000"/>
+                <w:sz w:val="32"/>
+                <w:szCs w:val="32"/>
+                <w:lang w:val="it-IT"/>
+              </w:rPr>
+              <w:t>uÉÉï</w:t>
+            </w:r>
+            <w:r>
+              <w:rPr>
+                <w:rFonts w:ascii="BRH Devanagari Extra" w:hAnsi="BRH Devanagari Extra" w:cs="BRH Devanagari Extra"/>
+                <w:sz w:val="32"/>
+                <w:szCs w:val="32"/>
+                <w:highlight w:val="yellow"/>
+                <w:lang w:val="it-IT"/>
+              </w:rPr>
+              <w:t>Xèû X</w:t>
+            </w:r>
+            <w:r>
+              <w:rPr>
+                <w:rFonts w:ascii="BRH Devanagari Extra" w:hAnsi="BRH Devanagari Extra" w:cs="BRH Devanagari Extra"/>
+                <w:sz w:val="32"/>
+                <w:szCs w:val="32"/>
+                <w:lang w:val="it-IT"/>
+              </w:rPr>
+              <w:t>û</w:t>
+            </w:r>
+            <w:r>
+              <w:rPr>
+                <w:rFonts w:ascii="BRH Malayalam Extra" w:hAnsi="BRH Malayalam Extra" w:cs="BRH Devanagari Extra"/>
+                <w:color w:val="EE0000"/>
+                <w:szCs w:val="32"/>
+                <w:lang w:val="it-IT"/>
+              </w:rPr>
+              <w:t>–</w:t>
+            </w:r>
+            <w:r>
+              <w:rPr>
+                <w:rFonts w:ascii="BRH Devanagari Extra" w:hAnsi="BRH Devanagari Extra" w:cs="BRH Devanagari Extra"/>
+                <w:color w:val="EE0000"/>
+                <w:sz w:val="32"/>
+                <w:szCs w:val="32"/>
+                <w:lang w:val="it-IT"/>
+              </w:rPr>
+              <w:t>u</w:t>
+            </w:r>
+            <w:r>
+              <w:rPr>
+                <w:rFonts w:ascii="BRH Devanagari Extra" w:hAnsi="BRH Devanagari Extra" w:cs="BRH Devanagari Extra"/>
+                <w:color w:val="000000"/>
+                <w:sz w:val="32"/>
+                <w:szCs w:val="32"/>
+                <w:lang w:val="it-IT"/>
+              </w:rPr>
+              <w:t>ÉÉïXèû lÉÉåþ lÉÉå A</w:t>
+            </w:r>
+            <w:r>
+              <w:rPr>
+                <w:rFonts w:ascii="BRH Malayalam Extra" w:hAnsi="BRH Malayalam Extra" w:cs="BRH Devanagari Extra"/>
+                <w:color w:val="000000"/>
+                <w:szCs w:val="32"/>
+                <w:lang w:val="it-IT"/>
+              </w:rPr>
+              <w:t>–</w:t>
+            </w:r>
+            <w:r>
+              <w:rPr>
+                <w:rFonts w:ascii="BRH Devanagari Extra" w:hAnsi="BRH Devanagari Extra" w:cs="BRH Devanagari Extra"/>
+                <w:color w:val="000000"/>
+                <w:sz w:val="32"/>
+                <w:szCs w:val="32"/>
+                <w:lang w:val="it-IT"/>
+              </w:rPr>
+              <w:t>uÉÉïXèû |</w:t>
+            </w:r>
+            <w:r>
+              <w:rPr>
+                <w:rFonts w:ascii="BRH Devanagari Extra" w:hAnsi="BRH Devanagari Extra" w:cs="BRH Devanagari Extra"/>
+                <w:color w:val="000000"/>
+                <w:sz w:val="32"/>
+                <w:szCs w:val="32"/>
+                <w:lang w:val="it-IT"/>
+              </w:rPr>
+              <w:t xml:space="preserve"> </w:t>
+            </w:r>
+          </w:p>
+          <w:p>
+            <w:pPr>
+              <w:widowControl w:val="0"/>
+              <w:autoSpaceDE w:val="0"/>
+              <w:autoSpaceDN w:val="0"/>
+              <w:adjustRightInd w:val="0"/>
+              <w:spacing w:before="0" w:line="240" w:lineRule="auto"/>
+              <w:rPr>
+                <w:rFonts w:ascii="BRH Devanagari Extra" w:hAnsi="BRH Devanagari Extra" w:cs="BRH Devanagari Extra"/>
+                <w:color w:val="000000"/>
+                <w:sz w:val="32"/>
+                <w:szCs w:val="32"/>
+                <w:lang w:val="it-IT"/>
+              </w:rPr>
+            </w:pPr>
+            <w:r>
+              <w:rPr>
+                <w:rFonts w:ascii="BRH Devanagari Extra" w:hAnsi="BRH Devanagari Extra" w:cs="BRH Devanagari Extra"/>
+                <w:color w:val="000000"/>
+                <w:sz w:val="32"/>
+                <w:szCs w:val="32"/>
+                <w:lang w:val="it-IT"/>
+              </w:rPr>
+              <w:lastRenderedPageBreak/>
+              <w:t>(</w:t>
+            </w:r>
+            <w:r>
+              <w:rPr>
+                <w:rFonts w:cs="BRH Devanagari Extra"/>
+                <w:color w:val="000000"/>
+                <w:szCs w:val="32"/>
+                <w:lang w:val="it-IT"/>
+              </w:rPr>
+              <w:t>51</w:t>
+            </w:r>
+            <w:r>
+              <w:rPr>
+                <w:rFonts w:ascii="BRH Devanagari Extra" w:hAnsi="BRH Devanagari Extra" w:cs="BRH Devanagari Extra"/>
+                <w:color w:val="000000"/>
+                <w:sz w:val="32"/>
+                <w:szCs w:val="32"/>
+                <w:lang w:val="it-IT"/>
+              </w:rPr>
+              <w:t>)</w:t>
+            </w:r>
+            <w:r>
+              <w:rPr>
+                <w:rFonts w:cs="BRH Devanagari Extra"/>
+                <w:color w:val="000000"/>
+                <w:szCs w:val="32"/>
+                <w:lang w:val="it-IT"/>
+              </w:rPr>
+              <w:t>[P16</w:t>
+            </w:r>
+            <w:r>
+              <w:rPr>
+                <w:rFonts w:ascii="BRH Devanagari Extra" w:hAnsi="BRH Devanagari Extra" w:cs="BRH Devanagari Extra"/>
+                <w:color w:val="000000"/>
+                <w:sz w:val="32"/>
+                <w:szCs w:val="32"/>
+                <w:lang w:val="it-IT"/>
+              </w:rPr>
+              <w:t xml:space="preserve">] </w:t>
+            </w:r>
+            <w:r>
+              <w:rPr>
+                <w:rFonts w:cs="BRH Devanagari Extra"/>
+                <w:color w:val="000000"/>
+                <w:szCs w:val="32"/>
+                <w:lang w:val="it-IT"/>
+              </w:rPr>
+              <w:t>4</w:t>
+            </w:r>
+            <w:r>
+              <w:rPr>
+                <w:rFonts w:ascii="BRH Devanagari Extra" w:hAnsi="BRH Devanagari Extra" w:cs="BRH Devanagari Extra"/>
+                <w:color w:val="000000"/>
+                <w:sz w:val="32"/>
+                <w:szCs w:val="32"/>
+                <w:lang w:val="it-IT"/>
+              </w:rPr>
+              <w:t>.</w:t>
+            </w:r>
+            <w:r>
+              <w:rPr>
+                <w:rFonts w:cs="BRH Devanagari Extra"/>
+                <w:color w:val="000000"/>
+                <w:szCs w:val="32"/>
+                <w:lang w:val="it-IT"/>
+              </w:rPr>
+              <w:t>4</w:t>
+            </w:r>
+            <w:r>
+              <w:rPr>
+                <w:rFonts w:ascii="BRH Devanagari Extra" w:hAnsi="BRH Devanagari Extra" w:cs="BRH Devanagari Extra"/>
+                <w:color w:val="000000"/>
+                <w:sz w:val="32"/>
+                <w:szCs w:val="32"/>
+                <w:lang w:val="it-IT"/>
+              </w:rPr>
+              <w:t>.</w:t>
+            </w:r>
+            <w:r>
+              <w:rPr>
+                <w:rFonts w:cs="BRH Devanagari Extra"/>
+                <w:color w:val="000000"/>
+                <w:szCs w:val="32"/>
+                <w:lang w:val="it-IT"/>
+              </w:rPr>
+              <w:t>4</w:t>
+            </w:r>
+            <w:r>
+              <w:rPr>
+                <w:rFonts w:ascii="BRH Devanagari Extra" w:hAnsi="BRH Devanagari Extra" w:cs="BRH Devanagari Extra"/>
+                <w:color w:val="000000"/>
+                <w:sz w:val="32"/>
+                <w:szCs w:val="32"/>
+                <w:lang w:val="it-IT"/>
+              </w:rPr>
+              <w:t>.</w:t>
+            </w:r>
+            <w:r>
+              <w:rPr>
+                <w:rFonts w:cs="BRH Devanagari Extra"/>
+                <w:color w:val="000000"/>
+                <w:szCs w:val="32"/>
+                <w:lang w:val="it-IT"/>
+              </w:rPr>
+              <w:t>7</w:t>
+            </w:r>
+            <w:r>
+              <w:rPr>
+                <w:rFonts w:ascii="BRH Devanagari Extra" w:hAnsi="BRH Devanagari Extra" w:cs="BRH Devanagari Extra"/>
+                <w:color w:val="000000"/>
+                <w:sz w:val="32"/>
+                <w:szCs w:val="32"/>
+                <w:lang w:val="it-IT"/>
+              </w:rPr>
+              <w:t>(</w:t>
+            </w:r>
+            <w:r>
+              <w:rPr>
+                <w:rFonts w:cs="BRH Devanagari Extra"/>
+                <w:color w:val="000000"/>
+                <w:szCs w:val="32"/>
+                <w:lang w:val="it-IT"/>
+              </w:rPr>
+              <w:t>50</w:t>
+            </w:r>
+            <w:r>
+              <w:rPr>
+                <w:rFonts w:ascii="BRH Devanagari Extra" w:hAnsi="BRH Devanagari Extra" w:cs="BRH Devanagari Extra"/>
+                <w:color w:val="000000"/>
+                <w:sz w:val="32"/>
+                <w:szCs w:val="32"/>
+                <w:lang w:val="it-IT"/>
+              </w:rPr>
+              <w:t>)-  A</w:t>
+            </w:r>
+            <w:r>
+              <w:rPr>
+                <w:rFonts w:ascii="BRH Malayalam Extra" w:hAnsi="BRH Malayalam Extra" w:cs="BRH Devanagari Extra"/>
+                <w:color w:val="000000"/>
+                <w:szCs w:val="32"/>
+                <w:lang w:val="it-IT"/>
+              </w:rPr>
+              <w:t>–</w:t>
+            </w:r>
+            <w:r>
+              <w:rPr>
+                <w:rFonts w:ascii="BRH Devanagari Extra" w:hAnsi="BRH Devanagari Extra" w:cs="BRH Devanagari Extra"/>
+                <w:color w:val="000000"/>
+                <w:sz w:val="32"/>
+                <w:szCs w:val="32"/>
+                <w:lang w:val="it-IT"/>
+              </w:rPr>
+              <w:t>uÉÉïXèû | xÉÑuÉþÈ |</w:t>
+            </w:r>
+          </w:p>
+          <w:p>
+            <w:pPr>
+              <w:widowControl w:val="0"/>
+              <w:autoSpaceDE w:val="0"/>
+              <w:autoSpaceDN w:val="0"/>
+              <w:adjustRightInd w:val="0"/>
+              <w:spacing w:before="0" w:line="240" w:lineRule="auto"/>
+              <w:rPr>
+                <w:rFonts w:ascii="BRH Malayalam Extra" w:hAnsi="BRH Malayalam Extra" w:cs="BRH Malayalam Extra"/>
+                <w:color w:val="000000"/>
+                <w:sz w:val="32"/>
+                <w:szCs w:val="32"/>
+                <w:lang w:val="it-IT"/>
+              </w:rPr>
+            </w:pPr>
+            <w:r>
+              <w:rPr>
+                <w:rFonts w:ascii="BRH Devanagari Extra" w:hAnsi="BRH Devanagari Extra" w:cs="BRH Devanagari Extra"/>
+                <w:sz w:val="32"/>
+                <w:szCs w:val="32"/>
+                <w:lang w:val="it-IT"/>
+              </w:rPr>
+              <w:t>A</w:t>
+            </w:r>
+            <w:r>
+              <w:rPr>
+                <w:rFonts w:ascii="BRH Malayalam Extra" w:hAnsi="BRH Malayalam Extra" w:cs="BRH Devanagari Extra"/>
+                <w:szCs w:val="32"/>
+                <w:lang w:val="it-IT"/>
+              </w:rPr>
+              <w:t>–</w:t>
+            </w:r>
+            <w:r>
+              <w:rPr>
+                <w:rFonts w:ascii="BRH Devanagari Extra" w:hAnsi="BRH Devanagari Extra" w:cs="BRH Devanagari Extra"/>
+                <w:sz w:val="32"/>
+                <w:szCs w:val="32"/>
+                <w:lang w:val="it-IT"/>
+              </w:rPr>
+              <w:t>uÉÉïXèû ZxÉÑuÉ</w:t>
+            </w:r>
+            <w:r>
+              <w:rPr>
+                <w:rFonts w:ascii="BRH Malayalam Extra" w:hAnsi="BRH Malayalam Extra" w:cs="BRH Devanagari Extra"/>
+                <w:szCs w:val="32"/>
+                <w:lang w:val="it-IT"/>
+              </w:rPr>
+              <w:t>–</w:t>
+            </w:r>
+            <w:r>
+              <w:rPr>
+                <w:rFonts w:ascii="BRH Devanagari Extra" w:hAnsi="BRH Devanagari Extra" w:cs="BRH Devanagari Extra"/>
+                <w:sz w:val="32"/>
+                <w:szCs w:val="32"/>
+                <w:lang w:val="it-IT"/>
+              </w:rPr>
+              <w:t>È xÉÑuÉþ U</w:t>
+            </w:r>
+            <w:r>
+              <w:rPr>
+                <w:rFonts w:ascii="BRH Malayalam Extra" w:hAnsi="BRH Malayalam Extra" w:cs="BRH Devanagari Extra"/>
+                <w:szCs w:val="32"/>
+                <w:lang w:val="it-IT"/>
+              </w:rPr>
+              <w:t>–</w:t>
+            </w:r>
+            <w:r>
+              <w:rPr>
+                <w:rFonts w:ascii="BRH Devanagari Extra" w:hAnsi="BRH Devanagari Extra" w:cs="BRH Devanagari Extra"/>
+                <w:sz w:val="32"/>
+                <w:szCs w:val="32"/>
+                <w:lang w:val="it-IT"/>
+              </w:rPr>
+              <w:t>uÉ</w:t>
+            </w:r>
+            <w:r>
+              <w:rPr>
+                <w:rFonts w:ascii="BRH Devanagari Extra" w:hAnsi="BRH Devanagari Extra" w:cs="BRH Devanagari Extra"/>
+                <w:sz w:val="32"/>
+                <w:szCs w:val="32"/>
+                <w:highlight w:val="yellow"/>
+                <w:lang w:val="it-IT"/>
+              </w:rPr>
+              <w:t>ÉïXèû Xû</w:t>
+            </w:r>
+            <w:r>
+              <w:rPr>
+                <w:rFonts w:ascii="BRH Malayalam Extra" w:hAnsi="BRH Malayalam Extra" w:cs="BRH Devanagari Extra"/>
+                <w:szCs w:val="32"/>
+                <w:highlight w:val="yellow"/>
+                <w:lang w:val="it-IT"/>
+              </w:rPr>
+              <w:t>–</w:t>
+            </w:r>
+            <w:r>
+              <w:rPr>
+                <w:rFonts w:ascii="BRH Devanagari Extra" w:hAnsi="BRH Devanagari Extra" w:cs="BRH Devanagari Extra"/>
+                <w:sz w:val="32"/>
+                <w:szCs w:val="32"/>
+                <w:highlight w:val="yellow"/>
+                <w:lang w:val="it-IT"/>
+              </w:rPr>
+              <w:t>uÉÉïX</w:t>
+            </w:r>
+            <w:r>
+              <w:rPr>
+                <w:rFonts w:ascii="BRH Devanagari Extra" w:hAnsi="BRH Devanagari Extra" w:cs="BRH Devanagari Extra"/>
+                <w:sz w:val="32"/>
+                <w:szCs w:val="32"/>
+                <w:lang w:val="it-IT"/>
+              </w:rPr>
+              <w:t xml:space="preserve">èû ZxÉÑuÉþÈ | </w:t>
+            </w:r>
+          </w:p>
+        </w:tc>
+        <w:tc>
+          <w:tcPr>
+            <w:tcW w:w="7371" w:type="dxa"/>
+            <w:tcBorders>
+              <w:top w:val="single" w:sz="4" w:space="0" w:color="000000"/>
+              <w:left w:val="single" w:sz="4" w:space="0" w:color="000000"/>
+              <w:bottom w:val="single" w:sz="4" w:space="0" w:color="000000"/>
+              <w:right w:val="single" w:sz="4" w:space="0" w:color="000000"/>
+            </w:tcBorders>
+          </w:tcPr>
+          <w:p>
+            <w:pPr>
+              <w:widowControl w:val="0"/>
+              <w:autoSpaceDE w:val="0"/>
+              <w:autoSpaceDN w:val="0"/>
+              <w:adjustRightInd w:val="0"/>
+              <w:spacing w:before="0" w:line="240" w:lineRule="auto"/>
+              <w:rPr>
+                <w:rFonts w:ascii="BRH Devanagari Extra" w:hAnsi="BRH Devanagari Extra" w:cs="BRH Devanagari Extra"/>
+                <w:sz w:val="32"/>
+                <w:szCs w:val="32"/>
+                <w:lang w:val="it-IT"/>
+              </w:rPr>
+            </w:pPr>
+            <w:r>
+              <w:rPr>
+                <w:rFonts w:ascii="BRH Devanagari Extra" w:hAnsi="BRH Devanagari Extra" w:cs="BRH Devanagari Extra"/>
+                <w:sz w:val="32"/>
+                <w:szCs w:val="32"/>
+                <w:lang w:val="it-IT"/>
+              </w:rPr>
+              <w:lastRenderedPageBreak/>
+              <w:t>(</w:t>
+            </w:r>
+            <w:r>
+              <w:rPr>
+                <w:rFonts w:cs="BRH Devanagari Extra"/>
+                <w:szCs w:val="32"/>
+                <w:lang w:val="it-IT"/>
+              </w:rPr>
+              <w:t>50</w:t>
+            </w:r>
+            <w:r>
+              <w:rPr>
+                <w:rFonts w:ascii="BRH Devanagari Extra" w:hAnsi="BRH Devanagari Extra" w:cs="BRH Devanagari Extra"/>
+                <w:sz w:val="32"/>
+                <w:szCs w:val="32"/>
+                <w:lang w:val="it-IT"/>
+              </w:rPr>
+              <w:t>)</w:t>
+            </w:r>
+            <w:r>
+              <w:rPr>
+                <w:rFonts w:cs="BRH Devanagari Extra"/>
+                <w:szCs w:val="32"/>
+                <w:lang w:val="it-IT"/>
+              </w:rPr>
+              <w:t>[P16</w:t>
+            </w:r>
+            <w:r>
+              <w:rPr>
+                <w:rFonts w:ascii="BRH Devanagari Extra" w:hAnsi="BRH Devanagari Extra" w:cs="BRH Devanagari Extra"/>
+                <w:sz w:val="32"/>
+                <w:szCs w:val="32"/>
+                <w:lang w:val="it-IT"/>
+              </w:rPr>
+              <w:t xml:space="preserve">] </w:t>
+            </w:r>
+            <w:r>
+              <w:rPr>
+                <w:rFonts w:cs="BRH Devanagari Extra"/>
+                <w:szCs w:val="32"/>
+                <w:lang w:val="it-IT"/>
+              </w:rPr>
+              <w:t>4</w:t>
+            </w:r>
+            <w:r>
+              <w:rPr>
+                <w:rFonts w:ascii="BRH Devanagari Extra" w:hAnsi="BRH Devanagari Extra" w:cs="BRH Devanagari Extra"/>
+                <w:sz w:val="32"/>
+                <w:szCs w:val="32"/>
+                <w:lang w:val="it-IT"/>
+              </w:rPr>
+              <w:t>.</w:t>
+            </w:r>
+            <w:r>
+              <w:rPr>
+                <w:rFonts w:cs="BRH Devanagari Extra"/>
+                <w:szCs w:val="32"/>
+                <w:lang w:val="it-IT"/>
+              </w:rPr>
+              <w:t>4</w:t>
+            </w:r>
+            <w:r>
+              <w:rPr>
+                <w:rFonts w:ascii="BRH Devanagari Extra" w:hAnsi="BRH Devanagari Extra" w:cs="BRH Devanagari Extra"/>
+                <w:sz w:val="32"/>
+                <w:szCs w:val="32"/>
+                <w:lang w:val="it-IT"/>
+              </w:rPr>
+              <w:t>.</w:t>
+            </w:r>
+            <w:r>
+              <w:rPr>
+                <w:rFonts w:cs="BRH Devanagari Extra"/>
+                <w:szCs w:val="32"/>
+                <w:lang w:val="it-IT"/>
+              </w:rPr>
+              <w:t>4</w:t>
+            </w:r>
+            <w:r>
+              <w:rPr>
+                <w:rFonts w:ascii="BRH Devanagari Extra" w:hAnsi="BRH Devanagari Extra" w:cs="BRH Devanagari Extra"/>
+                <w:sz w:val="32"/>
+                <w:szCs w:val="32"/>
+                <w:lang w:val="it-IT"/>
+              </w:rPr>
+              <w:t>.</w:t>
+            </w:r>
+            <w:r>
+              <w:rPr>
+                <w:rFonts w:cs="BRH Devanagari Extra"/>
+                <w:szCs w:val="32"/>
+                <w:lang w:val="it-IT"/>
+              </w:rPr>
+              <w:t>7</w:t>
+            </w:r>
+            <w:r>
+              <w:rPr>
+                <w:rFonts w:ascii="BRH Devanagari Extra" w:hAnsi="BRH Devanagari Extra" w:cs="BRH Devanagari Extra"/>
+                <w:sz w:val="32"/>
+                <w:szCs w:val="32"/>
+                <w:lang w:val="it-IT"/>
+              </w:rPr>
+              <w:t>(</w:t>
+            </w:r>
+            <w:r>
+              <w:rPr>
+                <w:rFonts w:cs="BRH Devanagari Extra"/>
+                <w:szCs w:val="32"/>
+                <w:lang w:val="it-IT"/>
+              </w:rPr>
+              <w:t>49</w:t>
+            </w:r>
+            <w:r>
+              <w:rPr>
+                <w:rFonts w:ascii="BRH Devanagari Extra" w:hAnsi="BRH Devanagari Extra" w:cs="BRH Devanagari Extra"/>
+                <w:sz w:val="32"/>
+                <w:szCs w:val="32"/>
+                <w:lang w:val="it-IT"/>
+              </w:rPr>
+              <w:t>)-  lÉ</w:t>
+            </w:r>
+            <w:r>
+              <w:rPr>
+                <w:rFonts w:ascii="BRH Malayalam Extra" w:hAnsi="BRH Malayalam Extra" w:cs="BRH Devanagari Extra"/>
+                <w:szCs w:val="32"/>
+                <w:lang w:val="it-IT"/>
+              </w:rPr>
+              <w:t>–</w:t>
+            </w:r>
+            <w:r>
+              <w:rPr>
+                <w:rFonts w:ascii="BRH Devanagari Extra" w:hAnsi="BRH Devanagari Extra" w:cs="BRH Devanagari Extra"/>
+                <w:sz w:val="32"/>
+                <w:szCs w:val="32"/>
+                <w:lang w:val="it-IT"/>
+              </w:rPr>
+              <w:t>È | A</w:t>
+            </w:r>
+            <w:r>
+              <w:rPr>
+                <w:rFonts w:ascii="BRH Malayalam Extra" w:hAnsi="BRH Malayalam Extra" w:cs="BRH Devanagari Extra"/>
+                <w:szCs w:val="32"/>
+                <w:lang w:val="it-IT"/>
+              </w:rPr>
+              <w:t>–</w:t>
+            </w:r>
+            <w:r>
+              <w:rPr>
+                <w:rFonts w:ascii="BRH Devanagari Extra" w:hAnsi="BRH Devanagari Extra" w:cs="BRH Devanagari Extra"/>
+                <w:sz w:val="32"/>
+                <w:szCs w:val="32"/>
+                <w:lang w:val="it-IT"/>
+              </w:rPr>
+              <w:t>uÉÉïXèû |</w:t>
+            </w:r>
+          </w:p>
+          <w:p>
+            <w:pPr>
+              <w:widowControl w:val="0"/>
+              <w:autoSpaceDE w:val="0"/>
+              <w:autoSpaceDN w:val="0"/>
+              <w:adjustRightInd w:val="0"/>
+              <w:spacing w:before="0" w:line="240" w:lineRule="auto"/>
+              <w:rPr>
+                <w:rFonts w:ascii="BRH Devanagari Extra" w:hAnsi="BRH Devanagari Extra" w:cs="BRH Devanagari Extra"/>
+                <w:sz w:val="32"/>
+                <w:szCs w:val="32"/>
+                <w:lang w:val="it-IT"/>
+              </w:rPr>
+            </w:pPr>
+            <w:r>
+              <w:rPr>
+                <w:rFonts w:ascii="BRH Devanagari Extra" w:hAnsi="BRH Devanagari Extra" w:cs="BRH Devanagari Extra"/>
+                <w:sz w:val="32"/>
+                <w:szCs w:val="32"/>
+                <w:lang w:val="it-IT"/>
+              </w:rPr>
+              <w:t>lÉÉå</w:t>
+            </w:r>
+            <w:r>
+              <w:rPr>
+                <w:rFonts w:ascii="BRH Malayalam Extra" w:hAnsi="BRH Malayalam Extra" w:cs="BRH Devanagari Extra"/>
+                <w:szCs w:val="32"/>
+                <w:lang w:val="it-IT"/>
+              </w:rPr>
+              <w:t>–</w:t>
+            </w:r>
+            <w:r>
+              <w:rPr>
+                <w:rFonts w:ascii="BRH Devanagari Extra" w:hAnsi="BRH Devanagari Extra" w:cs="BRH Devanagari Extra"/>
+                <w:sz w:val="32"/>
+                <w:szCs w:val="32"/>
+                <w:lang w:val="it-IT"/>
+              </w:rPr>
+              <w:t xml:space="preserve"> A</w:t>
+            </w:r>
+            <w:r>
+              <w:rPr>
+                <w:rFonts w:ascii="BRH Malayalam Extra" w:hAnsi="BRH Malayalam Extra" w:cs="BRH Devanagari Extra"/>
+                <w:szCs w:val="32"/>
+                <w:lang w:val="it-IT"/>
+              </w:rPr>
+              <w:t>–</w:t>
+            </w:r>
+            <w:r>
+              <w:rPr>
+                <w:rFonts w:ascii="BRH Devanagari Extra" w:hAnsi="BRH Devanagari Extra" w:cs="BRH Devanagari Extra"/>
+                <w:sz w:val="32"/>
+                <w:szCs w:val="32"/>
+                <w:lang w:val="it-IT"/>
+              </w:rPr>
+              <w:t>uÉÉï</w:t>
+            </w:r>
+            <w:r>
+              <w:rPr>
+                <w:rFonts w:ascii="BRH Devanagari Extra" w:hAnsi="BRH Devanagari Extra" w:cs="BRH Devanagari Extra"/>
+                <w:sz w:val="32"/>
+                <w:szCs w:val="32"/>
+                <w:highlight w:val="green"/>
+                <w:lang w:val="it-IT"/>
+              </w:rPr>
+              <w:t>X</w:t>
+            </w:r>
+            <w:r>
+              <w:rPr>
+                <w:rFonts w:ascii="BRH Devanagari Extra" w:hAnsi="BRH Devanagari Extra" w:cs="BRH Devanagari Extra"/>
+                <w:sz w:val="32"/>
+                <w:szCs w:val="32"/>
+                <w:lang w:val="it-IT"/>
+              </w:rPr>
+              <w:t>û</w:t>
+            </w:r>
+            <w:r>
+              <w:rPr>
+                <w:rFonts w:ascii="BRH Malayalam Extra" w:hAnsi="BRH Malayalam Extra" w:cs="BRH Devanagari Extra"/>
+                <w:szCs w:val="32"/>
+                <w:lang w:val="it-IT"/>
+              </w:rPr>
+              <w:t>–</w:t>
+            </w:r>
+            <w:r>
+              <w:rPr>
+                <w:rFonts w:ascii="BRH Devanagari Extra" w:hAnsi="BRH Devanagari Extra" w:cs="BRH Devanagari Extra"/>
+                <w:sz w:val="32"/>
+                <w:szCs w:val="32"/>
+                <w:lang w:val="it-IT"/>
+              </w:rPr>
+              <w:t>uÉÉïXèû lÉÉåþ lÉÉå A</w:t>
+            </w:r>
+            <w:r>
+              <w:rPr>
+                <w:rFonts w:ascii="BRH Malayalam Extra" w:hAnsi="BRH Malayalam Extra" w:cs="BRH Devanagari Extra"/>
+                <w:szCs w:val="32"/>
+                <w:lang w:val="it-IT"/>
+              </w:rPr>
+              <w:t>–</w:t>
+            </w:r>
+            <w:r>
+              <w:rPr>
+                <w:rFonts w:ascii="BRH Devanagari Extra" w:hAnsi="BRH Devanagari Extra" w:cs="BRH Devanagari Extra"/>
+                <w:sz w:val="32"/>
+                <w:szCs w:val="32"/>
+                <w:lang w:val="it-IT"/>
+              </w:rPr>
+              <w:t xml:space="preserve">uÉÉïXèû | </w:t>
+            </w:r>
+          </w:p>
+          <w:p>
+            <w:pPr>
+              <w:widowControl w:val="0"/>
+              <w:autoSpaceDE w:val="0"/>
+              <w:autoSpaceDN w:val="0"/>
+              <w:adjustRightInd w:val="0"/>
+              <w:spacing w:before="0" w:line="240" w:lineRule="auto"/>
+              <w:rPr>
+                <w:rFonts w:ascii="BRH Devanagari Extra" w:hAnsi="BRH Devanagari Extra" w:cs="BRH Devanagari Extra"/>
+                <w:color w:val="000000"/>
+                <w:sz w:val="32"/>
+                <w:szCs w:val="32"/>
+                <w:lang w:val="it-IT"/>
+              </w:rPr>
+            </w:pPr>
+            <w:r>
+              <w:rPr>
+                <w:rFonts w:ascii="BRH Devanagari Extra" w:hAnsi="BRH Devanagari Extra" w:cs="BRH Devanagari Extra"/>
+                <w:color w:val="000000"/>
+                <w:sz w:val="32"/>
+                <w:szCs w:val="32"/>
+                <w:lang w:val="it-IT"/>
+              </w:rPr>
+              <w:lastRenderedPageBreak/>
+              <w:t>(</w:t>
+            </w:r>
+            <w:r>
+              <w:rPr>
+                <w:rFonts w:cs="BRH Devanagari Extra"/>
+                <w:color w:val="000000"/>
+                <w:szCs w:val="32"/>
+                <w:lang w:val="it-IT"/>
+              </w:rPr>
+              <w:t>51</w:t>
+            </w:r>
+            <w:r>
+              <w:rPr>
+                <w:rFonts w:ascii="BRH Devanagari Extra" w:hAnsi="BRH Devanagari Extra" w:cs="BRH Devanagari Extra"/>
+                <w:color w:val="000000"/>
+                <w:sz w:val="32"/>
+                <w:szCs w:val="32"/>
+                <w:lang w:val="it-IT"/>
+              </w:rPr>
+              <w:t>)</w:t>
+            </w:r>
+            <w:r>
+              <w:rPr>
+                <w:rFonts w:cs="BRH Devanagari Extra"/>
+                <w:color w:val="000000"/>
+                <w:szCs w:val="32"/>
+                <w:lang w:val="it-IT"/>
+              </w:rPr>
+              <w:t>[P16</w:t>
+            </w:r>
+            <w:r>
+              <w:rPr>
+                <w:rFonts w:ascii="BRH Devanagari Extra" w:hAnsi="BRH Devanagari Extra" w:cs="BRH Devanagari Extra"/>
+                <w:color w:val="000000"/>
+                <w:sz w:val="32"/>
+                <w:szCs w:val="32"/>
+                <w:lang w:val="it-IT"/>
+              </w:rPr>
+              <w:t xml:space="preserve">] </w:t>
+            </w:r>
+            <w:r>
+              <w:rPr>
+                <w:rFonts w:cs="BRH Devanagari Extra"/>
+                <w:color w:val="000000"/>
+                <w:szCs w:val="32"/>
+                <w:lang w:val="it-IT"/>
+              </w:rPr>
+              <w:t>4</w:t>
+            </w:r>
+            <w:r>
+              <w:rPr>
+                <w:rFonts w:ascii="BRH Devanagari Extra" w:hAnsi="BRH Devanagari Extra" w:cs="BRH Devanagari Extra"/>
+                <w:color w:val="000000"/>
+                <w:sz w:val="32"/>
+                <w:szCs w:val="32"/>
+                <w:lang w:val="it-IT"/>
+              </w:rPr>
+              <w:t>.</w:t>
+            </w:r>
+            <w:r>
+              <w:rPr>
+                <w:rFonts w:cs="BRH Devanagari Extra"/>
+                <w:color w:val="000000"/>
+                <w:szCs w:val="32"/>
+                <w:lang w:val="it-IT"/>
+              </w:rPr>
+              <w:t>4</w:t>
+            </w:r>
+            <w:r>
+              <w:rPr>
+                <w:rFonts w:ascii="BRH Devanagari Extra" w:hAnsi="BRH Devanagari Extra" w:cs="BRH Devanagari Extra"/>
+                <w:color w:val="000000"/>
+                <w:sz w:val="32"/>
+                <w:szCs w:val="32"/>
+                <w:lang w:val="it-IT"/>
+              </w:rPr>
+              <w:t>.</w:t>
+            </w:r>
+            <w:r>
+              <w:rPr>
+                <w:rFonts w:cs="BRH Devanagari Extra"/>
+                <w:color w:val="000000"/>
+                <w:szCs w:val="32"/>
+                <w:lang w:val="it-IT"/>
+              </w:rPr>
+              <w:t>4</w:t>
+            </w:r>
+            <w:r>
+              <w:rPr>
+                <w:rFonts w:ascii="BRH Devanagari Extra" w:hAnsi="BRH Devanagari Extra" w:cs="BRH Devanagari Extra"/>
+                <w:color w:val="000000"/>
+                <w:sz w:val="32"/>
+                <w:szCs w:val="32"/>
+                <w:lang w:val="it-IT"/>
+              </w:rPr>
+              <w:t>.</w:t>
+            </w:r>
+            <w:r>
+              <w:rPr>
+                <w:rFonts w:cs="BRH Devanagari Extra"/>
+                <w:color w:val="000000"/>
+                <w:szCs w:val="32"/>
+                <w:lang w:val="it-IT"/>
+              </w:rPr>
+              <w:t>7</w:t>
+            </w:r>
+            <w:r>
+              <w:rPr>
+                <w:rFonts w:ascii="BRH Devanagari Extra" w:hAnsi="BRH Devanagari Extra" w:cs="BRH Devanagari Extra"/>
+                <w:color w:val="000000"/>
+                <w:sz w:val="32"/>
+                <w:szCs w:val="32"/>
+                <w:lang w:val="it-IT"/>
+              </w:rPr>
+              <w:t>(</w:t>
+            </w:r>
+            <w:r>
+              <w:rPr>
+                <w:rFonts w:cs="BRH Devanagari Extra"/>
+                <w:color w:val="000000"/>
+                <w:szCs w:val="32"/>
+                <w:lang w:val="it-IT"/>
+              </w:rPr>
+              <w:t>50</w:t>
+            </w:r>
+            <w:r>
+              <w:rPr>
+                <w:rFonts w:ascii="BRH Devanagari Extra" w:hAnsi="BRH Devanagari Extra" w:cs="BRH Devanagari Extra"/>
+                <w:color w:val="000000"/>
+                <w:sz w:val="32"/>
+                <w:szCs w:val="32"/>
+                <w:lang w:val="it-IT"/>
+              </w:rPr>
+              <w:t>)-  A</w:t>
+            </w:r>
+            <w:r>
+              <w:rPr>
+                <w:rFonts w:ascii="BRH Malayalam Extra" w:hAnsi="BRH Malayalam Extra" w:cs="BRH Devanagari Extra"/>
+                <w:color w:val="000000"/>
+                <w:szCs w:val="32"/>
+                <w:lang w:val="it-IT"/>
+              </w:rPr>
+              <w:t>–</w:t>
+            </w:r>
+            <w:r>
+              <w:rPr>
+                <w:rFonts w:ascii="BRH Devanagari Extra" w:hAnsi="BRH Devanagari Extra" w:cs="BRH Devanagari Extra"/>
+                <w:color w:val="000000"/>
+                <w:sz w:val="32"/>
+                <w:szCs w:val="32"/>
+                <w:lang w:val="it-IT"/>
+              </w:rPr>
+              <w:t>uÉÉïXèû | xÉÑuÉþÈ |</w:t>
+            </w:r>
+          </w:p>
+          <w:p>
+            <w:pPr>
+              <w:widowControl w:val="0"/>
+              <w:autoSpaceDE w:val="0"/>
+              <w:autoSpaceDN w:val="0"/>
+              <w:adjustRightInd w:val="0"/>
+              <w:spacing w:before="0" w:line="240" w:lineRule="auto"/>
+              <w:rPr>
+                <w:rFonts w:ascii="BRH Malayalam Extra" w:hAnsi="BRH Malayalam Extra" w:cs="BRH Malayalam Extra"/>
+                <w:color w:val="000000"/>
+                <w:sz w:val="32"/>
+                <w:szCs w:val="32"/>
+                <w:lang w:val="it-IT"/>
+              </w:rPr>
+            </w:pPr>
+            <w:r>
+              <w:rPr>
+                <w:rFonts w:ascii="BRH Devanagari Extra" w:hAnsi="BRH Devanagari Extra" w:cs="BRH Devanagari Extra"/>
+                <w:sz w:val="32"/>
+                <w:szCs w:val="32"/>
+                <w:lang w:val="it-IT"/>
+              </w:rPr>
+              <w:t>A</w:t>
+            </w:r>
+            <w:r>
+              <w:rPr>
+                <w:rFonts w:ascii="BRH Malayalam Extra" w:hAnsi="BRH Malayalam Extra" w:cs="BRH Devanagari Extra"/>
+                <w:szCs w:val="32"/>
+                <w:lang w:val="it-IT"/>
+              </w:rPr>
+              <w:t>–</w:t>
+            </w:r>
+            <w:r>
+              <w:rPr>
+                <w:rFonts w:ascii="BRH Devanagari Extra" w:hAnsi="BRH Devanagari Extra" w:cs="BRH Devanagari Extra"/>
+                <w:sz w:val="32"/>
+                <w:szCs w:val="32"/>
+                <w:lang w:val="it-IT"/>
+              </w:rPr>
+              <w:t>uÉÉïXèû ZxÉÑuÉ</w:t>
+            </w:r>
+            <w:r>
+              <w:rPr>
+                <w:rFonts w:ascii="BRH Malayalam Extra" w:hAnsi="BRH Malayalam Extra" w:cs="BRH Devanagari Extra"/>
+                <w:szCs w:val="32"/>
+                <w:lang w:val="it-IT"/>
+              </w:rPr>
+              <w:t>–</w:t>
+            </w:r>
+            <w:r>
+              <w:rPr>
+                <w:rFonts w:ascii="BRH Devanagari Extra" w:hAnsi="BRH Devanagari Extra" w:cs="BRH Devanagari Extra"/>
+                <w:sz w:val="32"/>
+                <w:szCs w:val="32"/>
+                <w:lang w:val="it-IT"/>
+              </w:rPr>
+              <w:t>È xÉÑuÉþ U</w:t>
+            </w:r>
+            <w:r>
+              <w:rPr>
+                <w:rFonts w:ascii="BRH Malayalam Extra" w:hAnsi="BRH Malayalam Extra" w:cs="BRH Devanagari Extra"/>
+                <w:szCs w:val="32"/>
+                <w:lang w:val="it-IT"/>
+              </w:rPr>
+              <w:t>–</w:t>
+            </w:r>
+            <w:r>
+              <w:rPr>
+                <w:rFonts w:ascii="BRH Devanagari Extra" w:hAnsi="BRH Devanagari Extra" w:cs="BRH Devanagari Extra"/>
+                <w:sz w:val="32"/>
+                <w:szCs w:val="32"/>
+                <w:lang w:val="it-IT"/>
+              </w:rPr>
+              <w:t>uÉÉï</w:t>
+            </w:r>
+            <w:r>
+              <w:rPr>
+                <w:rFonts w:ascii="BRH Devanagari Extra" w:hAnsi="BRH Devanagari Extra" w:cs="BRH Devanagari Extra"/>
+                <w:sz w:val="32"/>
+                <w:szCs w:val="32"/>
+                <w:highlight w:val="green"/>
+                <w:lang w:val="it-IT"/>
+              </w:rPr>
+              <w:t>X</w:t>
+            </w:r>
+            <w:r>
+              <w:rPr>
+                <w:rFonts w:ascii="BRH Devanagari Extra" w:hAnsi="BRH Devanagari Extra" w:cs="BRH Devanagari Extra"/>
+                <w:sz w:val="32"/>
+                <w:szCs w:val="32"/>
+                <w:lang w:val="it-IT"/>
+              </w:rPr>
+              <w:t>û</w:t>
+            </w:r>
+            <w:r>
+              <w:rPr>
+                <w:rFonts w:ascii="BRH Malayalam Extra" w:hAnsi="BRH Malayalam Extra" w:cs="BRH Devanagari Extra"/>
+                <w:szCs w:val="32"/>
+                <w:lang w:val="it-IT"/>
+              </w:rPr>
+              <w:t>–</w:t>
+            </w:r>
+            <w:r>
+              <w:rPr>
+                <w:rFonts w:ascii="BRH Devanagari Extra" w:hAnsi="BRH Devanagari Extra" w:cs="BRH Devanagari Extra"/>
+                <w:sz w:val="32"/>
+                <w:szCs w:val="32"/>
+                <w:lang w:val="it-IT"/>
+              </w:rPr>
+              <w:t xml:space="preserve">uÉÉïXèû ZxÉÑuÉþÈ | </w:t>
+            </w:r>
+          </w:p>
+        </w:tc>
+      </w:tr>
+    </w:tbl>
+    <w:p>
+      <w:pPr>
+        <w:spacing w:before="0" w:line="240" w:lineRule="auto"/>
+        <w:jc w:val="center"/>
+        <w:rPr>
+          <w:b/>
+          <w:bCs/>
+          <w:sz w:val="32"/>
+          <w:szCs w:val="32"/>
+          <w:u w:val="single"/>
+          <w:lang w:val="it-IT"/>
+        </w:rPr>
+      </w:pPr>
+    </w:p>
+    <w:p>
+      <w:pPr>
+        <w:spacing w:before="0" w:line="240" w:lineRule="auto"/>
+        <w:jc w:val="center"/>
+        <w:rPr>
+          <w:b/>
+          <w:bCs/>
+          <w:sz w:val="32"/>
+          <w:szCs w:val="32"/>
+          <w:u w:val="single"/>
+        </w:rPr>
+      </w:pPr>
+      <w:r>
+        <w:rPr>
+          <w:b/>
+          <w:bCs/>
+          <w:sz w:val="32"/>
+          <w:szCs w:val="32"/>
+          <w:u w:val="single"/>
+        </w:rPr>
+        <w:t>===========</w:t>
+      </w:r>
+    </w:p>
+    <w:p>
+      <w:pPr>
+        <w:spacing w:before="0" w:line="240" w:lineRule="auto"/>
+        <w:jc w:val="center"/>
+        <w:rPr>
+          <w:b/>
+          <w:bCs/>
+          <w:sz w:val="32"/>
+          <w:szCs w:val="32"/>
+          <w:u w:val="single"/>
+        </w:rPr>
+      </w:pPr>
+    </w:p>
+    <w:p>
+      <w:pPr>
+        <w:spacing w:before="0" w:line="240" w:lineRule="auto"/>
+        <w:jc w:val="center"/>
+        <w:rPr>
+          <w:b/>
+          <w:bCs/>
+          <w:sz w:val="32"/>
+          <w:szCs w:val="32"/>
+          <w:u w:val="single"/>
+        </w:rPr>
+      </w:pPr>
+    </w:p>
     <w:p>
       <w:pPr>
         <w:spacing w:before="0" w:line="240" w:lineRule="auto"/>
@@ -2965,6 +7444,7 @@
                 <w:cs/>
                 <w:lang w:bidi="ta-IN"/>
               </w:rPr>
+              <w:lastRenderedPageBreak/>
               <w:t>ஸ</w:t>
             </w:r>
             <w:r>
@@ -3125,6 +7605,7 @@
                 <w:szCs w:val="24"/>
                 <w:lang w:bidi="ta-IN"/>
               </w:rPr>
+              <w:lastRenderedPageBreak/>
               <w:t>(</w:t>
             </w:r>
             <w:r>
@@ -4533,6 +9014,7 @@
                 <w:cs/>
                 <w:lang w:bidi="ta-IN"/>
               </w:rPr>
+              <w:lastRenderedPageBreak/>
               <w:t>ஸ</w:t>
             </w:r>
             <w:r>
@@ -4709,6 +9191,7 @@
                 <w:szCs w:val="24"/>
                 <w:lang w:bidi="ta-IN"/>
               </w:rPr>
+              <w:lastRenderedPageBreak/>
               <w:t>(</w:t>
             </w:r>
             <w:r>
@@ -5843,7 +10326,6 @@
                 <w:szCs w:val="24"/>
                 <w:lang w:bidi="ta-IN"/>
               </w:rPr>
-              <w:lastRenderedPageBreak/>
               <w:t>(</w:t>
             </w:r>
             <w:r>
@@ -8290,6 +12772,7 @@
                 <w:szCs w:val="24"/>
                 <w:lang w:bidi="ta-IN"/>
               </w:rPr>
+              <w:lastRenderedPageBreak/>
               <w:t>(</w:t>
             </w:r>
             <w:r>
@@ -10995,7 +15478,6 @@
                 <w:szCs w:val="24"/>
                 <w:lang w:bidi="ta-IN"/>
               </w:rPr>
-              <w:lastRenderedPageBreak/>
               <w:t>(4</w:t>
             </w:r>
             <w:r>
@@ -12342,6 +16824,7 @@
                 <w:cs/>
                 <w:lang w:bidi="ta-IN"/>
               </w:rPr>
+              <w:lastRenderedPageBreak/>
               <w:t>மி</w:t>
             </w:r>
             <w:r>
@@ -12524,6 +17007,7 @@
                 <w:szCs w:val="24"/>
                 <w:lang w:bidi="ta-IN"/>
               </w:rPr>
+              <w:lastRenderedPageBreak/>
               <w:t>(4</w:t>
             </w:r>
             <w:r>
@@ -16241,7 +20725,6 @@
                 <w:szCs w:val="24"/>
                 <w:lang w:bidi="ta-IN"/>
               </w:rPr>
-              <w:lastRenderedPageBreak/>
               <w:t>(4</w:t>
             </w:r>
             <w:r>
@@ -19730,6 +24213,7 @@
                 <w:szCs w:val="24"/>
                 <w:lang w:bidi="ta-IN"/>
               </w:rPr>
+              <w:lastRenderedPageBreak/>
               <w:t>(</w:t>
             </w:r>
             <w:r>
@@ -22889,7 +27373,7 @@
 </file>
 
 <file path=word/endnotes.xml><?xml version="1.0" encoding="utf-8"?>
-<w:endnotes xmlns:wpc="http://schemas.microsoft.com/office/word/2010/wordprocessingCanvas" xmlns:cx="http://schemas.microsoft.com/office/drawing/2014/chartex" xmlns:cx1="http://schemas.microsoft.com/office/drawing/2015/9/8/chartex" xmlns:cx2="http://schemas.microsoft.com/office/drawing/2015/10/21/chartex" xmlns:cx3="http://schemas.microsoft.com/office/drawing/2016/5/9/chartex" xmlns:cx4="http://schemas.microsoft.com/office/drawing/2016/5/10/chartex" xmlns:cx5="http://schemas.microsoft.com/office/drawing/2016/5/11/chartex" xmlns:cx6="http://schemas.microsoft.com/office/drawing/2016/5/12/chartex" xmlns:cx7="http://schemas.microsoft.com/office/drawing/2016/5/13/chartex" xmlns:cx8="http://schemas.microsoft.com/office/drawing/2016/5/14/chartex" xmlns:mc="http://schemas.openxmlformats.org/markup-compatibility/2006" xmlns:aink="http://schemas.microsoft.com/office/drawing/2016/ink" xmlns:am3d="http://schemas.microsoft.com/office/drawing/2017/model3d" xmlns:o="urn:schemas-microsoft-com:office:office" xmlns:oel="http://schemas.microsoft.com/office/2019/extlst" xmlns:r="http://schemas.openxmlformats.org/officeDocument/2006/relationships" xmlns:m="http://schemas.openxmlformats.org/officeDocument/2006/math" xmlns:v="urn:schemas-microsoft-com:vml" xmlns:wp14="http://schemas.microsoft.com/office/word/2010/wordprocessingDrawing" xmlns:wp="http://schemas.openxmlformats.org/drawingml/2006/wordprocessingDrawing" xmlns:w10="urn:schemas-microsoft-com:office:word" xmlns:w="http://schemas.openxmlformats.org/wordprocessingml/2006/main" xmlns:w14="http://schemas.microsoft.com/office/word/2010/wordml" xmlns:w15="http://schemas.microsoft.com/office/word/2012/wordml" xmlns:w16cex="http://schemas.microsoft.com/office/word/2018/wordml/cex" xmlns:w16cid="http://schemas.microsoft.com/office/word/2016/wordml/cid" xmlns:w16="http://schemas.microsoft.com/office/word/2018/wordml" xmlns:w16du="http://schemas.microsoft.com/office/word/2023/wordml/word16du" xmlns:w16sdtdh="http://schemas.microsoft.com/office/word/2020/wordml/sdtdatahash" xmlns:w16se="http://schemas.microsoft.com/office/word/2015/wordml/symex" xmlns:wpg="http://schemas.microsoft.com/office/word/2010/wordprocessingGroup" xmlns:wpi="http://schemas.microsoft.com/office/word/2010/wordprocessingInk" xmlns:wne="http://schemas.microsoft.com/office/word/2006/wordml" xmlns:wps="http://schemas.microsoft.com/office/word/2010/wordprocessingShape" mc:Ignorable="w14 w15 w16se w16cid w16 w16cex w16sdtdh w16du wp14">
+<w:endnotes xmlns:wpc="http://schemas.microsoft.com/office/word/2010/wordprocessingCanvas" xmlns:cx="http://schemas.microsoft.com/office/drawing/2014/chartex" xmlns:cx1="http://schemas.microsoft.com/office/drawing/2015/9/8/chartex" xmlns:cx2="http://schemas.microsoft.com/office/drawing/2015/10/21/chartex" xmlns:cx3="http://schemas.microsoft.com/office/drawing/2016/5/9/chartex" xmlns:cx4="http://schemas.microsoft.com/office/drawing/2016/5/10/chartex" xmlns:cx5="http://schemas.microsoft.com/office/drawing/2016/5/11/chartex" xmlns:cx6="http://schemas.microsoft.com/office/drawing/2016/5/12/chartex" xmlns:cx7="http://schemas.microsoft.com/office/drawing/2016/5/13/chartex" xmlns:cx8="http://schemas.microsoft.com/office/drawing/2016/5/14/chartex" xmlns:mc="http://schemas.openxmlformats.org/markup-compatibility/2006" xmlns:aink="http://schemas.microsoft.com/office/drawing/2016/ink" xmlns:am3d="http://schemas.microsoft.com/office/drawing/2017/model3d" xmlns:o="urn:schemas-microsoft-com:office:office" xmlns:oel="http://schemas.microsoft.com/office/2019/extlst" xmlns:r="http://schemas.openxmlformats.org/officeDocument/2006/relationships" xmlns:m="http://schemas.openxmlformats.org/officeDocument/2006/math" xmlns:v="urn:schemas-microsoft-com:vml" xmlns:wp14="http://schemas.microsoft.com/office/word/2010/wordprocessingDrawing" xmlns:wp="http://schemas.openxmlformats.org/drawingml/2006/wordprocessingDrawing" xmlns:w10="urn:schemas-microsoft-com:office:word" xmlns:w="http://schemas.openxmlformats.org/wordprocessingml/2006/main" xmlns:w14="http://schemas.microsoft.com/office/word/2010/wordml" xmlns:w15="http://schemas.microsoft.com/office/word/2012/wordml" xmlns:w16cex="http://schemas.microsoft.com/office/word/2018/wordml/cex" xmlns:w16cid="http://schemas.microsoft.com/office/word/2016/wordml/cid" xmlns:w16="http://schemas.microsoft.com/office/word/2018/wordml" xmlns:w16du="http://schemas.microsoft.com/office/word/2023/wordml/word16du" xmlns:w16sdtdh="http://schemas.microsoft.com/office/word/2020/wordml/sdtdatahash" xmlns:w16sdtfl="http://schemas.microsoft.com/office/word/2024/wordml/sdtformatlock" xmlns:w16se="http://schemas.microsoft.com/office/word/2015/wordml/symex" xmlns:wpg="http://schemas.microsoft.com/office/word/2010/wordprocessingGroup" xmlns:wpi="http://schemas.microsoft.com/office/word/2010/wordprocessingInk" xmlns:wne="http://schemas.microsoft.com/office/word/2006/wordml" xmlns:wps="http://schemas.microsoft.com/office/word/2010/wordprocessingShape" mc:Ignorable="w14 w15 w16se w16cid w16 w16cex w16sdtdh w16sdtfl w16du wp14">
   <w:endnote w:type="separator" w:id="-1">
     <w:p>
       <w:pPr>
@@ -22914,7 +27398,7 @@
 </file>
 
 <file path=word/footer1.xml><?xml version="1.0" encoding="utf-8"?>
-<w:ftr xmlns:wpc="http://schemas.microsoft.com/office/word/2010/wordprocessingCanvas" xmlns:cx="http://schemas.microsoft.com/office/drawing/2014/chartex" xmlns:cx1="http://schemas.microsoft.com/office/drawing/2015/9/8/chartex" xmlns:cx2="http://schemas.microsoft.com/office/drawing/2015/10/21/chartex" xmlns:cx3="http://schemas.microsoft.com/office/drawing/2016/5/9/chartex" xmlns:cx4="http://schemas.microsoft.com/office/drawing/2016/5/10/chartex" xmlns:cx5="http://schemas.microsoft.com/office/drawing/2016/5/11/chartex" xmlns:cx6="http://schemas.microsoft.com/office/drawing/2016/5/12/chartex" xmlns:cx7="http://schemas.microsoft.com/office/drawing/2016/5/13/chartex" xmlns:cx8="http://schemas.microsoft.com/office/drawing/2016/5/14/chartex" xmlns:mc="http://schemas.openxmlformats.org/markup-compatibility/2006" xmlns:aink="http://schemas.microsoft.com/office/drawing/2016/ink" xmlns:am3d="http://schemas.microsoft.com/office/drawing/2017/model3d" xmlns:o="urn:schemas-microsoft-com:office:office" xmlns:oel="http://schemas.microsoft.com/office/2019/extlst" xmlns:r="http://schemas.openxmlformats.org/officeDocument/2006/relationships" xmlns:m="http://schemas.openxmlformats.org/officeDocument/2006/math" xmlns:v="urn:schemas-microsoft-com:vml" xmlns:wp14="http://schemas.microsoft.com/office/word/2010/wordprocessingDrawing" xmlns:wp="http://schemas.openxmlformats.org/drawingml/2006/wordprocessingDrawing" xmlns:w10="urn:schemas-microsoft-com:office:word" xmlns:w="http://schemas.openxmlformats.org/wordprocessingml/2006/main" xmlns:w14="http://schemas.microsoft.com/office/word/2010/wordml" xmlns:w15="http://schemas.microsoft.com/office/word/2012/wordml" xmlns:w16cex="http://schemas.microsoft.com/office/word/2018/wordml/cex" xmlns:w16cid="http://schemas.microsoft.com/office/word/2016/wordml/cid" xmlns:w16="http://schemas.microsoft.com/office/word/2018/wordml" xmlns:w16du="http://schemas.microsoft.com/office/word/2023/wordml/word16du" xmlns:w16sdtdh="http://schemas.microsoft.com/office/word/2020/wordml/sdtdatahash" xmlns:w16se="http://schemas.microsoft.com/office/word/2015/wordml/symex" xmlns:wpg="http://schemas.microsoft.com/office/word/2010/wordprocessingGroup" xmlns:wpi="http://schemas.microsoft.com/office/word/2010/wordprocessingInk" xmlns:wne="http://schemas.microsoft.com/office/word/2006/wordml" xmlns:wps="http://schemas.microsoft.com/office/word/2010/wordprocessingShape" mc:Ignorable="w14 w15 w16se w16cid w16 w16cex w16sdtdh w16du wp14">
+<w:ftr xmlns:wpc="http://schemas.microsoft.com/office/word/2010/wordprocessingCanvas" xmlns:cx="http://schemas.microsoft.com/office/drawing/2014/chartex" xmlns:cx1="http://schemas.microsoft.com/office/drawing/2015/9/8/chartex" xmlns:cx2="http://schemas.microsoft.com/office/drawing/2015/10/21/chartex" xmlns:cx3="http://schemas.microsoft.com/office/drawing/2016/5/9/chartex" xmlns:cx4="http://schemas.microsoft.com/office/drawing/2016/5/10/chartex" xmlns:cx5="http://schemas.microsoft.com/office/drawing/2016/5/11/chartex" xmlns:cx6="http://schemas.microsoft.com/office/drawing/2016/5/12/chartex" xmlns:cx7="http://schemas.microsoft.com/office/drawing/2016/5/13/chartex" xmlns:cx8="http://schemas.microsoft.com/office/drawing/2016/5/14/chartex" xmlns:mc="http://schemas.openxmlformats.org/markup-compatibility/2006" xmlns:aink="http://schemas.microsoft.com/office/drawing/2016/ink" xmlns:am3d="http://schemas.microsoft.com/office/drawing/2017/model3d" xmlns:o="urn:schemas-microsoft-com:office:office" xmlns:oel="http://schemas.microsoft.com/office/2019/extlst" xmlns:r="http://schemas.openxmlformats.org/officeDocument/2006/relationships" xmlns:m="http://schemas.openxmlformats.org/officeDocument/2006/math" xmlns:v="urn:schemas-microsoft-com:vml" xmlns:wp14="http://schemas.microsoft.com/office/word/2010/wordprocessingDrawing" xmlns:wp="http://schemas.openxmlformats.org/drawingml/2006/wordprocessingDrawing" xmlns:w10="urn:schemas-microsoft-com:office:word" xmlns:w="http://schemas.openxmlformats.org/wordprocessingml/2006/main" xmlns:w14="http://schemas.microsoft.com/office/word/2010/wordml" xmlns:w15="http://schemas.microsoft.com/office/word/2012/wordml" xmlns:w16cex="http://schemas.microsoft.com/office/word/2018/wordml/cex" xmlns:w16cid="http://schemas.microsoft.com/office/word/2016/wordml/cid" xmlns:w16="http://schemas.microsoft.com/office/word/2018/wordml" xmlns:w16du="http://schemas.microsoft.com/office/word/2023/wordml/word16du" xmlns:w16sdtdh="http://schemas.microsoft.com/office/word/2020/wordml/sdtdatahash" xmlns:w16sdtfl="http://schemas.microsoft.com/office/word/2024/wordml/sdtformatlock" xmlns:w16se="http://schemas.microsoft.com/office/word/2015/wordml/symex" xmlns:wpg="http://schemas.microsoft.com/office/word/2010/wordprocessingGroup" xmlns:wpi="http://schemas.microsoft.com/office/word/2010/wordprocessingInk" xmlns:wne="http://schemas.microsoft.com/office/word/2006/wordml" xmlns:wps="http://schemas.microsoft.com/office/word/2010/wordprocessingShape" mc:Ignorable="w14 w15 w16se w16cid w16 w16cex w16sdtdh w16sdtfl w16du wp14">
   <w:p>
     <w:pPr>
       <w:pBdr>
@@ -23096,7 +27580,7 @@
 </file>
 
 <file path=word/footer2.xml><?xml version="1.0" encoding="utf-8"?>
-<w:ftr xmlns:wpc="http://schemas.microsoft.com/office/word/2010/wordprocessingCanvas" xmlns:cx="http://schemas.microsoft.com/office/drawing/2014/chartex" xmlns:cx1="http://schemas.microsoft.com/office/drawing/2015/9/8/chartex" xmlns:cx2="http://schemas.microsoft.com/office/drawing/2015/10/21/chartex" xmlns:cx3="http://schemas.microsoft.com/office/drawing/2016/5/9/chartex" xmlns:cx4="http://schemas.microsoft.com/office/drawing/2016/5/10/chartex" xmlns:cx5="http://schemas.microsoft.com/office/drawing/2016/5/11/chartex" xmlns:cx6="http://schemas.microsoft.com/office/drawing/2016/5/12/chartex" xmlns:cx7="http://schemas.microsoft.com/office/drawing/2016/5/13/chartex" xmlns:cx8="http://schemas.microsoft.com/office/drawing/2016/5/14/chartex" xmlns:mc="http://schemas.openxmlformats.org/markup-compatibility/2006" xmlns:aink="http://schemas.microsoft.com/office/drawing/2016/ink" xmlns:am3d="http://schemas.microsoft.com/office/drawing/2017/model3d" xmlns:o="urn:schemas-microsoft-com:office:office" xmlns:oel="http://schemas.microsoft.com/office/2019/extlst" xmlns:r="http://schemas.openxmlformats.org/officeDocument/2006/relationships" xmlns:m="http://schemas.openxmlformats.org/officeDocument/2006/math" xmlns:v="urn:schemas-microsoft-com:vml" xmlns:wp14="http://schemas.microsoft.com/office/word/2010/wordprocessingDrawing" xmlns:wp="http://schemas.openxmlformats.org/drawingml/2006/wordprocessingDrawing" xmlns:w10="urn:schemas-microsoft-com:office:word" xmlns:w="http://schemas.openxmlformats.org/wordprocessingml/2006/main" xmlns:w14="http://schemas.microsoft.com/office/word/2010/wordml" xmlns:w15="http://schemas.microsoft.com/office/word/2012/wordml" xmlns:w16cex="http://schemas.microsoft.com/office/word/2018/wordml/cex" xmlns:w16cid="http://schemas.microsoft.com/office/word/2016/wordml/cid" xmlns:w16="http://schemas.microsoft.com/office/word/2018/wordml" xmlns:w16du="http://schemas.microsoft.com/office/word/2023/wordml/word16du" xmlns:w16sdtdh="http://schemas.microsoft.com/office/word/2020/wordml/sdtdatahash" xmlns:w16se="http://schemas.microsoft.com/office/word/2015/wordml/symex" xmlns:wpg="http://schemas.microsoft.com/office/word/2010/wordprocessingGroup" xmlns:wpi="http://schemas.microsoft.com/office/word/2010/wordprocessingInk" xmlns:wne="http://schemas.microsoft.com/office/word/2006/wordml" xmlns:wps="http://schemas.microsoft.com/office/word/2010/wordprocessingShape" mc:Ignorable="w14 w15 w16se w16cid w16 w16cex w16sdtdh w16du wp14">
+<w:ftr xmlns:wpc="http://schemas.microsoft.com/office/word/2010/wordprocessingCanvas" xmlns:cx="http://schemas.microsoft.com/office/drawing/2014/chartex" xmlns:cx1="http://schemas.microsoft.com/office/drawing/2015/9/8/chartex" xmlns:cx2="http://schemas.microsoft.com/office/drawing/2015/10/21/chartex" xmlns:cx3="http://schemas.microsoft.com/office/drawing/2016/5/9/chartex" xmlns:cx4="http://schemas.microsoft.com/office/drawing/2016/5/10/chartex" xmlns:cx5="http://schemas.microsoft.com/office/drawing/2016/5/11/chartex" xmlns:cx6="http://schemas.microsoft.com/office/drawing/2016/5/12/chartex" xmlns:cx7="http://schemas.microsoft.com/office/drawing/2016/5/13/chartex" xmlns:cx8="http://schemas.microsoft.com/office/drawing/2016/5/14/chartex" xmlns:mc="http://schemas.openxmlformats.org/markup-compatibility/2006" xmlns:aink="http://schemas.microsoft.com/office/drawing/2016/ink" xmlns:am3d="http://schemas.microsoft.com/office/drawing/2017/model3d" xmlns:o="urn:schemas-microsoft-com:office:office" xmlns:oel="http://schemas.microsoft.com/office/2019/extlst" xmlns:r="http://schemas.openxmlformats.org/officeDocument/2006/relationships" xmlns:m="http://schemas.openxmlformats.org/officeDocument/2006/math" xmlns:v="urn:schemas-microsoft-com:vml" xmlns:wp14="http://schemas.microsoft.com/office/word/2010/wordprocessingDrawing" xmlns:wp="http://schemas.openxmlformats.org/drawingml/2006/wordprocessingDrawing" xmlns:w10="urn:schemas-microsoft-com:office:word" xmlns:w="http://schemas.openxmlformats.org/wordprocessingml/2006/main" xmlns:w14="http://schemas.microsoft.com/office/word/2010/wordml" xmlns:w15="http://schemas.microsoft.com/office/word/2012/wordml" xmlns:w16cex="http://schemas.microsoft.com/office/word/2018/wordml/cex" xmlns:w16cid="http://schemas.microsoft.com/office/word/2016/wordml/cid" xmlns:w16="http://schemas.microsoft.com/office/word/2018/wordml" xmlns:w16du="http://schemas.microsoft.com/office/word/2023/wordml/word16du" xmlns:w16sdtdh="http://schemas.microsoft.com/office/word/2020/wordml/sdtdatahash" xmlns:w16sdtfl="http://schemas.microsoft.com/office/word/2024/wordml/sdtformatlock" xmlns:w16se="http://schemas.microsoft.com/office/word/2015/wordml/symex" xmlns:wpg="http://schemas.microsoft.com/office/word/2010/wordprocessingGroup" xmlns:wpi="http://schemas.microsoft.com/office/word/2010/wordprocessingInk" xmlns:wne="http://schemas.microsoft.com/office/word/2006/wordml" xmlns:wps="http://schemas.microsoft.com/office/word/2010/wordprocessingShape" mc:Ignorable="w14 w15 w16se w16cid w16 w16cex w16sdtdh w16sdtfl w16du wp14">
   <w:p>
     <w:pPr>
       <w:pBdr>
@@ -23316,7 +27800,7 @@
 </file>
 
 <file path=word/footnotes.xml><?xml version="1.0" encoding="utf-8"?>
-<w:footnotes xmlns:wpc="http://schemas.microsoft.com/office/word/2010/wordprocessingCanvas" xmlns:cx="http://schemas.microsoft.com/office/drawing/2014/chartex" xmlns:cx1="http://schemas.microsoft.com/office/drawing/2015/9/8/chartex" xmlns:cx2="http://schemas.microsoft.com/office/drawing/2015/10/21/chartex" xmlns:cx3="http://schemas.microsoft.com/office/drawing/2016/5/9/chartex" xmlns:cx4="http://schemas.microsoft.com/office/drawing/2016/5/10/chartex" xmlns:cx5="http://schemas.microsoft.com/office/drawing/2016/5/11/chartex" xmlns:cx6="http://schemas.microsoft.com/office/drawing/2016/5/12/chartex" xmlns:cx7="http://schemas.microsoft.com/office/drawing/2016/5/13/chartex" xmlns:cx8="http://schemas.microsoft.com/office/drawing/2016/5/14/chartex" xmlns:mc="http://schemas.openxmlformats.org/markup-compatibility/2006" xmlns:aink="http://schemas.microsoft.com/office/drawing/2016/ink" xmlns:am3d="http://schemas.microsoft.com/office/drawing/2017/model3d" xmlns:o="urn:schemas-microsoft-com:office:office" xmlns:oel="http://schemas.microsoft.com/office/2019/extlst" xmlns:r="http://schemas.openxmlformats.org/officeDocument/2006/relationships" xmlns:m="http://schemas.openxmlformats.org/officeDocument/2006/math" xmlns:v="urn:schemas-microsoft-com:vml" xmlns:wp14="http://schemas.microsoft.com/office/word/2010/wordprocessingDrawing" xmlns:wp="http://schemas.openxmlformats.org/drawingml/2006/wordprocessingDrawing" xmlns:w10="urn:schemas-microsoft-com:office:word" xmlns:w="http://schemas.openxmlformats.org/wordprocessingml/2006/main" xmlns:w14="http://schemas.microsoft.com/office/word/2010/wordml" xmlns:w15="http://schemas.microsoft.com/office/word/2012/wordml" xmlns:w16cex="http://schemas.microsoft.com/office/word/2018/wordml/cex" xmlns:w16cid="http://schemas.microsoft.com/office/word/2016/wordml/cid" xmlns:w16="http://schemas.microsoft.com/office/word/2018/wordml" xmlns:w16du="http://schemas.microsoft.com/office/word/2023/wordml/word16du" xmlns:w16sdtdh="http://schemas.microsoft.com/office/word/2020/wordml/sdtdatahash" xmlns:w16se="http://schemas.microsoft.com/office/word/2015/wordml/symex" xmlns:wpg="http://schemas.microsoft.com/office/word/2010/wordprocessingGroup" xmlns:wpi="http://schemas.microsoft.com/office/word/2010/wordprocessingInk" xmlns:wne="http://schemas.microsoft.com/office/word/2006/wordml" xmlns:wps="http://schemas.microsoft.com/office/word/2010/wordprocessingShape" mc:Ignorable="w14 w15 w16se w16cid w16 w16cex w16sdtdh w16du wp14">
+<w:footnotes xmlns:wpc="http://schemas.microsoft.com/office/word/2010/wordprocessingCanvas" xmlns:cx="http://schemas.microsoft.com/office/drawing/2014/chartex" xmlns:cx1="http://schemas.microsoft.com/office/drawing/2015/9/8/chartex" xmlns:cx2="http://schemas.microsoft.com/office/drawing/2015/10/21/chartex" xmlns:cx3="http://schemas.microsoft.com/office/drawing/2016/5/9/chartex" xmlns:cx4="http://schemas.microsoft.com/office/drawing/2016/5/10/chartex" xmlns:cx5="http://schemas.microsoft.com/office/drawing/2016/5/11/chartex" xmlns:cx6="http://schemas.microsoft.com/office/drawing/2016/5/12/chartex" xmlns:cx7="http://schemas.microsoft.com/office/drawing/2016/5/13/chartex" xmlns:cx8="http://schemas.microsoft.com/office/drawing/2016/5/14/chartex" xmlns:mc="http://schemas.openxmlformats.org/markup-compatibility/2006" xmlns:aink="http://schemas.microsoft.com/office/drawing/2016/ink" xmlns:am3d="http://schemas.microsoft.com/office/drawing/2017/model3d" xmlns:o="urn:schemas-microsoft-com:office:office" xmlns:oel="http://schemas.microsoft.com/office/2019/extlst" xmlns:r="http://schemas.openxmlformats.org/officeDocument/2006/relationships" xmlns:m="http://schemas.openxmlformats.org/officeDocument/2006/math" xmlns:v="urn:schemas-microsoft-com:vml" xmlns:wp14="http://schemas.microsoft.com/office/word/2010/wordprocessingDrawing" xmlns:wp="http://schemas.openxmlformats.org/drawingml/2006/wordprocessingDrawing" xmlns:w10="urn:schemas-microsoft-com:office:word" xmlns:w="http://schemas.openxmlformats.org/wordprocessingml/2006/main" xmlns:w14="http://schemas.microsoft.com/office/word/2010/wordml" xmlns:w15="http://schemas.microsoft.com/office/word/2012/wordml" xmlns:w16cex="http://schemas.microsoft.com/office/word/2018/wordml/cex" xmlns:w16cid="http://schemas.microsoft.com/office/word/2016/wordml/cid" xmlns:w16="http://schemas.microsoft.com/office/word/2018/wordml" xmlns:w16du="http://schemas.microsoft.com/office/word/2023/wordml/word16du" xmlns:w16sdtdh="http://schemas.microsoft.com/office/word/2020/wordml/sdtdatahash" xmlns:w16sdtfl="http://schemas.microsoft.com/office/word/2024/wordml/sdtformatlock" xmlns:w16se="http://schemas.microsoft.com/office/word/2015/wordml/symex" xmlns:wpg="http://schemas.microsoft.com/office/word/2010/wordprocessingGroup" xmlns:wpi="http://schemas.microsoft.com/office/word/2010/wordprocessingInk" xmlns:wne="http://schemas.microsoft.com/office/word/2006/wordml" xmlns:wps="http://schemas.microsoft.com/office/word/2010/wordprocessingShape" mc:Ignorable="w14 w15 w16se w16cid w16 w16cex w16sdtdh w16sdtfl w16du wp14">
   <w:footnote w:type="separator" w:id="-1">
     <w:p>
       <w:pPr>
@@ -23341,7 +27825,7 @@
 </file>
 
 <file path=word/header1.xml><?xml version="1.0" encoding="utf-8"?>
-<w:hdr xmlns:wpc="http://schemas.microsoft.com/office/word/2010/wordprocessingCanvas" xmlns:cx="http://schemas.microsoft.com/office/drawing/2014/chartex" xmlns:cx1="http://schemas.microsoft.com/office/drawing/2015/9/8/chartex" xmlns:cx2="http://schemas.microsoft.com/office/drawing/2015/10/21/chartex" xmlns:cx3="http://schemas.microsoft.com/office/drawing/2016/5/9/chartex" xmlns:cx4="http://schemas.microsoft.com/office/drawing/2016/5/10/chartex" xmlns:cx5="http://schemas.microsoft.com/office/drawing/2016/5/11/chartex" xmlns:cx6="http://schemas.microsoft.com/office/drawing/2016/5/12/chartex" xmlns:cx7="http://schemas.microsoft.com/office/drawing/2016/5/13/chartex" xmlns:cx8="http://schemas.microsoft.com/office/drawing/2016/5/14/chartex" xmlns:mc="http://schemas.openxmlformats.org/markup-compatibility/2006" xmlns:aink="http://schemas.microsoft.com/office/drawing/2016/ink" xmlns:am3d="http://schemas.microsoft.com/office/drawing/2017/model3d" xmlns:o="urn:schemas-microsoft-com:office:office" xmlns:oel="http://schemas.microsoft.com/office/2019/extlst" xmlns:r="http://schemas.openxmlformats.org/officeDocument/2006/relationships" xmlns:m="http://schemas.openxmlformats.org/officeDocument/2006/math" xmlns:v="urn:schemas-microsoft-com:vml" xmlns:wp14="http://schemas.microsoft.com/office/word/2010/wordprocessingDrawing" xmlns:wp="http://schemas.openxmlformats.org/drawingml/2006/wordprocessingDrawing" xmlns:w10="urn:schemas-microsoft-com:office:word" xmlns:w="http://schemas.openxmlformats.org/wordprocessingml/2006/main" xmlns:w14="http://schemas.microsoft.com/office/word/2010/wordml" xmlns:w15="http://schemas.microsoft.com/office/word/2012/wordml" xmlns:w16cex="http://schemas.microsoft.com/office/word/2018/wordml/cex" xmlns:w16cid="http://schemas.microsoft.com/office/word/2016/wordml/cid" xmlns:w16="http://schemas.microsoft.com/office/word/2018/wordml" xmlns:w16du="http://schemas.microsoft.com/office/word/2023/wordml/word16du" xmlns:w16sdtdh="http://schemas.microsoft.com/office/word/2020/wordml/sdtdatahash" xmlns:w16se="http://schemas.microsoft.com/office/word/2015/wordml/symex" xmlns:wpg="http://schemas.microsoft.com/office/word/2010/wordprocessingGroup" xmlns:wpi="http://schemas.microsoft.com/office/word/2010/wordprocessingInk" xmlns:wne="http://schemas.microsoft.com/office/word/2006/wordml" xmlns:wps="http://schemas.microsoft.com/office/word/2010/wordprocessingShape" mc:Ignorable="w14 w15 w16se w16cid w16 w16cex w16sdtdh w16du wp14">
+<w:hdr xmlns:wpc="http://schemas.microsoft.com/office/word/2010/wordprocessingCanvas" xmlns:cx="http://schemas.microsoft.com/office/drawing/2014/chartex" xmlns:cx1="http://schemas.microsoft.com/office/drawing/2015/9/8/chartex" xmlns:cx2="http://schemas.microsoft.com/office/drawing/2015/10/21/chartex" xmlns:cx3="http://schemas.microsoft.com/office/drawing/2016/5/9/chartex" xmlns:cx4="http://schemas.microsoft.com/office/drawing/2016/5/10/chartex" xmlns:cx5="http://schemas.microsoft.com/office/drawing/2016/5/11/chartex" xmlns:cx6="http://schemas.microsoft.com/office/drawing/2016/5/12/chartex" xmlns:cx7="http://schemas.microsoft.com/office/drawing/2016/5/13/chartex" xmlns:cx8="http://schemas.microsoft.com/office/drawing/2016/5/14/chartex" xmlns:mc="http://schemas.openxmlformats.org/markup-compatibility/2006" xmlns:aink="http://schemas.microsoft.com/office/drawing/2016/ink" xmlns:am3d="http://schemas.microsoft.com/office/drawing/2017/model3d" xmlns:o="urn:schemas-microsoft-com:office:office" xmlns:oel="http://schemas.microsoft.com/office/2019/extlst" xmlns:r="http://schemas.openxmlformats.org/officeDocument/2006/relationships" xmlns:m="http://schemas.openxmlformats.org/officeDocument/2006/math" xmlns:v="urn:schemas-microsoft-com:vml" xmlns:wp14="http://schemas.microsoft.com/office/word/2010/wordprocessingDrawing" xmlns:wp="http://schemas.openxmlformats.org/drawingml/2006/wordprocessingDrawing" xmlns:w10="urn:schemas-microsoft-com:office:word" xmlns:w="http://schemas.openxmlformats.org/wordprocessingml/2006/main" xmlns:w14="http://schemas.microsoft.com/office/word/2010/wordml" xmlns:w15="http://schemas.microsoft.com/office/word/2012/wordml" xmlns:w16cex="http://schemas.microsoft.com/office/word/2018/wordml/cex" xmlns:w16cid="http://schemas.microsoft.com/office/word/2016/wordml/cid" xmlns:w16="http://schemas.microsoft.com/office/word/2018/wordml" xmlns:w16du="http://schemas.microsoft.com/office/word/2023/wordml/word16du" xmlns:w16sdtdh="http://schemas.microsoft.com/office/word/2020/wordml/sdtdatahash" xmlns:w16sdtfl="http://schemas.microsoft.com/office/word/2024/wordml/sdtformatlock" xmlns:w16se="http://schemas.microsoft.com/office/word/2015/wordml/symex" xmlns:wpg="http://schemas.microsoft.com/office/word/2010/wordprocessingGroup" xmlns:wpi="http://schemas.microsoft.com/office/word/2010/wordprocessingInk" xmlns:wne="http://schemas.microsoft.com/office/word/2006/wordml" xmlns:wps="http://schemas.microsoft.com/office/word/2010/wordprocessingShape" mc:Ignorable="w14 w15 w16se w16cid w16 w16cex w16sdtdh w16sdtfl w16du wp14">
   <w:p>
     <w:pPr>
       <w:pStyle w:val="Header"/>
@@ -23362,7 +27846,7 @@
 </file>
 
 <file path=word/header2.xml><?xml version="1.0" encoding="utf-8"?>
-<w:hdr xmlns:wpc="http://schemas.microsoft.com/office/word/2010/wordprocessingCanvas" xmlns:cx="http://schemas.microsoft.com/office/drawing/2014/chartex" xmlns:cx1="http://schemas.microsoft.com/office/drawing/2015/9/8/chartex" xmlns:cx2="http://schemas.microsoft.com/office/drawing/2015/10/21/chartex" xmlns:cx3="http://schemas.microsoft.com/office/drawing/2016/5/9/chartex" xmlns:cx4="http://schemas.microsoft.com/office/drawing/2016/5/10/chartex" xmlns:cx5="http://schemas.microsoft.com/office/drawing/2016/5/11/chartex" xmlns:cx6="http://schemas.microsoft.com/office/drawing/2016/5/12/chartex" xmlns:cx7="http://schemas.microsoft.com/office/drawing/2016/5/13/chartex" xmlns:cx8="http://schemas.microsoft.com/office/drawing/2016/5/14/chartex" xmlns:mc="http://schemas.openxmlformats.org/markup-compatibility/2006" xmlns:aink="http://schemas.microsoft.com/office/drawing/2016/ink" xmlns:am3d="http://schemas.microsoft.com/office/drawing/2017/model3d" xmlns:o="urn:schemas-microsoft-com:office:office" xmlns:oel="http://schemas.microsoft.com/office/2019/extlst" xmlns:r="http://schemas.openxmlformats.org/officeDocument/2006/relationships" xmlns:m="http://schemas.openxmlformats.org/officeDocument/2006/math" xmlns:v="urn:schemas-microsoft-com:vml" xmlns:wp14="http://schemas.microsoft.com/office/word/2010/wordprocessingDrawing" xmlns:wp="http://schemas.openxmlformats.org/drawingml/2006/wordprocessingDrawing" xmlns:w10="urn:schemas-microsoft-com:office:word" xmlns:w="http://schemas.openxmlformats.org/wordprocessingml/2006/main" xmlns:w14="http://schemas.microsoft.com/office/word/2010/wordml" xmlns:w15="http://schemas.microsoft.com/office/word/2012/wordml" xmlns:w16cex="http://schemas.microsoft.com/office/word/2018/wordml/cex" xmlns:w16cid="http://schemas.microsoft.com/office/word/2016/wordml/cid" xmlns:w16="http://schemas.microsoft.com/office/word/2018/wordml" xmlns:w16du="http://schemas.microsoft.com/office/word/2023/wordml/word16du" xmlns:w16sdtdh="http://schemas.microsoft.com/office/word/2020/wordml/sdtdatahash" xmlns:w16se="http://schemas.microsoft.com/office/word/2015/wordml/symex" xmlns:wpg="http://schemas.microsoft.com/office/word/2010/wordprocessingGroup" xmlns:wpi="http://schemas.microsoft.com/office/word/2010/wordprocessingInk" xmlns:wne="http://schemas.microsoft.com/office/word/2006/wordml" xmlns:wps="http://schemas.microsoft.com/office/word/2010/wordprocessingShape" mc:Ignorable="w14 w15 w16se w16cid w16 w16cex w16sdtdh w16du wp14">
+<w:hdr xmlns:wpc="http://schemas.microsoft.com/office/word/2010/wordprocessingCanvas" xmlns:cx="http://schemas.microsoft.com/office/drawing/2014/chartex" xmlns:cx1="http://schemas.microsoft.com/office/drawing/2015/9/8/chartex" xmlns:cx2="http://schemas.microsoft.com/office/drawing/2015/10/21/chartex" xmlns:cx3="http://schemas.microsoft.com/office/drawing/2016/5/9/chartex" xmlns:cx4="http://schemas.microsoft.com/office/drawing/2016/5/10/chartex" xmlns:cx5="http://schemas.microsoft.com/office/drawing/2016/5/11/chartex" xmlns:cx6="http://schemas.microsoft.com/office/drawing/2016/5/12/chartex" xmlns:cx7="http://schemas.microsoft.com/office/drawing/2016/5/13/chartex" xmlns:cx8="http://schemas.microsoft.com/office/drawing/2016/5/14/chartex" xmlns:mc="http://schemas.openxmlformats.org/markup-compatibility/2006" xmlns:aink="http://schemas.microsoft.com/office/drawing/2016/ink" xmlns:am3d="http://schemas.microsoft.com/office/drawing/2017/model3d" xmlns:o="urn:schemas-microsoft-com:office:office" xmlns:oel="http://schemas.microsoft.com/office/2019/extlst" xmlns:r="http://schemas.openxmlformats.org/officeDocument/2006/relationships" xmlns:m="http://schemas.openxmlformats.org/officeDocument/2006/math" xmlns:v="urn:schemas-microsoft-com:vml" xmlns:wp14="http://schemas.microsoft.com/office/word/2010/wordprocessingDrawing" xmlns:wp="http://schemas.openxmlformats.org/drawingml/2006/wordprocessingDrawing" xmlns:w10="urn:schemas-microsoft-com:office:word" xmlns:w="http://schemas.openxmlformats.org/wordprocessingml/2006/main" xmlns:w14="http://schemas.microsoft.com/office/word/2010/wordml" xmlns:w15="http://schemas.microsoft.com/office/word/2012/wordml" xmlns:w16cex="http://schemas.microsoft.com/office/word/2018/wordml/cex" xmlns:w16cid="http://schemas.microsoft.com/office/word/2016/wordml/cid" xmlns:w16="http://schemas.microsoft.com/office/word/2018/wordml" xmlns:w16du="http://schemas.microsoft.com/office/word/2023/wordml/word16du" xmlns:w16sdtdh="http://schemas.microsoft.com/office/word/2020/wordml/sdtdatahash" xmlns:w16sdtfl="http://schemas.microsoft.com/office/word/2024/wordml/sdtformatlock" xmlns:w16se="http://schemas.microsoft.com/office/word/2015/wordml/symex" xmlns:wpg="http://schemas.microsoft.com/office/word/2010/wordprocessingGroup" xmlns:wpi="http://schemas.microsoft.com/office/word/2010/wordprocessingInk" xmlns:wne="http://schemas.microsoft.com/office/word/2006/wordml" xmlns:wps="http://schemas.microsoft.com/office/word/2010/wordprocessingShape" mc:Ignorable="w14 w15 w16se w16cid w16 w16cex w16sdtdh w16sdtfl w16du wp14">
   <w:p>
     <w:pPr>
       <w:pStyle w:val="Header"/>
@@ -23375,7 +27859,7 @@
 </file>
 
 <file path=word/styles.xml><?xml version="1.0" encoding="utf-8"?>
-<w:styles xmlns:mc="http://schemas.openxmlformats.org/markup-compatibility/2006" xmlns:r="http://schemas.openxmlformats.org/officeDocument/2006/relationships" xmlns:w="http://schemas.openxmlformats.org/wordprocessingml/2006/main" xmlns:w14="http://schemas.microsoft.com/office/word/2010/wordml" xmlns:w15="http://schemas.microsoft.com/office/word/2012/wordml" xmlns:w16cex="http://schemas.microsoft.com/office/word/2018/wordml/cex" xmlns:w16cid="http://schemas.microsoft.com/office/word/2016/wordml/cid" xmlns:w16="http://schemas.microsoft.com/office/word/2018/wordml" xmlns:w16du="http://schemas.microsoft.com/office/word/2023/wordml/word16du" xmlns:w16sdtdh="http://schemas.microsoft.com/office/word/2020/wordml/sdtdatahash" xmlns:w16se="http://schemas.microsoft.com/office/word/2015/wordml/symex" mc:Ignorable="w14 w15 w16se w16cid w16 w16cex w16sdtdh w16du">
+<w:styles xmlns:mc="http://schemas.openxmlformats.org/markup-compatibility/2006" xmlns:r="http://schemas.openxmlformats.org/officeDocument/2006/relationships" xmlns:w="http://schemas.openxmlformats.org/wordprocessingml/2006/main" xmlns:w14="http://schemas.microsoft.com/office/word/2010/wordml" xmlns:w15="http://schemas.microsoft.com/office/word/2012/wordml" xmlns:w16cex="http://schemas.microsoft.com/office/word/2018/wordml/cex" xmlns:w16cid="http://schemas.microsoft.com/office/word/2016/wordml/cid" xmlns:w16="http://schemas.microsoft.com/office/word/2018/wordml" xmlns:w16du="http://schemas.microsoft.com/office/word/2023/wordml/word16du" xmlns:w16sdtdh="http://schemas.microsoft.com/office/word/2020/wordml/sdtdatahash" xmlns:w16sdtfl="http://schemas.microsoft.com/office/word/2024/wordml/sdtformatlock" xmlns:w16se="http://schemas.microsoft.com/office/word/2015/wordml/symex" mc:Ignorable="w14 w15 w16se w16cid w16 w16cex w16sdtdh w16sdtfl w16du">
   <w:docDefaults>
     <w:rPrDefault>
       <w:rPr>

</xml_diff>